<commit_message>
dependency confusion threat T5 and test finding
</commit_message>
<xml_diff>
--- a/docs/report/MCSC6002_Final_Report.docx
+++ b/docs/report/MCSC6002_Final_Report.docx
@@ -422,7 +422,7 @@
     </w:p>
     <w:p>
       <w:r>
-        <w:t>We applied STRIDE (Shostack, 2014) to each component and trust boundary and rated each threat by likelihood and impact (Low, Medium or High). The model lists 25 threats; Appendix A has the full table. At the end of the project, 13 are mitigated, 6 partly mitigated, 5 planned and 1 not applicable.</w:t>
+        <w:t>We applied STRIDE (Shostack, 2014) to each component and trust boundary and rated each threat by likelihood and impact (Low, Medium or High). The model lists 26 threats; Appendix A has the full table. At the end of the project, 14 are mitigated, 6 partly mitigated, 5 planned and 1 not applicable.</w:t>
       </w:r>
     </w:p>
     <w:p>
@@ -515,7 +515,7 @@
     </w:p>
     <w:p>
       <w:r>
-        <w:t>Testing also found real defects, which we fixed and retested. Forged tokens crashed the request instead of returning 401, because the framework placed the authentication middleware before our header middleware. The product list stayed cached for an hour after changes. ZAP reported three missing response headers and an unneeded static page on the gateway. A final end-to-end check found that the Inventory service could not call the Product service through the gateway, and that the resulting error page leaked a stack trace and the caller's token; the gateway now uses a certificate from our own authority and hides error bodies from the services.</w:t>
+        <w:t>Testing also found real defects, which we fixed and retested. Forged tokens crashed the request instead of returning 401, because the framework placed the authentication middleware before our header middleware. The product list stayed cached for an hour after changes. ZAP reported three missing response headers and an unneeded static page on the gateway. A final end-to-end check found that the Inventory service could not call the Product service through the gateway, and that the resulting error page leaked a stack trace and the caller's token; the gateway now uses a certificate from our own authority and hides error bodies from the services. A restore on a clean machine also showed that our shared libraries were not on nuget.org, where unrelated packages use the same names: the build silently took a stranger's AuthLibrary 2.0.0. Each service now ships the exact packages and maps those names to them only.</w:t>
       </w:r>
     </w:p>
     <w:p>
@@ -658,7 +658,7 @@
         </w:trPr>
         <w:tc>
           <w:tcPr>
-            <w:tcW w:type="dxa" w:w="472"/>
+            <w:tcW w:type="dxa" w:w="465"/>
           </w:tcPr>
           <w:p>
             <w:pPr>
@@ -676,7 +676,7 @@
         </w:tc>
         <w:tc>
           <w:tcPr>
-            <w:tcW w:type="dxa" w:w="1528"/>
+            <w:tcW w:type="dxa" w:w="1497"/>
           </w:tcPr>
           <w:p>
             <w:pPr>
@@ -694,7 +694,7 @@
         </w:tc>
         <w:tc>
           <w:tcPr>
-            <w:tcW w:type="dxa" w:w="1303"/>
+            <w:tcW w:type="dxa" w:w="1273"/>
           </w:tcPr>
           <w:p>
             <w:pPr>
@@ -712,7 +712,7 @@
         </w:tc>
         <w:tc>
           <w:tcPr>
-            <w:tcW w:type="dxa" w:w="3217"/>
+            <w:tcW w:type="dxa" w:w="3551"/>
           </w:tcPr>
           <w:p>
             <w:pPr>
@@ -730,7 +730,7 @@
         </w:tc>
         <w:tc>
           <w:tcPr>
-            <w:tcW w:type="dxa" w:w="937"/>
+            <w:tcW w:type="dxa" w:w="920"/>
           </w:tcPr>
           <w:p>
             <w:pPr>
@@ -748,7 +748,7 @@
         </w:tc>
         <w:tc>
           <w:tcPr>
-            <w:tcW w:type="dxa" w:w="4004"/>
+            <w:tcW w:type="dxa" w:w="3778"/>
           </w:tcPr>
           <w:p>
             <w:pPr>
@@ -766,7 +766,7 @@
         </w:tc>
         <w:tc>
           <w:tcPr>
-            <w:tcW w:type="dxa" w:w="1500"/>
+            <w:tcW w:type="dxa" w:w="1476"/>
           </w:tcPr>
           <w:p>
             <w:pPr>
@@ -786,7 +786,7 @@
       <w:tr>
         <w:tc>
           <w:tcPr>
-            <w:tcW w:type="dxa" w:w="472"/>
+            <w:tcW w:type="dxa" w:w="465"/>
           </w:tcPr>
           <w:p>
             <w:pPr>
@@ -804,7 +804,7 @@
         </w:tc>
         <w:tc>
           <w:tcPr>
-            <w:tcW w:type="dxa" w:w="1528"/>
+            <w:tcW w:type="dxa" w:w="1497"/>
           </w:tcPr>
           <w:p>
             <w:pPr>
@@ -822,7 +822,7 @@
         </w:tc>
         <w:tc>
           <w:tcPr>
-            <w:tcW w:type="dxa" w:w="1303"/>
+            <w:tcW w:type="dxa" w:w="1273"/>
           </w:tcPr>
           <w:p>
             <w:pPr>
@@ -840,7 +840,7 @@
         </w:tc>
         <w:tc>
           <w:tcPr>
-            <w:tcW w:type="dxa" w:w="3217"/>
+            <w:tcW w:type="dxa" w:w="3551"/>
           </w:tcPr>
           <w:p>
             <w:pPr>
@@ -858,7 +858,7 @@
         </w:tc>
         <w:tc>
           <w:tcPr>
-            <w:tcW w:type="dxa" w:w="937"/>
+            <w:tcW w:type="dxa" w:w="920"/>
           </w:tcPr>
           <w:p>
             <w:pPr>
@@ -876,7 +876,7 @@
         </w:tc>
         <w:tc>
           <w:tcPr>
-            <w:tcW w:type="dxa" w:w="4004"/>
+            <w:tcW w:type="dxa" w:w="3778"/>
           </w:tcPr>
           <w:p>
             <w:pPr>
@@ -894,7 +894,7 @@
         </w:tc>
         <w:tc>
           <w:tcPr>
-            <w:tcW w:type="dxa" w:w="1500"/>
+            <w:tcW w:type="dxa" w:w="1476"/>
           </w:tcPr>
           <w:p>
             <w:pPr>
@@ -914,7 +914,7 @@
       <w:tr>
         <w:tc>
           <w:tcPr>
-            <w:tcW w:type="dxa" w:w="472"/>
+            <w:tcW w:type="dxa" w:w="465"/>
           </w:tcPr>
           <w:p>
             <w:pPr>
@@ -932,7 +932,7 @@
         </w:tc>
         <w:tc>
           <w:tcPr>
-            <w:tcW w:type="dxa" w:w="1528"/>
+            <w:tcW w:type="dxa" w:w="1497"/>
           </w:tcPr>
           <w:p>
             <w:pPr>
@@ -950,7 +950,7 @@
         </w:tc>
         <w:tc>
           <w:tcPr>
-            <w:tcW w:type="dxa" w:w="1303"/>
+            <w:tcW w:type="dxa" w:w="1273"/>
           </w:tcPr>
           <w:p>
             <w:pPr>
@@ -968,7 +968,7 @@
         </w:tc>
         <w:tc>
           <w:tcPr>
-            <w:tcW w:type="dxa" w:w="3217"/>
+            <w:tcW w:type="dxa" w:w="3551"/>
           </w:tcPr>
           <w:p>
             <w:pPr>
@@ -986,7 +986,7 @@
         </w:tc>
         <w:tc>
           <w:tcPr>
-            <w:tcW w:type="dxa" w:w="937"/>
+            <w:tcW w:type="dxa" w:w="920"/>
           </w:tcPr>
           <w:p>
             <w:pPr>
@@ -1004,7 +1004,7 @@
         </w:tc>
         <w:tc>
           <w:tcPr>
-            <w:tcW w:type="dxa" w:w="4004"/>
+            <w:tcW w:type="dxa" w:w="3778"/>
           </w:tcPr>
           <w:p>
             <w:pPr>
@@ -1022,7 +1022,7 @@
         </w:tc>
         <w:tc>
           <w:tcPr>
-            <w:tcW w:type="dxa" w:w="1500"/>
+            <w:tcW w:type="dxa" w:w="1476"/>
           </w:tcPr>
           <w:p>
             <w:pPr>
@@ -1042,7 +1042,7 @@
       <w:tr>
         <w:tc>
           <w:tcPr>
-            <w:tcW w:type="dxa" w:w="472"/>
+            <w:tcW w:type="dxa" w:w="465"/>
           </w:tcPr>
           <w:p>
             <w:pPr>
@@ -1060,7 +1060,7 @@
         </w:tc>
         <w:tc>
           <w:tcPr>
-            <w:tcW w:type="dxa" w:w="1528"/>
+            <w:tcW w:type="dxa" w:w="1497"/>
           </w:tcPr>
           <w:p>
             <w:pPr>
@@ -1078,7 +1078,7 @@
         </w:tc>
         <w:tc>
           <w:tcPr>
-            <w:tcW w:type="dxa" w:w="1303"/>
+            <w:tcW w:type="dxa" w:w="1273"/>
           </w:tcPr>
           <w:p>
             <w:pPr>
@@ -1096,7 +1096,7 @@
         </w:tc>
         <w:tc>
           <w:tcPr>
-            <w:tcW w:type="dxa" w:w="3217"/>
+            <w:tcW w:type="dxa" w:w="3551"/>
           </w:tcPr>
           <w:p>
             <w:pPr>
@@ -1114,7 +1114,7 @@
         </w:tc>
         <w:tc>
           <w:tcPr>
-            <w:tcW w:type="dxa" w:w="937"/>
+            <w:tcW w:type="dxa" w:w="920"/>
           </w:tcPr>
           <w:p>
             <w:pPr>
@@ -1132,7 +1132,7 @@
         </w:tc>
         <w:tc>
           <w:tcPr>
-            <w:tcW w:type="dxa" w:w="4004"/>
+            <w:tcW w:type="dxa" w:w="3778"/>
           </w:tcPr>
           <w:p>
             <w:pPr>
@@ -1150,7 +1150,7 @@
         </w:tc>
         <w:tc>
           <w:tcPr>
-            <w:tcW w:type="dxa" w:w="1500"/>
+            <w:tcW w:type="dxa" w:w="1476"/>
           </w:tcPr>
           <w:p>
             <w:pPr>
@@ -1170,7 +1170,7 @@
       <w:tr>
         <w:tc>
           <w:tcPr>
-            <w:tcW w:type="dxa" w:w="472"/>
+            <w:tcW w:type="dxa" w:w="465"/>
           </w:tcPr>
           <w:p>
             <w:pPr>
@@ -1188,7 +1188,7 @@
         </w:tc>
         <w:tc>
           <w:tcPr>
-            <w:tcW w:type="dxa" w:w="1528"/>
+            <w:tcW w:type="dxa" w:w="1497"/>
           </w:tcPr>
           <w:p>
             <w:pPr>
@@ -1206,7 +1206,7 @@
         </w:tc>
         <w:tc>
           <w:tcPr>
-            <w:tcW w:type="dxa" w:w="1303"/>
+            <w:tcW w:type="dxa" w:w="1273"/>
           </w:tcPr>
           <w:p>
             <w:pPr>
@@ -1224,7 +1224,7 @@
         </w:tc>
         <w:tc>
           <w:tcPr>
-            <w:tcW w:type="dxa" w:w="3217"/>
+            <w:tcW w:type="dxa" w:w="3551"/>
           </w:tcPr>
           <w:p>
             <w:pPr>
@@ -1242,7 +1242,7 @@
         </w:tc>
         <w:tc>
           <w:tcPr>
-            <w:tcW w:type="dxa" w:w="937"/>
+            <w:tcW w:type="dxa" w:w="920"/>
           </w:tcPr>
           <w:p>
             <w:pPr>
@@ -1260,7 +1260,7 @@
         </w:tc>
         <w:tc>
           <w:tcPr>
-            <w:tcW w:type="dxa" w:w="4004"/>
+            <w:tcW w:type="dxa" w:w="3778"/>
           </w:tcPr>
           <w:p>
             <w:pPr>
@@ -1278,7 +1278,7 @@
         </w:tc>
         <w:tc>
           <w:tcPr>
-            <w:tcW w:type="dxa" w:w="1500"/>
+            <w:tcW w:type="dxa" w:w="1476"/>
           </w:tcPr>
           <w:p>
             <w:pPr>
@@ -1298,7 +1298,7 @@
       <w:tr>
         <w:tc>
           <w:tcPr>
-            <w:tcW w:type="dxa" w:w="472"/>
+            <w:tcW w:type="dxa" w:w="465"/>
           </w:tcPr>
           <w:p>
             <w:pPr>
@@ -1316,7 +1316,7 @@
         </w:tc>
         <w:tc>
           <w:tcPr>
-            <w:tcW w:type="dxa" w:w="1528"/>
+            <w:tcW w:type="dxa" w:w="1497"/>
           </w:tcPr>
           <w:p>
             <w:pPr>
@@ -1334,7 +1334,7 @@
         </w:tc>
         <w:tc>
           <w:tcPr>
-            <w:tcW w:type="dxa" w:w="1303"/>
+            <w:tcW w:type="dxa" w:w="1273"/>
           </w:tcPr>
           <w:p>
             <w:pPr>
@@ -1352,7 +1352,7 @@
         </w:tc>
         <w:tc>
           <w:tcPr>
-            <w:tcW w:type="dxa" w:w="3217"/>
+            <w:tcW w:type="dxa" w:w="3551"/>
           </w:tcPr>
           <w:p>
             <w:pPr>
@@ -1370,7 +1370,7 @@
         </w:tc>
         <w:tc>
           <w:tcPr>
-            <w:tcW w:type="dxa" w:w="937"/>
+            <w:tcW w:type="dxa" w:w="920"/>
           </w:tcPr>
           <w:p>
             <w:pPr>
@@ -1388,7 +1388,7 @@
         </w:tc>
         <w:tc>
           <w:tcPr>
-            <w:tcW w:type="dxa" w:w="4004"/>
+            <w:tcW w:type="dxa" w:w="3778"/>
           </w:tcPr>
           <w:p>
             <w:pPr>
@@ -1406,7 +1406,7 @@
         </w:tc>
         <w:tc>
           <w:tcPr>
-            <w:tcW w:type="dxa" w:w="1500"/>
+            <w:tcW w:type="dxa" w:w="1476"/>
           </w:tcPr>
           <w:p>
             <w:pPr>
@@ -1426,7 +1426,7 @@
       <w:tr>
         <w:tc>
           <w:tcPr>
-            <w:tcW w:type="dxa" w:w="472"/>
+            <w:tcW w:type="dxa" w:w="465"/>
           </w:tcPr>
           <w:p>
             <w:pPr>
@@ -1444,7 +1444,7 @@
         </w:tc>
         <w:tc>
           <w:tcPr>
-            <w:tcW w:type="dxa" w:w="1528"/>
+            <w:tcW w:type="dxa" w:w="1497"/>
           </w:tcPr>
           <w:p>
             <w:pPr>
@@ -1462,7 +1462,7 @@
         </w:tc>
         <w:tc>
           <w:tcPr>
-            <w:tcW w:type="dxa" w:w="1303"/>
+            <w:tcW w:type="dxa" w:w="1273"/>
           </w:tcPr>
           <w:p>
             <w:pPr>
@@ -1480,7 +1480,7 @@
         </w:tc>
         <w:tc>
           <w:tcPr>
-            <w:tcW w:type="dxa" w:w="3217"/>
+            <w:tcW w:type="dxa" w:w="3551"/>
           </w:tcPr>
           <w:p>
             <w:pPr>
@@ -1498,7 +1498,7 @@
         </w:tc>
         <w:tc>
           <w:tcPr>
-            <w:tcW w:type="dxa" w:w="937"/>
+            <w:tcW w:type="dxa" w:w="920"/>
           </w:tcPr>
           <w:p>
             <w:pPr>
@@ -1516,7 +1516,7 @@
         </w:tc>
         <w:tc>
           <w:tcPr>
-            <w:tcW w:type="dxa" w:w="4004"/>
+            <w:tcW w:type="dxa" w:w="3778"/>
           </w:tcPr>
           <w:p>
             <w:pPr>
@@ -1534,7 +1534,7 @@
         </w:tc>
         <w:tc>
           <w:tcPr>
-            <w:tcW w:type="dxa" w:w="1500"/>
+            <w:tcW w:type="dxa" w:w="1476"/>
           </w:tcPr>
           <w:p>
             <w:pPr>
@@ -1554,7 +1554,7 @@
       <w:tr>
         <w:tc>
           <w:tcPr>
-            <w:tcW w:type="dxa" w:w="472"/>
+            <w:tcW w:type="dxa" w:w="465"/>
           </w:tcPr>
           <w:p>
             <w:pPr>
@@ -1572,7 +1572,7 @@
         </w:tc>
         <w:tc>
           <w:tcPr>
-            <w:tcW w:type="dxa" w:w="1528"/>
+            <w:tcW w:type="dxa" w:w="1497"/>
           </w:tcPr>
           <w:p>
             <w:pPr>
@@ -1590,7 +1590,7 @@
         </w:tc>
         <w:tc>
           <w:tcPr>
-            <w:tcW w:type="dxa" w:w="1303"/>
+            <w:tcW w:type="dxa" w:w="1273"/>
           </w:tcPr>
           <w:p>
             <w:pPr>
@@ -1608,7 +1608,7 @@
         </w:tc>
         <w:tc>
           <w:tcPr>
-            <w:tcW w:type="dxa" w:w="3217"/>
+            <w:tcW w:type="dxa" w:w="3551"/>
           </w:tcPr>
           <w:p>
             <w:pPr>
@@ -1626,7 +1626,7 @@
         </w:tc>
         <w:tc>
           <w:tcPr>
-            <w:tcW w:type="dxa" w:w="937"/>
+            <w:tcW w:type="dxa" w:w="920"/>
           </w:tcPr>
           <w:p>
             <w:pPr>
@@ -1644,7 +1644,7 @@
         </w:tc>
         <w:tc>
           <w:tcPr>
-            <w:tcW w:type="dxa" w:w="4004"/>
+            <w:tcW w:type="dxa" w:w="3778"/>
           </w:tcPr>
           <w:p>
             <w:pPr>
@@ -1662,7 +1662,7 @@
         </w:tc>
         <w:tc>
           <w:tcPr>
-            <w:tcW w:type="dxa" w:w="1500"/>
+            <w:tcW w:type="dxa" w:w="1476"/>
           </w:tcPr>
           <w:p>
             <w:pPr>
@@ -1682,7 +1682,7 @@
       <w:tr>
         <w:tc>
           <w:tcPr>
-            <w:tcW w:type="dxa" w:w="472"/>
+            <w:tcW w:type="dxa" w:w="465"/>
           </w:tcPr>
           <w:p>
             <w:pPr>
@@ -1700,7 +1700,7 @@
         </w:tc>
         <w:tc>
           <w:tcPr>
-            <w:tcW w:type="dxa" w:w="1528"/>
+            <w:tcW w:type="dxa" w:w="1497"/>
           </w:tcPr>
           <w:p>
             <w:pPr>
@@ -1718,7 +1718,7 @@
         </w:tc>
         <w:tc>
           <w:tcPr>
-            <w:tcW w:type="dxa" w:w="1303"/>
+            <w:tcW w:type="dxa" w:w="1273"/>
           </w:tcPr>
           <w:p>
             <w:pPr>
@@ -1736,7 +1736,7 @@
         </w:tc>
         <w:tc>
           <w:tcPr>
-            <w:tcW w:type="dxa" w:w="3217"/>
+            <w:tcW w:type="dxa" w:w="3551"/>
           </w:tcPr>
           <w:p>
             <w:pPr>
@@ -1754,7 +1754,7 @@
         </w:tc>
         <w:tc>
           <w:tcPr>
-            <w:tcW w:type="dxa" w:w="937"/>
+            <w:tcW w:type="dxa" w:w="920"/>
           </w:tcPr>
           <w:p>
             <w:pPr>
@@ -1772,7 +1772,7 @@
         </w:tc>
         <w:tc>
           <w:tcPr>
-            <w:tcW w:type="dxa" w:w="4004"/>
+            <w:tcW w:type="dxa" w:w="3778"/>
           </w:tcPr>
           <w:p>
             <w:pPr>
@@ -1790,7 +1790,7 @@
         </w:tc>
         <w:tc>
           <w:tcPr>
-            <w:tcW w:type="dxa" w:w="1500"/>
+            <w:tcW w:type="dxa" w:w="1476"/>
           </w:tcPr>
           <w:p>
             <w:pPr>
@@ -1810,7 +1810,7 @@
       <w:tr>
         <w:tc>
           <w:tcPr>
-            <w:tcW w:type="dxa" w:w="472"/>
+            <w:tcW w:type="dxa" w:w="465"/>
           </w:tcPr>
           <w:p>
             <w:pPr>
@@ -1828,7 +1828,7 @@
         </w:tc>
         <w:tc>
           <w:tcPr>
-            <w:tcW w:type="dxa" w:w="1528"/>
+            <w:tcW w:type="dxa" w:w="1497"/>
           </w:tcPr>
           <w:p>
             <w:pPr>
@@ -1846,7 +1846,7 @@
         </w:tc>
         <w:tc>
           <w:tcPr>
-            <w:tcW w:type="dxa" w:w="1303"/>
+            <w:tcW w:type="dxa" w:w="1273"/>
           </w:tcPr>
           <w:p>
             <w:pPr>
@@ -1864,7 +1864,7 @@
         </w:tc>
         <w:tc>
           <w:tcPr>
-            <w:tcW w:type="dxa" w:w="3217"/>
+            <w:tcW w:type="dxa" w:w="3551"/>
           </w:tcPr>
           <w:p>
             <w:pPr>
@@ -1882,7 +1882,7 @@
         </w:tc>
         <w:tc>
           <w:tcPr>
-            <w:tcW w:type="dxa" w:w="937"/>
+            <w:tcW w:type="dxa" w:w="920"/>
           </w:tcPr>
           <w:p>
             <w:pPr>
@@ -1900,7 +1900,7 @@
         </w:tc>
         <w:tc>
           <w:tcPr>
-            <w:tcW w:type="dxa" w:w="4004"/>
+            <w:tcW w:type="dxa" w:w="3778"/>
           </w:tcPr>
           <w:p>
             <w:pPr>
@@ -1918,7 +1918,7 @@
         </w:tc>
         <w:tc>
           <w:tcPr>
-            <w:tcW w:type="dxa" w:w="1500"/>
+            <w:tcW w:type="dxa" w:w="1476"/>
           </w:tcPr>
           <w:p>
             <w:pPr>
@@ -1938,127 +1938,127 @@
       <w:tr>
         <w:tc>
           <w:tcPr>
-            <w:tcW w:type="dxa" w:w="472"/>
-          </w:tcPr>
-          <w:p>
-            <w:pPr>
-              <w:spacing w:after="0" w:line="240" w:lineRule="auto"/>
-            </w:pPr>
-            <w:r>
-              <w:rPr>
-                <w:rFonts w:ascii="Aptos" w:hAnsi="Aptos"/>
-                <w:b w:val="0"/>
-                <w:sz w:val="18"/>
-              </w:rPr>
-              <w:t>R1</w:t>
-            </w:r>
-          </w:p>
-        </w:tc>
-        <w:tc>
-          <w:tcPr>
-            <w:tcW w:type="dxa" w:w="1528"/>
-          </w:tcPr>
-          <w:p>
-            <w:pPr>
-              <w:spacing w:after="0" w:line="240" w:lineRule="auto"/>
-            </w:pPr>
-            <w:r>
-              <w:rPr>
-                <w:rFonts w:ascii="Aptos" w:hAnsi="Aptos"/>
-                <w:b w:val="0"/>
-                <w:sz w:val="18"/>
-              </w:rPr>
-              <w:t>Repudiation</w:t>
-            </w:r>
-          </w:p>
-        </w:tc>
-        <w:tc>
-          <w:tcPr>
-            <w:tcW w:type="dxa" w:w="1303"/>
-          </w:tcPr>
-          <w:p>
-            <w:pPr>
-              <w:spacing w:after="0" w:line="240" w:lineRule="auto"/>
-            </w:pPr>
-            <w:r>
-              <w:rPr>
-                <w:rFonts w:ascii="Aptos" w:hAnsi="Aptos"/>
-                <w:b w:val="0"/>
-                <w:sz w:val="18"/>
-              </w:rPr>
-              <w:t>Product, Inventory</w:t>
-            </w:r>
-          </w:p>
-        </w:tc>
-        <w:tc>
-          <w:tcPr>
-            <w:tcW w:type="dxa" w:w="3217"/>
-          </w:tcPr>
-          <w:p>
-            <w:pPr>
-              <w:spacing w:after="0" w:line="240" w:lineRule="auto"/>
-            </w:pPr>
-            <w:r>
-              <w:rPr>
-                <w:rFonts w:ascii="Aptos" w:hAnsi="Aptos"/>
-                <w:b w:val="0"/>
-                <w:sz w:val="18"/>
-              </w:rPr>
-              <w:t>No record of who changed products or stock</w:t>
-            </w:r>
-          </w:p>
-        </w:tc>
-        <w:tc>
-          <w:tcPr>
-            <w:tcW w:type="dxa" w:w="937"/>
-          </w:tcPr>
-          <w:p>
-            <w:pPr>
-              <w:spacing w:after="0" w:line="240" w:lineRule="auto"/>
-            </w:pPr>
-            <w:r>
-              <w:rPr>
-                <w:rFonts w:ascii="Aptos" w:hAnsi="Aptos"/>
-                <w:b w:val="0"/>
-                <w:sz w:val="18"/>
-              </w:rPr>
-              <w:t>Medium</w:t>
-            </w:r>
-          </w:p>
-        </w:tc>
-        <w:tc>
-          <w:tcPr>
-            <w:tcW w:type="dxa" w:w="4004"/>
-          </w:tcPr>
-          <w:p>
-            <w:pPr>
-              <w:spacing w:after="0" w:line="240" w:lineRule="auto"/>
-            </w:pPr>
-            <w:r>
-              <w:rPr>
-                <w:rFonts w:ascii="Aptos" w:hAnsi="Aptos"/>
-                <w:b w:val="0"/>
-                <w:sz w:val="18"/>
-              </w:rPr>
-              <w:t>Audit log with user id (NameIdentifier) per write</w:t>
-            </w:r>
-          </w:p>
-        </w:tc>
-        <w:tc>
-          <w:tcPr>
-            <w:tcW w:type="dxa" w:w="1500"/>
-          </w:tcPr>
-          <w:p>
-            <w:pPr>
-              <w:spacing w:after="0" w:line="240" w:lineRule="auto"/>
-            </w:pPr>
-            <w:r>
-              <w:rPr>
-                <w:rFonts w:ascii="Aptos" w:hAnsi="Aptos"/>
-                <w:b w:val="0"/>
-                <w:sz w:val="18"/>
-              </w:rPr>
-              <w:t>Planned</w:t>
+            <w:tcW w:type="dxa" w:w="465"/>
+          </w:tcPr>
+          <w:p>
+            <w:pPr>
+              <w:spacing w:after="0" w:line="240" w:lineRule="auto"/>
+            </w:pPr>
+            <w:r>
+              <w:rPr>
+                <w:rFonts w:ascii="Aptos" w:hAnsi="Aptos"/>
+                <w:b w:val="0"/>
+                <w:sz w:val="18"/>
+              </w:rPr>
+              <w:t>T5</w:t>
+            </w:r>
+          </w:p>
+        </w:tc>
+        <w:tc>
+          <w:tcPr>
+            <w:tcW w:type="dxa" w:w="1497"/>
+          </w:tcPr>
+          <w:p>
+            <w:pPr>
+              <w:spacing w:after="0" w:line="240" w:lineRule="auto"/>
+            </w:pPr>
+            <w:r>
+              <w:rPr>
+                <w:rFonts w:ascii="Aptos" w:hAnsi="Aptos"/>
+                <w:b w:val="0"/>
+                <w:sz w:val="18"/>
+              </w:rPr>
+              <w:t>Tampering</w:t>
+            </w:r>
+          </w:p>
+        </w:tc>
+        <w:tc>
+          <w:tcPr>
+            <w:tcW w:type="dxa" w:w="1273"/>
+          </w:tcPr>
+          <w:p>
+            <w:pPr>
+              <w:spacing w:after="0" w:line="240" w:lineRule="auto"/>
+            </w:pPr>
+            <w:r>
+              <w:rPr>
+                <w:rFonts w:ascii="Aptos" w:hAnsi="Aptos"/>
+                <w:b w:val="0"/>
+                <w:sz w:val="18"/>
+              </w:rPr>
+              <w:t>Build</w:t>
+            </w:r>
+          </w:p>
+        </w:tc>
+        <w:tc>
+          <w:tcPr>
+            <w:tcW w:type="dxa" w:w="3551"/>
+          </w:tcPr>
+          <w:p>
+            <w:pPr>
+              <w:spacing w:after="0" w:line="240" w:lineRule="auto"/>
+            </w:pPr>
+            <w:r>
+              <w:rPr>
+                <w:rFonts w:ascii="Aptos" w:hAnsi="Aptos"/>
+                <w:b w:val="0"/>
+                <w:sz w:val="18"/>
+              </w:rPr>
+              <w:t>Dependency confusion: shared AuthLibrary/ResponseLibrary are not on nuget.org, which hosts unrelated packages with the same names; a clean restore pulled AuthLibrary 2.0.0</w:t>
+            </w:r>
+          </w:p>
+        </w:tc>
+        <w:tc>
+          <w:tcPr>
+            <w:tcW w:type="dxa" w:w="920"/>
+          </w:tcPr>
+          <w:p>
+            <w:pPr>
+              <w:spacing w:after="0" w:line="240" w:lineRule="auto"/>
+            </w:pPr>
+            <w:r>
+              <w:rPr>
+                <w:rFonts w:ascii="Aptos" w:hAnsi="Aptos"/>
+                <w:b w:val="0"/>
+                <w:sz w:val="18"/>
+              </w:rPr>
+              <w:t>High</w:t>
+            </w:r>
+          </w:p>
+        </w:tc>
+        <w:tc>
+          <w:tcPr>
+            <w:tcW w:type="dxa" w:w="3778"/>
+          </w:tcPr>
+          <w:p>
+            <w:pPr>
+              <w:spacing w:after="0" w:line="240" w:lineRule="auto"/>
+            </w:pPr>
+            <w:r>
+              <w:rPr>
+                <w:rFonts w:ascii="Aptos" w:hAnsi="Aptos"/>
+                <w:b w:val="0"/>
+                <w:sz w:val="18"/>
+              </w:rPr>
+              <w:t>Exact packages bundled in each repo (nuget-local); nuget.config packageSourceMapping limits both names to that folder</w:t>
+            </w:r>
+          </w:p>
+        </w:tc>
+        <w:tc>
+          <w:tcPr>
+            <w:tcW w:type="dxa" w:w="1476"/>
+          </w:tcPr>
+          <w:p>
+            <w:pPr>
+              <w:spacing w:after="0" w:line="240" w:lineRule="auto"/>
+            </w:pPr>
+            <w:r>
+              <w:rPr>
+                <w:rFonts w:ascii="Aptos" w:hAnsi="Aptos"/>
+                <w:b w:val="0"/>
+                <w:sz w:val="18"/>
+              </w:rPr>
+              <w:t>Done</w:t>
             </w:r>
           </w:p>
         </w:tc>
@@ -2066,79 +2066,79 @@
       <w:tr>
         <w:tc>
           <w:tcPr>
-            <w:tcW w:type="dxa" w:w="472"/>
-          </w:tcPr>
-          <w:p>
-            <w:pPr>
-              <w:spacing w:after="0" w:line="240" w:lineRule="auto"/>
-            </w:pPr>
-            <w:r>
-              <w:rPr>
-                <w:rFonts w:ascii="Aptos" w:hAnsi="Aptos"/>
-                <w:b w:val="0"/>
-                <w:sz w:val="18"/>
-              </w:rPr>
-              <w:t>I1</w:t>
-            </w:r>
-          </w:p>
-        </w:tc>
-        <w:tc>
-          <w:tcPr>
-            <w:tcW w:type="dxa" w:w="1528"/>
-          </w:tcPr>
-          <w:p>
-            <w:pPr>
-              <w:spacing w:after="0" w:line="240" w:lineRule="auto"/>
-            </w:pPr>
-            <w:r>
-              <w:rPr>
-                <w:rFonts w:ascii="Aptos" w:hAnsi="Aptos"/>
-                <w:b w:val="0"/>
-                <w:sz w:val="18"/>
-              </w:rPr>
-              <w:t>Info disclosure</w:t>
-            </w:r>
-          </w:p>
-        </w:tc>
-        <w:tc>
-          <w:tcPr>
-            <w:tcW w:type="dxa" w:w="1303"/>
-          </w:tcPr>
-          <w:p>
-            <w:pPr>
-              <w:spacing w:after="0" w:line="240" w:lineRule="auto"/>
-            </w:pPr>
-            <w:r>
-              <w:rPr>
-                <w:rFonts w:ascii="Aptos" w:hAnsi="Aptos"/>
-                <w:b w:val="0"/>
-                <w:sz w:val="18"/>
-              </w:rPr>
-              <w:t>Gateway</w:t>
-            </w:r>
-          </w:p>
-        </w:tc>
-        <w:tc>
-          <w:tcPr>
-            <w:tcW w:type="dxa" w:w="3217"/>
-          </w:tcPr>
-          <w:p>
-            <w:pPr>
-              <w:spacing w:after="0" w:line="240" w:lineRule="auto"/>
-            </w:pPr>
-            <w:r>
-              <w:rPr>
-                <w:rFonts w:ascii="Aptos" w:hAnsi="Aptos"/>
-                <w:b w:val="0"/>
-                <w:sz w:val="18"/>
-              </w:rPr>
-              <w:t>Exception messages and internal URLs in responses</w:t>
-            </w:r>
-          </w:p>
-        </w:tc>
-        <w:tc>
-          <w:tcPr>
-            <w:tcW w:type="dxa" w:w="937"/>
+            <w:tcW w:type="dxa" w:w="465"/>
+          </w:tcPr>
+          <w:p>
+            <w:pPr>
+              <w:spacing w:after="0" w:line="240" w:lineRule="auto"/>
+            </w:pPr>
+            <w:r>
+              <w:rPr>
+                <w:rFonts w:ascii="Aptos" w:hAnsi="Aptos"/>
+                <w:b w:val="0"/>
+                <w:sz w:val="18"/>
+              </w:rPr>
+              <w:t>R1</w:t>
+            </w:r>
+          </w:p>
+        </w:tc>
+        <w:tc>
+          <w:tcPr>
+            <w:tcW w:type="dxa" w:w="1497"/>
+          </w:tcPr>
+          <w:p>
+            <w:pPr>
+              <w:spacing w:after="0" w:line="240" w:lineRule="auto"/>
+            </w:pPr>
+            <w:r>
+              <w:rPr>
+                <w:rFonts w:ascii="Aptos" w:hAnsi="Aptos"/>
+                <w:b w:val="0"/>
+                <w:sz w:val="18"/>
+              </w:rPr>
+              <w:t>Repudiation</w:t>
+            </w:r>
+          </w:p>
+        </w:tc>
+        <w:tc>
+          <w:tcPr>
+            <w:tcW w:type="dxa" w:w="1273"/>
+          </w:tcPr>
+          <w:p>
+            <w:pPr>
+              <w:spacing w:after="0" w:line="240" w:lineRule="auto"/>
+            </w:pPr>
+            <w:r>
+              <w:rPr>
+                <w:rFonts w:ascii="Aptos" w:hAnsi="Aptos"/>
+                <w:b w:val="0"/>
+                <w:sz w:val="18"/>
+              </w:rPr>
+              <w:t>Product, Inventory</w:t>
+            </w:r>
+          </w:p>
+        </w:tc>
+        <w:tc>
+          <w:tcPr>
+            <w:tcW w:type="dxa" w:w="3551"/>
+          </w:tcPr>
+          <w:p>
+            <w:pPr>
+              <w:spacing w:after="0" w:line="240" w:lineRule="auto"/>
+            </w:pPr>
+            <w:r>
+              <w:rPr>
+                <w:rFonts w:ascii="Aptos" w:hAnsi="Aptos"/>
+                <w:b w:val="0"/>
+                <w:sz w:val="18"/>
+              </w:rPr>
+              <w:t>No record of who changed products or stock</w:t>
+            </w:r>
+          </w:p>
+        </w:tc>
+        <w:tc>
+          <w:tcPr>
+            <w:tcW w:type="dxa" w:w="920"/>
           </w:tcPr>
           <w:p>
             <w:pPr>
@@ -2156,37 +2156,37 @@
         </w:tc>
         <w:tc>
           <w:tcPr>
-            <w:tcW w:type="dxa" w:w="4004"/>
-          </w:tcPr>
-          <w:p>
-            <w:pPr>
-              <w:spacing w:after="0" w:line="240" w:lineRule="auto"/>
-            </w:pPr>
-            <w:r>
-              <w:rPr>
-                <w:rFonts w:ascii="Aptos" w:hAnsi="Aptos"/>
-                <w:b w:val="0"/>
-                <w:sz w:val="18"/>
-              </w:rPr>
-              <w:t>Generic messages; details to server log</w:t>
-            </w:r>
-          </w:p>
-        </w:tc>
-        <w:tc>
-          <w:tcPr>
-            <w:tcW w:type="dxa" w:w="1500"/>
-          </w:tcPr>
-          <w:p>
-            <w:pPr>
-              <w:spacing w:after="0" w:line="240" w:lineRule="auto"/>
-            </w:pPr>
-            <w:r>
-              <w:rPr>
-                <w:rFonts w:ascii="Aptos" w:hAnsi="Aptos"/>
-                <w:b w:val="0"/>
-                <w:sz w:val="18"/>
-              </w:rPr>
-              <w:t>Done</w:t>
+            <w:tcW w:type="dxa" w:w="3778"/>
+          </w:tcPr>
+          <w:p>
+            <w:pPr>
+              <w:spacing w:after="0" w:line="240" w:lineRule="auto"/>
+            </w:pPr>
+            <w:r>
+              <w:rPr>
+                <w:rFonts w:ascii="Aptos" w:hAnsi="Aptos"/>
+                <w:b w:val="0"/>
+                <w:sz w:val="18"/>
+              </w:rPr>
+              <w:t>Audit log with user id (NameIdentifier) per write</w:t>
+            </w:r>
+          </w:p>
+        </w:tc>
+        <w:tc>
+          <w:tcPr>
+            <w:tcW w:type="dxa" w:w="1476"/>
+          </w:tcPr>
+          <w:p>
+            <w:pPr>
+              <w:spacing w:after="0" w:line="240" w:lineRule="auto"/>
+            </w:pPr>
+            <w:r>
+              <w:rPr>
+                <w:rFonts w:ascii="Aptos" w:hAnsi="Aptos"/>
+                <w:b w:val="0"/>
+                <w:sz w:val="18"/>
+              </w:rPr>
+              <w:t>Planned</w:t>
             </w:r>
           </w:p>
         </w:tc>
@@ -2194,25 +2194,25 @@
       <w:tr>
         <w:tc>
           <w:tcPr>
-            <w:tcW w:type="dxa" w:w="472"/>
-          </w:tcPr>
-          <w:p>
-            <w:pPr>
-              <w:spacing w:after="0" w:line="240" w:lineRule="auto"/>
-            </w:pPr>
-            <w:r>
-              <w:rPr>
-                <w:rFonts w:ascii="Aptos" w:hAnsi="Aptos"/>
-                <w:b w:val="0"/>
-                <w:sz w:val="18"/>
-              </w:rPr>
-              <w:t>I2</w:t>
-            </w:r>
-          </w:p>
-        </w:tc>
-        <w:tc>
-          <w:tcPr>
-            <w:tcW w:type="dxa" w:w="1528"/>
+            <w:tcW w:type="dxa" w:w="465"/>
+          </w:tcPr>
+          <w:p>
+            <w:pPr>
+              <w:spacing w:after="0" w:line="240" w:lineRule="auto"/>
+            </w:pPr>
+            <w:r>
+              <w:rPr>
+                <w:rFonts w:ascii="Aptos" w:hAnsi="Aptos"/>
+                <w:b w:val="0"/>
+                <w:sz w:val="18"/>
+              </w:rPr>
+              <w:t>I1</w:t>
+            </w:r>
+          </w:p>
+        </w:tc>
+        <w:tc>
+          <w:tcPr>
+            <w:tcW w:type="dxa" w:w="1497"/>
           </w:tcPr>
           <w:p>
             <w:pPr>
@@ -2230,43 +2230,43 @@
         </w:tc>
         <w:tc>
           <w:tcPr>
-            <w:tcW w:type="dxa" w:w="1303"/>
-          </w:tcPr>
-          <w:p>
-            <w:pPr>
-              <w:spacing w:after="0" w:line="240" w:lineRule="auto"/>
-            </w:pPr>
-            <w:r>
-              <w:rPr>
-                <w:rFonts w:ascii="Aptos" w:hAnsi="Aptos"/>
-                <w:b w:val="0"/>
-                <w:sz w:val="18"/>
-              </w:rPr>
-              <w:t>Services</w:t>
-            </w:r>
-          </w:p>
-        </w:tc>
-        <w:tc>
-          <w:tcPr>
-            <w:tcW w:type="dxa" w:w="3217"/>
-          </w:tcPr>
-          <w:p>
-            <w:pPr>
-              <w:spacing w:after="0" w:line="240" w:lineRule="auto"/>
-            </w:pPr>
-            <w:r>
-              <w:rPr>
-                <w:rFonts w:ascii="Aptos" w:hAnsi="Aptos"/>
-                <w:b w:val="0"/>
-                <w:sz w:val="18"/>
-              </w:rPr>
-              <w:t>Dev exception page (stack trace) passed through gateway</w:t>
-            </w:r>
-          </w:p>
-        </w:tc>
-        <w:tc>
-          <w:tcPr>
-            <w:tcW w:type="dxa" w:w="937"/>
+            <w:tcW w:type="dxa" w:w="1273"/>
+          </w:tcPr>
+          <w:p>
+            <w:pPr>
+              <w:spacing w:after="0" w:line="240" w:lineRule="auto"/>
+            </w:pPr>
+            <w:r>
+              <w:rPr>
+                <w:rFonts w:ascii="Aptos" w:hAnsi="Aptos"/>
+                <w:b w:val="0"/>
+                <w:sz w:val="18"/>
+              </w:rPr>
+              <w:t>Gateway</w:t>
+            </w:r>
+          </w:p>
+        </w:tc>
+        <w:tc>
+          <w:tcPr>
+            <w:tcW w:type="dxa" w:w="3551"/>
+          </w:tcPr>
+          <w:p>
+            <w:pPr>
+              <w:spacing w:after="0" w:line="240" w:lineRule="auto"/>
+            </w:pPr>
+            <w:r>
+              <w:rPr>
+                <w:rFonts w:ascii="Aptos" w:hAnsi="Aptos"/>
+                <w:b w:val="0"/>
+                <w:sz w:val="18"/>
+              </w:rPr>
+              <w:t>Exception messages and internal URLs in responses</w:t>
+            </w:r>
+          </w:p>
+        </w:tc>
+        <w:tc>
+          <w:tcPr>
+            <w:tcW w:type="dxa" w:w="920"/>
           </w:tcPr>
           <w:p>
             <w:pPr>
@@ -2284,25 +2284,25 @@
         </w:tc>
         <w:tc>
           <w:tcPr>
-            <w:tcW w:type="dxa" w:w="4004"/>
-          </w:tcPr>
-          <w:p>
-            <w:pPr>
-              <w:spacing w:after="0" w:line="240" w:lineRule="auto"/>
-            </w:pPr>
-            <w:r>
-              <w:rPr>
-                <w:rFonts w:ascii="Aptos" w:hAnsi="Aptos"/>
-                <w:b w:val="0"/>
-                <w:sz w:val="18"/>
-              </w:rPr>
-              <w:t>Gateway replaces every downstream 5xx body with a generic message; direct calls blocked by mTLS</w:t>
-            </w:r>
-          </w:p>
-        </w:tc>
-        <w:tc>
-          <w:tcPr>
-            <w:tcW w:type="dxa" w:w="1500"/>
+            <w:tcW w:type="dxa" w:w="3778"/>
+          </w:tcPr>
+          <w:p>
+            <w:pPr>
+              <w:spacing w:after="0" w:line="240" w:lineRule="auto"/>
+            </w:pPr>
+            <w:r>
+              <w:rPr>
+                <w:rFonts w:ascii="Aptos" w:hAnsi="Aptos"/>
+                <w:b w:val="0"/>
+                <w:sz w:val="18"/>
+              </w:rPr>
+              <w:t>Generic messages; details to server log</w:t>
+            </w:r>
+          </w:p>
+        </w:tc>
+        <w:tc>
+          <w:tcPr>
+            <w:tcW w:type="dxa" w:w="1476"/>
           </w:tcPr>
           <w:p>
             <w:pPr>
@@ -2322,25 +2322,25 @@
       <w:tr>
         <w:tc>
           <w:tcPr>
-            <w:tcW w:type="dxa" w:w="472"/>
-          </w:tcPr>
-          <w:p>
-            <w:pPr>
-              <w:spacing w:after="0" w:line="240" w:lineRule="auto"/>
-            </w:pPr>
-            <w:r>
-              <w:rPr>
-                <w:rFonts w:ascii="Aptos" w:hAnsi="Aptos"/>
-                <w:b w:val="0"/>
-                <w:sz w:val="18"/>
-              </w:rPr>
-              <w:t>I3</w:t>
-            </w:r>
-          </w:p>
-        </w:tc>
-        <w:tc>
-          <w:tcPr>
-            <w:tcW w:type="dxa" w:w="1528"/>
+            <w:tcW w:type="dxa" w:w="465"/>
+          </w:tcPr>
+          <w:p>
+            <w:pPr>
+              <w:spacing w:after="0" w:line="240" w:lineRule="auto"/>
+            </w:pPr>
+            <w:r>
+              <w:rPr>
+                <w:rFonts w:ascii="Aptos" w:hAnsi="Aptos"/>
+                <w:b w:val="0"/>
+                <w:sz w:val="18"/>
+              </w:rPr>
+              <w:t>I2</w:t>
+            </w:r>
+          </w:p>
+        </w:tc>
+        <w:tc>
+          <w:tcPr>
+            <w:tcW w:type="dxa" w:w="1497"/>
           </w:tcPr>
           <w:p>
             <w:pPr>
@@ -2358,79 +2358,79 @@
         </w:tc>
         <w:tc>
           <w:tcPr>
-            <w:tcW w:type="dxa" w:w="1303"/>
-          </w:tcPr>
-          <w:p>
-            <w:pPr>
-              <w:spacing w:after="0" w:line="240" w:lineRule="auto"/>
-            </w:pPr>
-            <w:r>
-              <w:rPr>
-                <w:rFonts w:ascii="Aptos" w:hAnsi="Aptos"/>
-                <w:b w:val="0"/>
-                <w:sz w:val="18"/>
-              </w:rPr>
-              <w:t>Gateway</w:t>
-            </w:r>
-          </w:p>
-        </w:tc>
-        <w:tc>
-          <w:tcPr>
-            <w:tcW w:type="dxa" w:w="3217"/>
-          </w:tcPr>
-          <w:p>
-            <w:pPr>
-              <w:spacing w:after="0" w:line="240" w:lineRule="auto"/>
-            </w:pPr>
-            <w:r>
-              <w:rPr>
-                <w:rFonts w:ascii="Aptos" w:hAnsi="Aptos"/>
-                <w:b w:val="0"/>
-                <w:sz w:val="18"/>
-              </w:rPr>
-              <w:t>Server header fingerprinting</w:t>
-            </w:r>
-          </w:p>
-        </w:tc>
-        <w:tc>
-          <w:tcPr>
-            <w:tcW w:type="dxa" w:w="937"/>
-          </w:tcPr>
-          <w:p>
-            <w:pPr>
-              <w:spacing w:after="0" w:line="240" w:lineRule="auto"/>
-            </w:pPr>
-            <w:r>
-              <w:rPr>
-                <w:rFonts w:ascii="Aptos" w:hAnsi="Aptos"/>
-                <w:b w:val="0"/>
-                <w:sz w:val="18"/>
-              </w:rPr>
-              <w:t>Low</w:t>
-            </w:r>
-          </w:p>
-        </w:tc>
-        <w:tc>
-          <w:tcPr>
-            <w:tcW w:type="dxa" w:w="4004"/>
-          </w:tcPr>
-          <w:p>
-            <w:pPr>
-              <w:spacing w:after="0" w:line="240" w:lineRule="auto"/>
-            </w:pPr>
-            <w:r>
-              <w:rPr>
-                <w:rFonts w:ascii="Aptos" w:hAnsi="Aptos"/>
-                <w:b w:val="0"/>
-                <w:sz w:val="18"/>
-              </w:rPr>
-              <w:t>Server/X-Powered-By stripped, incl. downstream copies</w:t>
-            </w:r>
-          </w:p>
-        </w:tc>
-        <w:tc>
-          <w:tcPr>
-            <w:tcW w:type="dxa" w:w="1500"/>
+            <w:tcW w:type="dxa" w:w="1273"/>
+          </w:tcPr>
+          <w:p>
+            <w:pPr>
+              <w:spacing w:after="0" w:line="240" w:lineRule="auto"/>
+            </w:pPr>
+            <w:r>
+              <w:rPr>
+                <w:rFonts w:ascii="Aptos" w:hAnsi="Aptos"/>
+                <w:b w:val="0"/>
+                <w:sz w:val="18"/>
+              </w:rPr>
+              <w:t>Services</w:t>
+            </w:r>
+          </w:p>
+        </w:tc>
+        <w:tc>
+          <w:tcPr>
+            <w:tcW w:type="dxa" w:w="3551"/>
+          </w:tcPr>
+          <w:p>
+            <w:pPr>
+              <w:spacing w:after="0" w:line="240" w:lineRule="auto"/>
+            </w:pPr>
+            <w:r>
+              <w:rPr>
+                <w:rFonts w:ascii="Aptos" w:hAnsi="Aptos"/>
+                <w:b w:val="0"/>
+                <w:sz w:val="18"/>
+              </w:rPr>
+              <w:t>Dev exception page (stack trace) passed through gateway</w:t>
+            </w:r>
+          </w:p>
+        </w:tc>
+        <w:tc>
+          <w:tcPr>
+            <w:tcW w:type="dxa" w:w="920"/>
+          </w:tcPr>
+          <w:p>
+            <w:pPr>
+              <w:spacing w:after="0" w:line="240" w:lineRule="auto"/>
+            </w:pPr>
+            <w:r>
+              <w:rPr>
+                <w:rFonts w:ascii="Aptos" w:hAnsi="Aptos"/>
+                <w:b w:val="0"/>
+                <w:sz w:val="18"/>
+              </w:rPr>
+              <w:t>Medium</w:t>
+            </w:r>
+          </w:p>
+        </w:tc>
+        <w:tc>
+          <w:tcPr>
+            <w:tcW w:type="dxa" w:w="3778"/>
+          </w:tcPr>
+          <w:p>
+            <w:pPr>
+              <w:spacing w:after="0" w:line="240" w:lineRule="auto"/>
+            </w:pPr>
+            <w:r>
+              <w:rPr>
+                <w:rFonts w:ascii="Aptos" w:hAnsi="Aptos"/>
+                <w:b w:val="0"/>
+                <w:sz w:val="18"/>
+              </w:rPr>
+              <w:t>Gateway replaces every downstream 5xx body with a generic message; direct calls blocked by mTLS</w:t>
+            </w:r>
+          </w:p>
+        </w:tc>
+        <w:tc>
+          <w:tcPr>
+            <w:tcW w:type="dxa" w:w="1476"/>
           </w:tcPr>
           <w:p>
             <w:pPr>
@@ -2450,25 +2450,25 @@
       <w:tr>
         <w:tc>
           <w:tcPr>
-            <w:tcW w:type="dxa" w:w="472"/>
-          </w:tcPr>
-          <w:p>
-            <w:pPr>
-              <w:spacing w:after="0" w:line="240" w:lineRule="auto"/>
-            </w:pPr>
-            <w:r>
-              <w:rPr>
-                <w:rFonts w:ascii="Aptos" w:hAnsi="Aptos"/>
-                <w:b w:val="0"/>
-                <w:sz w:val="18"/>
-              </w:rPr>
-              <w:t>I4</w:t>
-            </w:r>
-          </w:p>
-        </w:tc>
-        <w:tc>
-          <w:tcPr>
-            <w:tcW w:type="dxa" w:w="1528"/>
+            <w:tcW w:type="dxa" w:w="465"/>
+          </w:tcPr>
+          <w:p>
+            <w:pPr>
+              <w:spacing w:after="0" w:line="240" w:lineRule="auto"/>
+            </w:pPr>
+            <w:r>
+              <w:rPr>
+                <w:rFonts w:ascii="Aptos" w:hAnsi="Aptos"/>
+                <w:b w:val="0"/>
+                <w:sz w:val="18"/>
+              </w:rPr>
+              <w:t>I3</w:t>
+            </w:r>
+          </w:p>
+        </w:tc>
+        <w:tc>
+          <w:tcPr>
+            <w:tcW w:type="dxa" w:w="1497"/>
           </w:tcPr>
           <w:p>
             <w:pPr>
@@ -2486,91 +2486,91 @@
         </w:tc>
         <w:tc>
           <w:tcPr>
-            <w:tcW w:type="dxa" w:w="1303"/>
-          </w:tcPr>
-          <w:p>
-            <w:pPr>
-              <w:spacing w:after="0" w:line="240" w:lineRule="auto"/>
-            </w:pPr>
-            <w:r>
-              <w:rPr>
-                <w:rFonts w:ascii="Aptos" w:hAnsi="Aptos"/>
-                <w:b w:val="0"/>
-                <w:sz w:val="18"/>
-              </w:rPr>
-              <w:t>Repos</w:t>
-            </w:r>
-          </w:p>
-        </w:tc>
-        <w:tc>
-          <w:tcPr>
-            <w:tcW w:type="dxa" w:w="3217"/>
-          </w:tcPr>
-          <w:p>
-            <w:pPr>
-              <w:spacing w:after="0" w:line="240" w:lineRule="auto"/>
-            </w:pPr>
-            <w:r>
-              <w:rPr>
-                <w:rFonts w:ascii="Aptos" w:hAnsi="Aptos"/>
-                <w:b w:val="0"/>
-                <w:sz w:val="18"/>
-              </w:rPr>
-              <w:t>Secrets in git: seed passwords, RabbitMQ creds, old HS256 secret in history</w:t>
-            </w:r>
-          </w:p>
-        </w:tc>
-        <w:tc>
-          <w:tcPr>
-            <w:tcW w:type="dxa" w:w="937"/>
-          </w:tcPr>
-          <w:p>
-            <w:pPr>
-              <w:spacing w:after="0" w:line="240" w:lineRule="auto"/>
-            </w:pPr>
-            <w:r>
-              <w:rPr>
-                <w:rFonts w:ascii="Aptos" w:hAnsi="Aptos"/>
-                <w:b w:val="0"/>
-                <w:sz w:val="18"/>
-              </w:rPr>
-              <w:t>High</w:t>
-            </w:r>
-          </w:p>
-        </w:tc>
-        <w:tc>
-          <w:tcPr>
-            <w:tcW w:type="dxa" w:w="4004"/>
-          </w:tcPr>
-          <w:p>
-            <w:pPr>
-              <w:spacing w:after="0" w:line="240" w:lineRule="auto"/>
-            </w:pPr>
-            <w:r>
-              <w:rPr>
-                <w:rFonts w:ascii="Aptos" w:hAnsi="Aptos"/>
-                <w:b w:val="0"/>
-                <w:sz w:val="18"/>
-              </w:rPr>
-              <w:t>DB/broker/Redis/seed passwords moved to user-secrets (.env, git-ignored); HS256 secret in history but unused; all services share SQL sa login</w:t>
-            </w:r>
-          </w:p>
-        </w:tc>
-        <w:tc>
-          <w:tcPr>
-            <w:tcW w:type="dxa" w:w="1500"/>
-          </w:tcPr>
-          <w:p>
-            <w:pPr>
-              <w:spacing w:after="0" w:line="240" w:lineRule="auto"/>
-            </w:pPr>
-            <w:r>
-              <w:rPr>
-                <w:rFonts w:ascii="Aptos" w:hAnsi="Aptos"/>
-                <w:b w:val="0"/>
-                <w:sz w:val="18"/>
-              </w:rPr>
-              <w:t>Partial</w:t>
+            <w:tcW w:type="dxa" w:w="1273"/>
+          </w:tcPr>
+          <w:p>
+            <w:pPr>
+              <w:spacing w:after="0" w:line="240" w:lineRule="auto"/>
+            </w:pPr>
+            <w:r>
+              <w:rPr>
+                <w:rFonts w:ascii="Aptos" w:hAnsi="Aptos"/>
+                <w:b w:val="0"/>
+                <w:sz w:val="18"/>
+              </w:rPr>
+              <w:t>Gateway</w:t>
+            </w:r>
+          </w:p>
+        </w:tc>
+        <w:tc>
+          <w:tcPr>
+            <w:tcW w:type="dxa" w:w="3551"/>
+          </w:tcPr>
+          <w:p>
+            <w:pPr>
+              <w:spacing w:after="0" w:line="240" w:lineRule="auto"/>
+            </w:pPr>
+            <w:r>
+              <w:rPr>
+                <w:rFonts w:ascii="Aptos" w:hAnsi="Aptos"/>
+                <w:b w:val="0"/>
+                <w:sz w:val="18"/>
+              </w:rPr>
+              <w:t>Server header fingerprinting</w:t>
+            </w:r>
+          </w:p>
+        </w:tc>
+        <w:tc>
+          <w:tcPr>
+            <w:tcW w:type="dxa" w:w="920"/>
+          </w:tcPr>
+          <w:p>
+            <w:pPr>
+              <w:spacing w:after="0" w:line="240" w:lineRule="auto"/>
+            </w:pPr>
+            <w:r>
+              <w:rPr>
+                <w:rFonts w:ascii="Aptos" w:hAnsi="Aptos"/>
+                <w:b w:val="0"/>
+                <w:sz w:val="18"/>
+              </w:rPr>
+              <w:t>Low</w:t>
+            </w:r>
+          </w:p>
+        </w:tc>
+        <w:tc>
+          <w:tcPr>
+            <w:tcW w:type="dxa" w:w="3778"/>
+          </w:tcPr>
+          <w:p>
+            <w:pPr>
+              <w:spacing w:after="0" w:line="240" w:lineRule="auto"/>
+            </w:pPr>
+            <w:r>
+              <w:rPr>
+                <w:rFonts w:ascii="Aptos" w:hAnsi="Aptos"/>
+                <w:b w:val="0"/>
+                <w:sz w:val="18"/>
+              </w:rPr>
+              <w:t>Server/X-Powered-By stripped, incl. downstream copies</w:t>
+            </w:r>
+          </w:p>
+        </w:tc>
+        <w:tc>
+          <w:tcPr>
+            <w:tcW w:type="dxa" w:w="1476"/>
+          </w:tcPr>
+          <w:p>
+            <w:pPr>
+              <w:spacing w:after="0" w:line="240" w:lineRule="auto"/>
+            </w:pPr>
+            <w:r>
+              <w:rPr>
+                <w:rFonts w:ascii="Aptos" w:hAnsi="Aptos"/>
+                <w:b w:val="0"/>
+                <w:sz w:val="18"/>
+              </w:rPr>
+              <w:t>Done</w:t>
             </w:r>
           </w:p>
         </w:tc>
@@ -2578,25 +2578,25 @@
       <w:tr>
         <w:tc>
           <w:tcPr>
-            <w:tcW w:type="dxa" w:w="472"/>
-          </w:tcPr>
-          <w:p>
-            <w:pPr>
-              <w:spacing w:after="0" w:line="240" w:lineRule="auto"/>
-            </w:pPr>
-            <w:r>
-              <w:rPr>
-                <w:rFonts w:ascii="Aptos" w:hAnsi="Aptos"/>
-                <w:b w:val="0"/>
-                <w:sz w:val="18"/>
-              </w:rPr>
-              <w:t>I5</w:t>
-            </w:r>
-          </w:p>
-        </w:tc>
-        <w:tc>
-          <w:tcPr>
-            <w:tcW w:type="dxa" w:w="1528"/>
+            <w:tcW w:type="dxa" w:w="465"/>
+          </w:tcPr>
+          <w:p>
+            <w:pPr>
+              <w:spacing w:after="0" w:line="240" w:lineRule="auto"/>
+            </w:pPr>
+            <w:r>
+              <w:rPr>
+                <w:rFonts w:ascii="Aptos" w:hAnsi="Aptos"/>
+                <w:b w:val="0"/>
+                <w:sz w:val="18"/>
+              </w:rPr>
+              <w:t>I4</w:t>
+            </w:r>
+          </w:p>
+        </w:tc>
+        <w:tc>
+          <w:tcPr>
+            <w:tcW w:type="dxa" w:w="1497"/>
           </w:tcPr>
           <w:p>
             <w:pPr>
@@ -2614,91 +2614,91 @@
         </w:tc>
         <w:tc>
           <w:tcPr>
-            <w:tcW w:type="dxa" w:w="1303"/>
-          </w:tcPr>
-          <w:p>
-            <w:pPr>
-              <w:spacing w:after="0" w:line="240" w:lineRule="auto"/>
-            </w:pPr>
-            <w:r>
-              <w:rPr>
-                <w:rFonts w:ascii="Aptos" w:hAnsi="Aptos"/>
-                <w:b w:val="0"/>
-                <w:sz w:val="18"/>
-              </w:rPr>
-              <w:t>Identity DB</w:t>
-            </w:r>
-          </w:p>
-        </w:tc>
-        <w:tc>
-          <w:tcPr>
-            <w:tcW w:type="dxa" w:w="3217"/>
-          </w:tcPr>
-          <w:p>
-            <w:pPr>
-              <w:spacing w:after="0" w:line="240" w:lineRule="auto"/>
-            </w:pPr>
-            <w:r>
-              <w:rPr>
-                <w:rFonts w:ascii="Aptos" w:hAnsi="Aptos"/>
-                <w:b w:val="0"/>
-                <w:sz w:val="18"/>
-              </w:rPr>
-              <w:t>Refresh tokens stored in plaintext</w:t>
-            </w:r>
-          </w:p>
-        </w:tc>
-        <w:tc>
-          <w:tcPr>
-            <w:tcW w:type="dxa" w:w="937"/>
-          </w:tcPr>
-          <w:p>
-            <w:pPr>
-              <w:spacing w:after="0" w:line="240" w:lineRule="auto"/>
-            </w:pPr>
-            <w:r>
-              <w:rPr>
-                <w:rFonts w:ascii="Aptos" w:hAnsi="Aptos"/>
-                <w:b w:val="0"/>
-                <w:sz w:val="18"/>
-              </w:rPr>
-              <w:t>Medium</w:t>
-            </w:r>
-          </w:p>
-        </w:tc>
-        <w:tc>
-          <w:tcPr>
-            <w:tcW w:type="dxa" w:w="4004"/>
-          </w:tcPr>
-          <w:p>
-            <w:pPr>
-              <w:spacing w:after="0" w:line="240" w:lineRule="auto"/>
-            </w:pPr>
-            <w:r>
-              <w:rPr>
-                <w:rFonts w:ascii="Aptos" w:hAnsi="Aptos"/>
-                <w:b w:val="0"/>
-                <w:sz w:val="18"/>
-              </w:rPr>
-              <w:t>Store SHA-256 hash, constant-time compare</w:t>
-            </w:r>
-          </w:p>
-        </w:tc>
-        <w:tc>
-          <w:tcPr>
-            <w:tcW w:type="dxa" w:w="1500"/>
-          </w:tcPr>
-          <w:p>
-            <w:pPr>
-              <w:spacing w:after="0" w:line="240" w:lineRule="auto"/>
-            </w:pPr>
-            <w:r>
-              <w:rPr>
-                <w:rFonts w:ascii="Aptos" w:hAnsi="Aptos"/>
-                <w:b w:val="0"/>
-                <w:sz w:val="18"/>
-              </w:rPr>
-              <w:t>Planned</w:t>
+            <w:tcW w:type="dxa" w:w="1273"/>
+          </w:tcPr>
+          <w:p>
+            <w:pPr>
+              <w:spacing w:after="0" w:line="240" w:lineRule="auto"/>
+            </w:pPr>
+            <w:r>
+              <w:rPr>
+                <w:rFonts w:ascii="Aptos" w:hAnsi="Aptos"/>
+                <w:b w:val="0"/>
+                <w:sz w:val="18"/>
+              </w:rPr>
+              <w:t>Repos</w:t>
+            </w:r>
+          </w:p>
+        </w:tc>
+        <w:tc>
+          <w:tcPr>
+            <w:tcW w:type="dxa" w:w="3551"/>
+          </w:tcPr>
+          <w:p>
+            <w:pPr>
+              <w:spacing w:after="0" w:line="240" w:lineRule="auto"/>
+            </w:pPr>
+            <w:r>
+              <w:rPr>
+                <w:rFonts w:ascii="Aptos" w:hAnsi="Aptos"/>
+                <w:b w:val="0"/>
+                <w:sz w:val="18"/>
+              </w:rPr>
+              <w:t>Secrets in git: seed passwords, RabbitMQ creds, old HS256 secret in history</w:t>
+            </w:r>
+          </w:p>
+        </w:tc>
+        <w:tc>
+          <w:tcPr>
+            <w:tcW w:type="dxa" w:w="920"/>
+          </w:tcPr>
+          <w:p>
+            <w:pPr>
+              <w:spacing w:after="0" w:line="240" w:lineRule="auto"/>
+            </w:pPr>
+            <w:r>
+              <w:rPr>
+                <w:rFonts w:ascii="Aptos" w:hAnsi="Aptos"/>
+                <w:b w:val="0"/>
+                <w:sz w:val="18"/>
+              </w:rPr>
+              <w:t>High</w:t>
+            </w:r>
+          </w:p>
+        </w:tc>
+        <w:tc>
+          <w:tcPr>
+            <w:tcW w:type="dxa" w:w="3778"/>
+          </w:tcPr>
+          <w:p>
+            <w:pPr>
+              <w:spacing w:after="0" w:line="240" w:lineRule="auto"/>
+            </w:pPr>
+            <w:r>
+              <w:rPr>
+                <w:rFonts w:ascii="Aptos" w:hAnsi="Aptos"/>
+                <w:b w:val="0"/>
+                <w:sz w:val="18"/>
+              </w:rPr>
+              <w:t>DB/broker/Redis/seed passwords moved to user-secrets (.env, git-ignored); HS256 secret in history but unused; all services share SQL sa login</w:t>
+            </w:r>
+          </w:p>
+        </w:tc>
+        <w:tc>
+          <w:tcPr>
+            <w:tcW w:type="dxa" w:w="1476"/>
+          </w:tcPr>
+          <w:p>
+            <w:pPr>
+              <w:spacing w:after="0" w:line="240" w:lineRule="auto"/>
+            </w:pPr>
+            <w:r>
+              <w:rPr>
+                <w:rFonts w:ascii="Aptos" w:hAnsi="Aptos"/>
+                <w:b w:val="0"/>
+                <w:sz w:val="18"/>
+              </w:rPr>
+              <w:t>Partial</w:t>
             </w:r>
           </w:p>
         </w:tc>
@@ -2706,25 +2706,25 @@
       <w:tr>
         <w:tc>
           <w:tcPr>
-            <w:tcW w:type="dxa" w:w="472"/>
-          </w:tcPr>
-          <w:p>
-            <w:pPr>
-              <w:spacing w:after="0" w:line="240" w:lineRule="auto"/>
-            </w:pPr>
-            <w:r>
-              <w:rPr>
-                <w:rFonts w:ascii="Aptos" w:hAnsi="Aptos"/>
-                <w:b w:val="0"/>
-                <w:sz w:val="18"/>
-              </w:rPr>
-              <w:t>I6</w:t>
-            </w:r>
-          </w:p>
-        </w:tc>
-        <w:tc>
-          <w:tcPr>
-            <w:tcW w:type="dxa" w:w="1528"/>
+            <w:tcW w:type="dxa" w:w="465"/>
+          </w:tcPr>
+          <w:p>
+            <w:pPr>
+              <w:spacing w:after="0" w:line="240" w:lineRule="auto"/>
+            </w:pPr>
+            <w:r>
+              <w:rPr>
+                <w:rFonts w:ascii="Aptos" w:hAnsi="Aptos"/>
+                <w:b w:val="0"/>
+                <w:sz w:val="18"/>
+              </w:rPr>
+              <w:t>I5</w:t>
+            </w:r>
+          </w:p>
+        </w:tc>
+        <w:tc>
+          <w:tcPr>
+            <w:tcW w:type="dxa" w:w="1497"/>
           </w:tcPr>
           <w:p>
             <w:pPr>
@@ -2742,79 +2742,79 @@
         </w:tc>
         <w:tc>
           <w:tcPr>
-            <w:tcW w:type="dxa" w:w="1303"/>
-          </w:tcPr>
-          <w:p>
-            <w:pPr>
-              <w:spacing w:after="0" w:line="240" w:lineRule="auto"/>
-            </w:pPr>
-            <w:r>
-              <w:rPr>
-                <w:rFonts w:ascii="Aptos" w:hAnsi="Aptos"/>
-                <w:b w:val="0"/>
-                <w:sz w:val="18"/>
-              </w:rPr>
-              <w:t>JWT</w:t>
-            </w:r>
-          </w:p>
-        </w:tc>
-        <w:tc>
-          <w:tcPr>
-            <w:tcW w:type="dxa" w:w="3217"/>
-          </w:tcPr>
-          <w:p>
-            <w:pPr>
-              <w:spacing w:after="0" w:line="240" w:lineRule="auto"/>
-            </w:pPr>
-            <w:r>
-              <w:rPr>
-                <w:rFonts w:ascii="Aptos" w:hAnsi="Aptos"/>
-                <w:b w:val="0"/>
-                <w:sz w:val="18"/>
-              </w:rPr>
-              <w:t>Email and phone in readable token payload</w:t>
-            </w:r>
-          </w:p>
-        </w:tc>
-        <w:tc>
-          <w:tcPr>
-            <w:tcW w:type="dxa" w:w="937"/>
-          </w:tcPr>
-          <w:p>
-            <w:pPr>
-              <w:spacing w:after="0" w:line="240" w:lineRule="auto"/>
-            </w:pPr>
-            <w:r>
-              <w:rPr>
-                <w:rFonts w:ascii="Aptos" w:hAnsi="Aptos"/>
-                <w:b w:val="0"/>
-                <w:sz w:val="18"/>
-              </w:rPr>
-              <w:t>Low</w:t>
-            </w:r>
-          </w:p>
-        </w:tc>
-        <w:tc>
-          <w:tcPr>
-            <w:tcW w:type="dxa" w:w="4004"/>
-          </w:tcPr>
-          <w:p>
-            <w:pPr>
-              <w:spacing w:after="0" w:line="240" w:lineRule="auto"/>
-            </w:pPr>
-            <w:r>
-              <w:rPr>
-                <w:rFonts w:ascii="Aptos" w:hAnsi="Aptos"/>
-                <w:b w:val="0"/>
-                <w:sz w:val="18"/>
-              </w:rPr>
-              <w:t>Keep only id and permissions</w:t>
-            </w:r>
-          </w:p>
-        </w:tc>
-        <w:tc>
-          <w:tcPr>
-            <w:tcW w:type="dxa" w:w="1500"/>
+            <w:tcW w:type="dxa" w:w="1273"/>
+          </w:tcPr>
+          <w:p>
+            <w:pPr>
+              <w:spacing w:after="0" w:line="240" w:lineRule="auto"/>
+            </w:pPr>
+            <w:r>
+              <w:rPr>
+                <w:rFonts w:ascii="Aptos" w:hAnsi="Aptos"/>
+                <w:b w:val="0"/>
+                <w:sz w:val="18"/>
+              </w:rPr>
+              <w:t>Identity DB</w:t>
+            </w:r>
+          </w:p>
+        </w:tc>
+        <w:tc>
+          <w:tcPr>
+            <w:tcW w:type="dxa" w:w="3551"/>
+          </w:tcPr>
+          <w:p>
+            <w:pPr>
+              <w:spacing w:after="0" w:line="240" w:lineRule="auto"/>
+            </w:pPr>
+            <w:r>
+              <w:rPr>
+                <w:rFonts w:ascii="Aptos" w:hAnsi="Aptos"/>
+                <w:b w:val="0"/>
+                <w:sz w:val="18"/>
+              </w:rPr>
+              <w:t>Refresh tokens stored in plaintext</w:t>
+            </w:r>
+          </w:p>
+        </w:tc>
+        <w:tc>
+          <w:tcPr>
+            <w:tcW w:type="dxa" w:w="920"/>
+          </w:tcPr>
+          <w:p>
+            <w:pPr>
+              <w:spacing w:after="0" w:line="240" w:lineRule="auto"/>
+            </w:pPr>
+            <w:r>
+              <w:rPr>
+                <w:rFonts w:ascii="Aptos" w:hAnsi="Aptos"/>
+                <w:b w:val="0"/>
+                <w:sz w:val="18"/>
+              </w:rPr>
+              <w:t>Medium</w:t>
+            </w:r>
+          </w:p>
+        </w:tc>
+        <w:tc>
+          <w:tcPr>
+            <w:tcW w:type="dxa" w:w="3778"/>
+          </w:tcPr>
+          <w:p>
+            <w:pPr>
+              <w:spacing w:after="0" w:line="240" w:lineRule="auto"/>
+            </w:pPr>
+            <w:r>
+              <w:rPr>
+                <w:rFonts w:ascii="Aptos" w:hAnsi="Aptos"/>
+                <w:b w:val="0"/>
+                <w:sz w:val="18"/>
+              </w:rPr>
+              <w:t>Store SHA-256 hash, constant-time compare</w:t>
+            </w:r>
+          </w:p>
+        </w:tc>
+        <w:tc>
+          <w:tcPr>
+            <w:tcW w:type="dxa" w:w="1476"/>
           </w:tcPr>
           <w:p>
             <w:pPr>
@@ -2834,25 +2834,25 @@
       <w:tr>
         <w:tc>
           <w:tcPr>
-            <w:tcW w:type="dxa" w:w="472"/>
-          </w:tcPr>
-          <w:p>
-            <w:pPr>
-              <w:spacing w:after="0" w:line="240" w:lineRule="auto"/>
-            </w:pPr>
-            <w:r>
-              <w:rPr>
-                <w:rFonts w:ascii="Aptos" w:hAnsi="Aptos"/>
-                <w:b w:val="0"/>
-                <w:sz w:val="18"/>
-              </w:rPr>
-              <w:t>I7</w:t>
-            </w:r>
-          </w:p>
-        </w:tc>
-        <w:tc>
-          <w:tcPr>
-            <w:tcW w:type="dxa" w:w="1528"/>
+            <w:tcW w:type="dxa" w:w="465"/>
+          </w:tcPr>
+          <w:p>
+            <w:pPr>
+              <w:spacing w:after="0" w:line="240" w:lineRule="auto"/>
+            </w:pPr>
+            <w:r>
+              <w:rPr>
+                <w:rFonts w:ascii="Aptos" w:hAnsi="Aptos"/>
+                <w:b w:val="0"/>
+                <w:sz w:val="18"/>
+              </w:rPr>
+              <w:t>I6</w:t>
+            </w:r>
+          </w:p>
+        </w:tc>
+        <w:tc>
+          <w:tcPr>
+            <w:tcW w:type="dxa" w:w="1497"/>
           </w:tcPr>
           <w:p>
             <w:pPr>
@@ -2870,91 +2870,91 @@
         </w:tc>
         <w:tc>
           <w:tcPr>
-            <w:tcW w:type="dxa" w:w="1303"/>
-          </w:tcPr>
-          <w:p>
-            <w:pPr>
-              <w:spacing w:after="0" w:line="240" w:lineRule="auto"/>
-            </w:pPr>
-            <w:r>
-              <w:rPr>
-                <w:rFonts w:ascii="Aptos" w:hAnsi="Aptos"/>
-                <w:b w:val="0"/>
-                <w:sz w:val="18"/>
-              </w:rPr>
-              <w:t>TB4</w:t>
-            </w:r>
-          </w:p>
-        </w:tc>
-        <w:tc>
-          <w:tcPr>
-            <w:tcW w:type="dxa" w:w="3217"/>
-          </w:tcPr>
-          <w:p>
-            <w:pPr>
-              <w:spacing w:after="0" w:line="240" w:lineRule="auto"/>
-            </w:pPr>
-            <w:r>
-              <w:rPr>
-                <w:rFonts w:ascii="Aptos" w:hAnsi="Aptos"/>
-                <w:b w:val="0"/>
-                <w:sz w:val="18"/>
-              </w:rPr>
-              <w:t>SQL traffic unencrypted</w:t>
-            </w:r>
-          </w:p>
-        </w:tc>
-        <w:tc>
-          <w:tcPr>
-            <w:tcW w:type="dxa" w:w="937"/>
-          </w:tcPr>
-          <w:p>
-            <w:pPr>
-              <w:spacing w:after="0" w:line="240" w:lineRule="auto"/>
-            </w:pPr>
-            <w:r>
-              <w:rPr>
-                <w:rFonts w:ascii="Aptos" w:hAnsi="Aptos"/>
-                <w:b w:val="0"/>
-                <w:sz w:val="18"/>
-              </w:rPr>
-              <w:t>Medium</w:t>
-            </w:r>
-          </w:p>
-        </w:tc>
-        <w:tc>
-          <w:tcPr>
-            <w:tcW w:type="dxa" w:w="4004"/>
-          </w:tcPr>
-          <w:p>
-            <w:pPr>
-              <w:spacing w:after="0" w:line="240" w:lineRule="auto"/>
-            </w:pPr>
-            <w:r>
-              <w:rPr>
-                <w:rFonts w:ascii="Aptos" w:hAnsi="Aptos"/>
-                <w:b w:val="0"/>
-                <w:sz w:val="18"/>
-              </w:rPr>
-              <w:t>Encrypt=True (done); trusted server cert instead of TrustServerCertificate=True (planned)</w:t>
-            </w:r>
-          </w:p>
-        </w:tc>
-        <w:tc>
-          <w:tcPr>
-            <w:tcW w:type="dxa" w:w="1500"/>
-          </w:tcPr>
-          <w:p>
-            <w:pPr>
-              <w:spacing w:after="0" w:line="240" w:lineRule="auto"/>
-            </w:pPr>
-            <w:r>
-              <w:rPr>
-                <w:rFonts w:ascii="Aptos" w:hAnsi="Aptos"/>
-                <w:b w:val="0"/>
-                <w:sz w:val="18"/>
-              </w:rPr>
-              <w:t>Partial</w:t>
+            <w:tcW w:type="dxa" w:w="1273"/>
+          </w:tcPr>
+          <w:p>
+            <w:pPr>
+              <w:spacing w:after="0" w:line="240" w:lineRule="auto"/>
+            </w:pPr>
+            <w:r>
+              <w:rPr>
+                <w:rFonts w:ascii="Aptos" w:hAnsi="Aptos"/>
+                <w:b w:val="0"/>
+                <w:sz w:val="18"/>
+              </w:rPr>
+              <w:t>JWT</w:t>
+            </w:r>
+          </w:p>
+        </w:tc>
+        <w:tc>
+          <w:tcPr>
+            <w:tcW w:type="dxa" w:w="3551"/>
+          </w:tcPr>
+          <w:p>
+            <w:pPr>
+              <w:spacing w:after="0" w:line="240" w:lineRule="auto"/>
+            </w:pPr>
+            <w:r>
+              <w:rPr>
+                <w:rFonts w:ascii="Aptos" w:hAnsi="Aptos"/>
+                <w:b w:val="0"/>
+                <w:sz w:val="18"/>
+              </w:rPr>
+              <w:t>Email and phone in readable token payload</w:t>
+            </w:r>
+          </w:p>
+        </w:tc>
+        <w:tc>
+          <w:tcPr>
+            <w:tcW w:type="dxa" w:w="920"/>
+          </w:tcPr>
+          <w:p>
+            <w:pPr>
+              <w:spacing w:after="0" w:line="240" w:lineRule="auto"/>
+            </w:pPr>
+            <w:r>
+              <w:rPr>
+                <w:rFonts w:ascii="Aptos" w:hAnsi="Aptos"/>
+                <w:b w:val="0"/>
+                <w:sz w:val="18"/>
+              </w:rPr>
+              <w:t>Low</w:t>
+            </w:r>
+          </w:p>
+        </w:tc>
+        <w:tc>
+          <w:tcPr>
+            <w:tcW w:type="dxa" w:w="3778"/>
+          </w:tcPr>
+          <w:p>
+            <w:pPr>
+              <w:spacing w:after="0" w:line="240" w:lineRule="auto"/>
+            </w:pPr>
+            <w:r>
+              <w:rPr>
+                <w:rFonts w:ascii="Aptos" w:hAnsi="Aptos"/>
+                <w:b w:val="0"/>
+                <w:sz w:val="18"/>
+              </w:rPr>
+              <w:t>Keep only id and permissions</w:t>
+            </w:r>
+          </w:p>
+        </w:tc>
+        <w:tc>
+          <w:tcPr>
+            <w:tcW w:type="dxa" w:w="1476"/>
+          </w:tcPr>
+          <w:p>
+            <w:pPr>
+              <w:spacing w:after="0" w:line="240" w:lineRule="auto"/>
+            </w:pPr>
+            <w:r>
+              <w:rPr>
+                <w:rFonts w:ascii="Aptos" w:hAnsi="Aptos"/>
+                <w:b w:val="0"/>
+                <w:sz w:val="18"/>
+              </w:rPr>
+              <w:t>Planned</w:t>
             </w:r>
           </w:p>
         </w:tc>
@@ -2962,127 +2962,127 @@
       <w:tr>
         <w:tc>
           <w:tcPr>
-            <w:tcW w:type="dxa" w:w="472"/>
-          </w:tcPr>
-          <w:p>
-            <w:pPr>
-              <w:spacing w:after="0" w:line="240" w:lineRule="auto"/>
-            </w:pPr>
-            <w:r>
-              <w:rPr>
-                <w:rFonts w:ascii="Aptos" w:hAnsi="Aptos"/>
-                <w:b w:val="0"/>
-                <w:sz w:val="18"/>
-              </w:rPr>
-              <w:t>D1</w:t>
-            </w:r>
-          </w:p>
-        </w:tc>
-        <w:tc>
-          <w:tcPr>
-            <w:tcW w:type="dxa" w:w="1528"/>
-          </w:tcPr>
-          <w:p>
-            <w:pPr>
-              <w:spacing w:after="0" w:line="240" w:lineRule="auto"/>
-            </w:pPr>
-            <w:r>
-              <w:rPr>
-                <w:rFonts w:ascii="Aptos" w:hAnsi="Aptos"/>
-                <w:b w:val="0"/>
-                <w:sz w:val="18"/>
-              </w:rPr>
-              <w:t>DoS</w:t>
-            </w:r>
-          </w:p>
-        </w:tc>
-        <w:tc>
-          <w:tcPr>
-            <w:tcW w:type="dxa" w:w="1303"/>
-          </w:tcPr>
-          <w:p>
-            <w:pPr>
-              <w:spacing w:after="0" w:line="240" w:lineRule="auto"/>
-            </w:pPr>
-            <w:r>
-              <w:rPr>
-                <w:rFonts w:ascii="Aptos" w:hAnsi="Aptos"/>
-                <w:b w:val="0"/>
-                <w:sz w:val="18"/>
-              </w:rPr>
-              <w:t>Inventory</w:t>
-            </w:r>
-          </w:p>
-        </w:tc>
-        <w:tc>
-          <w:tcPr>
-            <w:tcW w:type="dxa" w:w="3217"/>
-          </w:tcPr>
-          <w:p>
-            <w:pPr>
-              <w:spacing w:after="0" w:line="240" w:lineRule="auto"/>
-            </w:pPr>
-            <w:r>
-              <w:rPr>
-                <w:rFonts w:ascii="Aptos" w:hAnsi="Aptos"/>
-                <w:b w:val="0"/>
-                <w:sz w:val="18"/>
-              </w:rPr>
-              <w:t>ProductCreated.Quantity unbounded; consumer creates one row per unit</w:t>
-            </w:r>
-          </w:p>
-        </w:tc>
-        <w:tc>
-          <w:tcPr>
-            <w:tcW w:type="dxa" w:w="937"/>
-          </w:tcPr>
-          <w:p>
-            <w:pPr>
-              <w:spacing w:after="0" w:line="240" w:lineRule="auto"/>
-            </w:pPr>
-            <w:r>
-              <w:rPr>
-                <w:rFonts w:ascii="Aptos" w:hAnsi="Aptos"/>
-                <w:b w:val="0"/>
-                <w:sz w:val="18"/>
-              </w:rPr>
-              <w:t>High</w:t>
-            </w:r>
-          </w:p>
-        </w:tc>
-        <w:tc>
-          <w:tcPr>
-            <w:tcW w:type="dxa" w:w="4004"/>
-          </w:tcPr>
-          <w:p>
-            <w:pPr>
-              <w:spacing w:after="0" w:line="240" w:lineRule="auto"/>
-            </w:pPr>
-            <w:r>
-              <w:rPr>
-                <w:rFonts w:ascii="Aptos" w:hAnsi="Aptos"/>
-                <w:b w:val="0"/>
-                <w:sz w:val="18"/>
-              </w:rPr>
-              <w:t>Quantity 1..1000 in Product validators and again in the Inventory consumer</w:t>
-            </w:r>
-          </w:p>
-        </w:tc>
-        <w:tc>
-          <w:tcPr>
-            <w:tcW w:type="dxa" w:w="1500"/>
-          </w:tcPr>
-          <w:p>
-            <w:pPr>
-              <w:spacing w:after="0" w:line="240" w:lineRule="auto"/>
-            </w:pPr>
-            <w:r>
-              <w:rPr>
-                <w:rFonts w:ascii="Aptos" w:hAnsi="Aptos"/>
-                <w:b w:val="0"/>
-                <w:sz w:val="18"/>
-              </w:rPr>
-              <w:t>Done</w:t>
+            <w:tcW w:type="dxa" w:w="465"/>
+          </w:tcPr>
+          <w:p>
+            <w:pPr>
+              <w:spacing w:after="0" w:line="240" w:lineRule="auto"/>
+            </w:pPr>
+            <w:r>
+              <w:rPr>
+                <w:rFonts w:ascii="Aptos" w:hAnsi="Aptos"/>
+                <w:b w:val="0"/>
+                <w:sz w:val="18"/>
+              </w:rPr>
+              <w:t>I7</w:t>
+            </w:r>
+          </w:p>
+        </w:tc>
+        <w:tc>
+          <w:tcPr>
+            <w:tcW w:type="dxa" w:w="1497"/>
+          </w:tcPr>
+          <w:p>
+            <w:pPr>
+              <w:spacing w:after="0" w:line="240" w:lineRule="auto"/>
+            </w:pPr>
+            <w:r>
+              <w:rPr>
+                <w:rFonts w:ascii="Aptos" w:hAnsi="Aptos"/>
+                <w:b w:val="0"/>
+                <w:sz w:val="18"/>
+              </w:rPr>
+              <w:t>Info disclosure</w:t>
+            </w:r>
+          </w:p>
+        </w:tc>
+        <w:tc>
+          <w:tcPr>
+            <w:tcW w:type="dxa" w:w="1273"/>
+          </w:tcPr>
+          <w:p>
+            <w:pPr>
+              <w:spacing w:after="0" w:line="240" w:lineRule="auto"/>
+            </w:pPr>
+            <w:r>
+              <w:rPr>
+                <w:rFonts w:ascii="Aptos" w:hAnsi="Aptos"/>
+                <w:b w:val="0"/>
+                <w:sz w:val="18"/>
+              </w:rPr>
+              <w:t>TB4</w:t>
+            </w:r>
+          </w:p>
+        </w:tc>
+        <w:tc>
+          <w:tcPr>
+            <w:tcW w:type="dxa" w:w="3551"/>
+          </w:tcPr>
+          <w:p>
+            <w:pPr>
+              <w:spacing w:after="0" w:line="240" w:lineRule="auto"/>
+            </w:pPr>
+            <w:r>
+              <w:rPr>
+                <w:rFonts w:ascii="Aptos" w:hAnsi="Aptos"/>
+                <w:b w:val="0"/>
+                <w:sz w:val="18"/>
+              </w:rPr>
+              <w:t>SQL traffic unencrypted</w:t>
+            </w:r>
+          </w:p>
+        </w:tc>
+        <w:tc>
+          <w:tcPr>
+            <w:tcW w:type="dxa" w:w="920"/>
+          </w:tcPr>
+          <w:p>
+            <w:pPr>
+              <w:spacing w:after="0" w:line="240" w:lineRule="auto"/>
+            </w:pPr>
+            <w:r>
+              <w:rPr>
+                <w:rFonts w:ascii="Aptos" w:hAnsi="Aptos"/>
+                <w:b w:val="0"/>
+                <w:sz w:val="18"/>
+              </w:rPr>
+              <w:t>Medium</w:t>
+            </w:r>
+          </w:p>
+        </w:tc>
+        <w:tc>
+          <w:tcPr>
+            <w:tcW w:type="dxa" w:w="3778"/>
+          </w:tcPr>
+          <w:p>
+            <w:pPr>
+              <w:spacing w:after="0" w:line="240" w:lineRule="auto"/>
+            </w:pPr>
+            <w:r>
+              <w:rPr>
+                <w:rFonts w:ascii="Aptos" w:hAnsi="Aptos"/>
+                <w:b w:val="0"/>
+                <w:sz w:val="18"/>
+              </w:rPr>
+              <w:t>Encrypt=True (done); trusted server cert instead of TrustServerCertificate=True (planned)</w:t>
+            </w:r>
+          </w:p>
+        </w:tc>
+        <w:tc>
+          <w:tcPr>
+            <w:tcW w:type="dxa" w:w="1476"/>
+          </w:tcPr>
+          <w:p>
+            <w:pPr>
+              <w:spacing w:after="0" w:line="240" w:lineRule="auto"/>
+            </w:pPr>
+            <w:r>
+              <w:rPr>
+                <w:rFonts w:ascii="Aptos" w:hAnsi="Aptos"/>
+                <w:b w:val="0"/>
+                <w:sz w:val="18"/>
+              </w:rPr>
+              <w:t>Partial</w:t>
             </w:r>
           </w:p>
         </w:tc>
@@ -3090,25 +3090,25 @@
       <w:tr>
         <w:tc>
           <w:tcPr>
-            <w:tcW w:type="dxa" w:w="472"/>
-          </w:tcPr>
-          <w:p>
-            <w:pPr>
-              <w:spacing w:after="0" w:line="240" w:lineRule="auto"/>
-            </w:pPr>
-            <w:r>
-              <w:rPr>
-                <w:rFonts w:ascii="Aptos" w:hAnsi="Aptos"/>
-                <w:b w:val="0"/>
-                <w:sz w:val="18"/>
-              </w:rPr>
-              <w:t>D2</w:t>
-            </w:r>
-          </w:p>
-        </w:tc>
-        <w:tc>
-          <w:tcPr>
-            <w:tcW w:type="dxa" w:w="1528"/>
+            <w:tcW w:type="dxa" w:w="465"/>
+          </w:tcPr>
+          <w:p>
+            <w:pPr>
+              <w:spacing w:after="0" w:line="240" w:lineRule="auto"/>
+            </w:pPr>
+            <w:r>
+              <w:rPr>
+                <w:rFonts w:ascii="Aptos" w:hAnsi="Aptos"/>
+                <w:b w:val="0"/>
+                <w:sz w:val="18"/>
+              </w:rPr>
+              <w:t>D1</w:t>
+            </w:r>
+          </w:p>
+        </w:tc>
+        <w:tc>
+          <w:tcPr>
+            <w:tcW w:type="dxa" w:w="1497"/>
           </w:tcPr>
           <w:p>
             <w:pPr>
@@ -3126,91 +3126,91 @@
         </w:tc>
         <w:tc>
           <w:tcPr>
-            <w:tcW w:type="dxa" w:w="1303"/>
-          </w:tcPr>
-          <w:p>
-            <w:pPr>
-              <w:spacing w:after="0" w:line="240" w:lineRule="auto"/>
-            </w:pPr>
-            <w:r>
-              <w:rPr>
-                <w:rFonts w:ascii="Aptos" w:hAnsi="Aptos"/>
-                <w:b w:val="0"/>
-                <w:sz w:val="18"/>
-              </w:rPr>
-              <w:t>Gateway</w:t>
-            </w:r>
-          </w:p>
-        </w:tc>
-        <w:tc>
-          <w:tcPr>
-            <w:tcW w:type="dxa" w:w="3217"/>
-          </w:tcPr>
-          <w:p>
-            <w:pPr>
-              <w:spacing w:after="0" w:line="240" w:lineRule="auto"/>
-            </w:pPr>
-            <w:r>
-              <w:rPr>
-                <w:rFonts w:ascii="Aptos" w:hAnsi="Aptos"/>
-                <w:b w:val="0"/>
-                <w:sz w:val="18"/>
-              </w:rPr>
-              <w:t>No request rate limiting</w:t>
-            </w:r>
-          </w:p>
-        </w:tc>
-        <w:tc>
-          <w:tcPr>
-            <w:tcW w:type="dxa" w:w="937"/>
-          </w:tcPr>
-          <w:p>
-            <w:pPr>
-              <w:spacing w:after="0" w:line="240" w:lineRule="auto"/>
-            </w:pPr>
-            <w:r>
-              <w:rPr>
-                <w:rFonts w:ascii="Aptos" w:hAnsi="Aptos"/>
-                <w:b w:val="0"/>
-                <w:sz w:val="18"/>
-              </w:rPr>
-              <w:t>Medium</w:t>
-            </w:r>
-          </w:p>
-        </w:tc>
-        <w:tc>
-          <w:tcPr>
-            <w:tcW w:type="dxa" w:w="4004"/>
-          </w:tcPr>
-          <w:p>
-            <w:pPr>
-              <w:spacing w:after="0" w:line="240" w:lineRule="auto"/>
-            </w:pPr>
-            <w:r>
-              <w:rPr>
-                <w:rFonts w:ascii="Aptos" w:hAnsi="Aptos"/>
-                <w:b w:val="0"/>
-                <w:sz w:val="18"/>
-              </w:rPr>
-              <w:t>Per-IP limit on /auth/* (done); other routes (planned)</w:t>
-            </w:r>
-          </w:p>
-        </w:tc>
-        <w:tc>
-          <w:tcPr>
-            <w:tcW w:type="dxa" w:w="1500"/>
-          </w:tcPr>
-          <w:p>
-            <w:pPr>
-              <w:spacing w:after="0" w:line="240" w:lineRule="auto"/>
-            </w:pPr>
-            <w:r>
-              <w:rPr>
-                <w:rFonts w:ascii="Aptos" w:hAnsi="Aptos"/>
-                <w:b w:val="0"/>
-                <w:sz w:val="18"/>
-              </w:rPr>
-              <w:t>Partial</w:t>
+            <w:tcW w:type="dxa" w:w="1273"/>
+          </w:tcPr>
+          <w:p>
+            <w:pPr>
+              <w:spacing w:after="0" w:line="240" w:lineRule="auto"/>
+            </w:pPr>
+            <w:r>
+              <w:rPr>
+                <w:rFonts w:ascii="Aptos" w:hAnsi="Aptos"/>
+                <w:b w:val="0"/>
+                <w:sz w:val="18"/>
+              </w:rPr>
+              <w:t>Inventory</w:t>
+            </w:r>
+          </w:p>
+        </w:tc>
+        <w:tc>
+          <w:tcPr>
+            <w:tcW w:type="dxa" w:w="3551"/>
+          </w:tcPr>
+          <w:p>
+            <w:pPr>
+              <w:spacing w:after="0" w:line="240" w:lineRule="auto"/>
+            </w:pPr>
+            <w:r>
+              <w:rPr>
+                <w:rFonts w:ascii="Aptos" w:hAnsi="Aptos"/>
+                <w:b w:val="0"/>
+                <w:sz w:val="18"/>
+              </w:rPr>
+              <w:t>ProductCreated.Quantity unbounded; consumer creates one row per unit</w:t>
+            </w:r>
+          </w:p>
+        </w:tc>
+        <w:tc>
+          <w:tcPr>
+            <w:tcW w:type="dxa" w:w="920"/>
+          </w:tcPr>
+          <w:p>
+            <w:pPr>
+              <w:spacing w:after="0" w:line="240" w:lineRule="auto"/>
+            </w:pPr>
+            <w:r>
+              <w:rPr>
+                <w:rFonts w:ascii="Aptos" w:hAnsi="Aptos"/>
+                <w:b w:val="0"/>
+                <w:sz w:val="18"/>
+              </w:rPr>
+              <w:t>High</w:t>
+            </w:r>
+          </w:p>
+        </w:tc>
+        <w:tc>
+          <w:tcPr>
+            <w:tcW w:type="dxa" w:w="3778"/>
+          </w:tcPr>
+          <w:p>
+            <w:pPr>
+              <w:spacing w:after="0" w:line="240" w:lineRule="auto"/>
+            </w:pPr>
+            <w:r>
+              <w:rPr>
+                <w:rFonts w:ascii="Aptos" w:hAnsi="Aptos"/>
+                <w:b w:val="0"/>
+                <w:sz w:val="18"/>
+              </w:rPr>
+              <w:t>Quantity 1..1000 in Product validators and again in the Inventory consumer</w:t>
+            </w:r>
+          </w:p>
+        </w:tc>
+        <w:tc>
+          <w:tcPr>
+            <w:tcW w:type="dxa" w:w="1476"/>
+          </w:tcPr>
+          <w:p>
+            <w:pPr>
+              <w:spacing w:after="0" w:line="240" w:lineRule="auto"/>
+            </w:pPr>
+            <w:r>
+              <w:rPr>
+                <w:rFonts w:ascii="Aptos" w:hAnsi="Aptos"/>
+                <w:b w:val="0"/>
+                <w:sz w:val="18"/>
+              </w:rPr>
+              <w:t>Done</w:t>
             </w:r>
           </w:p>
         </w:tc>
@@ -3218,25 +3218,25 @@
       <w:tr>
         <w:tc>
           <w:tcPr>
-            <w:tcW w:type="dxa" w:w="472"/>
-          </w:tcPr>
-          <w:p>
-            <w:pPr>
-              <w:spacing w:after="0" w:line="240" w:lineRule="auto"/>
-            </w:pPr>
-            <w:r>
-              <w:rPr>
-                <w:rFonts w:ascii="Aptos" w:hAnsi="Aptos"/>
-                <w:b w:val="0"/>
-                <w:sz w:val="18"/>
-              </w:rPr>
-              <w:t>D3</w:t>
-            </w:r>
-          </w:p>
-        </w:tc>
-        <w:tc>
-          <w:tcPr>
-            <w:tcW w:type="dxa" w:w="1528"/>
+            <w:tcW w:type="dxa" w:w="465"/>
+          </w:tcPr>
+          <w:p>
+            <w:pPr>
+              <w:spacing w:after="0" w:line="240" w:lineRule="auto"/>
+            </w:pPr>
+            <w:r>
+              <w:rPr>
+                <w:rFonts w:ascii="Aptos" w:hAnsi="Aptos"/>
+                <w:b w:val="0"/>
+                <w:sz w:val="18"/>
+              </w:rPr>
+              <w:t>D2</w:t>
+            </w:r>
+          </w:p>
+        </w:tc>
+        <w:tc>
+          <w:tcPr>
+            <w:tcW w:type="dxa" w:w="1497"/>
           </w:tcPr>
           <w:p>
             <w:pPr>
@@ -3254,91 +3254,91 @@
         </w:tc>
         <w:tc>
           <w:tcPr>
-            <w:tcW w:type="dxa" w:w="1303"/>
-          </w:tcPr>
-          <w:p>
-            <w:pPr>
-              <w:spacing w:after="0" w:line="240" w:lineRule="auto"/>
-            </w:pPr>
-            <w:r>
-              <w:rPr>
-                <w:rFonts w:ascii="Aptos" w:hAnsi="Aptos"/>
-                <w:b w:val="0"/>
-                <w:sz w:val="18"/>
-              </w:rPr>
-              <w:t>All</w:t>
-            </w:r>
-          </w:p>
-        </w:tc>
-        <w:tc>
-          <w:tcPr>
-            <w:tcW w:type="dxa" w:w="3217"/>
-          </w:tcPr>
-          <w:p>
-            <w:pPr>
-              <w:spacing w:after="0" w:line="240" w:lineRule="auto"/>
-            </w:pPr>
-            <w:r>
-              <w:rPr>
-                <w:rFonts w:ascii="Aptos" w:hAnsi="Aptos"/>
-                <w:b w:val="0"/>
-                <w:sz w:val="18"/>
-              </w:rPr>
-              <w:t>Oversized bodies (Kestrel default ~28 MB)</w:t>
-            </w:r>
-          </w:p>
-        </w:tc>
-        <w:tc>
-          <w:tcPr>
-            <w:tcW w:type="dxa" w:w="937"/>
-          </w:tcPr>
-          <w:p>
-            <w:pPr>
-              <w:spacing w:after="0" w:line="240" w:lineRule="auto"/>
-            </w:pPr>
-            <w:r>
-              <w:rPr>
-                <w:rFonts w:ascii="Aptos" w:hAnsi="Aptos"/>
-                <w:b w:val="0"/>
-                <w:sz w:val="18"/>
-              </w:rPr>
-              <w:t>Low</w:t>
-            </w:r>
-          </w:p>
-        </w:tc>
-        <w:tc>
-          <w:tcPr>
-            <w:tcW w:type="dxa" w:w="4004"/>
-          </w:tcPr>
-          <w:p>
-            <w:pPr>
-              <w:spacing w:after="0" w:line="240" w:lineRule="auto"/>
-            </w:pPr>
-            <w:r>
-              <w:rPr>
-                <w:rFonts w:ascii="Aptos" w:hAnsi="Aptos"/>
-                <w:b w:val="0"/>
-                <w:sz w:val="18"/>
-              </w:rPr>
-              <w:t>Lower MaxRequestBodySize</w:t>
-            </w:r>
-          </w:p>
-        </w:tc>
-        <w:tc>
-          <w:tcPr>
-            <w:tcW w:type="dxa" w:w="1500"/>
-          </w:tcPr>
-          <w:p>
-            <w:pPr>
-              <w:spacing w:after="0" w:line="240" w:lineRule="auto"/>
-            </w:pPr>
-            <w:r>
-              <w:rPr>
-                <w:rFonts w:ascii="Aptos" w:hAnsi="Aptos"/>
-                <w:b w:val="0"/>
-                <w:sz w:val="18"/>
-              </w:rPr>
-              <w:t>Planned</w:t>
+            <w:tcW w:type="dxa" w:w="1273"/>
+          </w:tcPr>
+          <w:p>
+            <w:pPr>
+              <w:spacing w:after="0" w:line="240" w:lineRule="auto"/>
+            </w:pPr>
+            <w:r>
+              <w:rPr>
+                <w:rFonts w:ascii="Aptos" w:hAnsi="Aptos"/>
+                <w:b w:val="0"/>
+                <w:sz w:val="18"/>
+              </w:rPr>
+              <w:t>Gateway</w:t>
+            </w:r>
+          </w:p>
+        </w:tc>
+        <w:tc>
+          <w:tcPr>
+            <w:tcW w:type="dxa" w:w="3551"/>
+          </w:tcPr>
+          <w:p>
+            <w:pPr>
+              <w:spacing w:after="0" w:line="240" w:lineRule="auto"/>
+            </w:pPr>
+            <w:r>
+              <w:rPr>
+                <w:rFonts w:ascii="Aptos" w:hAnsi="Aptos"/>
+                <w:b w:val="0"/>
+                <w:sz w:val="18"/>
+              </w:rPr>
+              <w:t>No request rate limiting</w:t>
+            </w:r>
+          </w:p>
+        </w:tc>
+        <w:tc>
+          <w:tcPr>
+            <w:tcW w:type="dxa" w:w="920"/>
+          </w:tcPr>
+          <w:p>
+            <w:pPr>
+              <w:spacing w:after="0" w:line="240" w:lineRule="auto"/>
+            </w:pPr>
+            <w:r>
+              <w:rPr>
+                <w:rFonts w:ascii="Aptos" w:hAnsi="Aptos"/>
+                <w:b w:val="0"/>
+                <w:sz w:val="18"/>
+              </w:rPr>
+              <w:t>Medium</w:t>
+            </w:r>
+          </w:p>
+        </w:tc>
+        <w:tc>
+          <w:tcPr>
+            <w:tcW w:type="dxa" w:w="3778"/>
+          </w:tcPr>
+          <w:p>
+            <w:pPr>
+              <w:spacing w:after="0" w:line="240" w:lineRule="auto"/>
+            </w:pPr>
+            <w:r>
+              <w:rPr>
+                <w:rFonts w:ascii="Aptos" w:hAnsi="Aptos"/>
+                <w:b w:val="0"/>
+                <w:sz w:val="18"/>
+              </w:rPr>
+              <w:t>Per-IP limit on /auth/* (done); other routes (planned)</w:t>
+            </w:r>
+          </w:p>
+        </w:tc>
+        <w:tc>
+          <w:tcPr>
+            <w:tcW w:type="dxa" w:w="1476"/>
+          </w:tcPr>
+          <w:p>
+            <w:pPr>
+              <w:spacing w:after="0" w:line="240" w:lineRule="auto"/>
+            </w:pPr>
+            <w:r>
+              <w:rPr>
+                <w:rFonts w:ascii="Aptos" w:hAnsi="Aptos"/>
+                <w:b w:val="0"/>
+                <w:sz w:val="18"/>
+              </w:rPr>
+              <w:t>Partial</w:t>
             </w:r>
           </w:p>
         </w:tc>
@@ -3346,127 +3346,127 @@
       <w:tr>
         <w:tc>
           <w:tcPr>
-            <w:tcW w:type="dxa" w:w="472"/>
-          </w:tcPr>
-          <w:p>
-            <w:pPr>
-              <w:spacing w:after="0" w:line="240" w:lineRule="auto"/>
-            </w:pPr>
-            <w:r>
-              <w:rPr>
-                <w:rFonts w:ascii="Aptos" w:hAnsi="Aptos"/>
-                <w:b w:val="0"/>
-                <w:sz w:val="18"/>
-              </w:rPr>
-              <w:t>E1</w:t>
-            </w:r>
-          </w:p>
-        </w:tc>
-        <w:tc>
-          <w:tcPr>
-            <w:tcW w:type="dxa" w:w="1528"/>
-          </w:tcPr>
-          <w:p>
-            <w:pPr>
-              <w:spacing w:after="0" w:line="240" w:lineRule="auto"/>
-            </w:pPr>
-            <w:r>
-              <w:rPr>
-                <w:rFonts w:ascii="Aptos" w:hAnsi="Aptos"/>
-                <w:b w:val="0"/>
-                <w:sz w:val="18"/>
-              </w:rPr>
-              <w:t>EoP</w:t>
-            </w:r>
-          </w:p>
-        </w:tc>
-        <w:tc>
-          <w:tcPr>
-            <w:tcW w:type="dxa" w:w="1303"/>
-          </w:tcPr>
-          <w:p>
-            <w:pPr>
-              <w:spacing w:after="0" w:line="240" w:lineRule="auto"/>
-            </w:pPr>
-            <w:r>
-              <w:rPr>
-                <w:rFonts w:ascii="Aptos" w:hAnsi="Aptos"/>
-                <w:b w:val="0"/>
-                <w:sz w:val="18"/>
-              </w:rPr>
-              <w:t>Gateway, services</w:t>
-            </w:r>
-          </w:p>
-        </w:tc>
-        <w:tc>
-          <w:tcPr>
-            <w:tcW w:type="dxa" w:w="3217"/>
-          </w:tcPr>
-          <w:p>
-            <w:pPr>
-              <w:spacing w:after="0" w:line="240" w:lineRule="auto"/>
-            </w:pPr>
-            <w:r>
-              <w:rPr>
-                <w:rFonts w:ascii="Aptos" w:hAnsi="Aptos"/>
-                <w:b w:val="0"/>
-                <w:sz w:val="18"/>
-              </w:rPr>
-              <w:t>Basic user calls admin endpoint (BFLA)</w:t>
-            </w:r>
-          </w:p>
-        </w:tc>
-        <w:tc>
-          <w:tcPr>
-            <w:tcW w:type="dxa" w:w="937"/>
-          </w:tcPr>
-          <w:p>
-            <w:pPr>
-              <w:spacing w:after="0" w:line="240" w:lineRule="auto"/>
-            </w:pPr>
-            <w:r>
-              <w:rPr>
-                <w:rFonts w:ascii="Aptos" w:hAnsi="Aptos"/>
-                <w:b w:val="0"/>
-                <w:sz w:val="18"/>
-              </w:rPr>
-              <w:t>High</w:t>
-            </w:r>
-          </w:p>
-        </w:tc>
-        <w:tc>
-          <w:tcPr>
-            <w:tcW w:type="dxa" w:w="4004"/>
-          </w:tcPr>
-          <w:p>
-            <w:pPr>
-              <w:spacing w:after="0" w:line="240" w:lineRule="auto"/>
-            </w:pPr>
-            <w:r>
-              <w:rPr>
-                <w:rFonts w:ascii="Aptos" w:hAnsi="Aptos"/>
-                <w:b w:val="0"/>
-                <w:sz w:val="18"/>
-              </w:rPr>
-              <w:t>Permission claim at gateway (RouteClaimsRequirement) + [HasPermission] in service</w:t>
-            </w:r>
-          </w:p>
-        </w:tc>
-        <w:tc>
-          <w:tcPr>
-            <w:tcW w:type="dxa" w:w="1500"/>
-          </w:tcPr>
-          <w:p>
-            <w:pPr>
-              <w:spacing w:after="0" w:line="240" w:lineRule="auto"/>
-            </w:pPr>
-            <w:r>
-              <w:rPr>
-                <w:rFonts w:ascii="Aptos" w:hAnsi="Aptos"/>
-                <w:b w:val="0"/>
-                <w:sz w:val="18"/>
-              </w:rPr>
-              <w:t>Done</w:t>
+            <w:tcW w:type="dxa" w:w="465"/>
+          </w:tcPr>
+          <w:p>
+            <w:pPr>
+              <w:spacing w:after="0" w:line="240" w:lineRule="auto"/>
+            </w:pPr>
+            <w:r>
+              <w:rPr>
+                <w:rFonts w:ascii="Aptos" w:hAnsi="Aptos"/>
+                <w:b w:val="0"/>
+                <w:sz w:val="18"/>
+              </w:rPr>
+              <w:t>D3</w:t>
+            </w:r>
+          </w:p>
+        </w:tc>
+        <w:tc>
+          <w:tcPr>
+            <w:tcW w:type="dxa" w:w="1497"/>
+          </w:tcPr>
+          <w:p>
+            <w:pPr>
+              <w:spacing w:after="0" w:line="240" w:lineRule="auto"/>
+            </w:pPr>
+            <w:r>
+              <w:rPr>
+                <w:rFonts w:ascii="Aptos" w:hAnsi="Aptos"/>
+                <w:b w:val="0"/>
+                <w:sz w:val="18"/>
+              </w:rPr>
+              <w:t>DoS</w:t>
+            </w:r>
+          </w:p>
+        </w:tc>
+        <w:tc>
+          <w:tcPr>
+            <w:tcW w:type="dxa" w:w="1273"/>
+          </w:tcPr>
+          <w:p>
+            <w:pPr>
+              <w:spacing w:after="0" w:line="240" w:lineRule="auto"/>
+            </w:pPr>
+            <w:r>
+              <w:rPr>
+                <w:rFonts w:ascii="Aptos" w:hAnsi="Aptos"/>
+                <w:b w:val="0"/>
+                <w:sz w:val="18"/>
+              </w:rPr>
+              <w:t>All</w:t>
+            </w:r>
+          </w:p>
+        </w:tc>
+        <w:tc>
+          <w:tcPr>
+            <w:tcW w:type="dxa" w:w="3551"/>
+          </w:tcPr>
+          <w:p>
+            <w:pPr>
+              <w:spacing w:after="0" w:line="240" w:lineRule="auto"/>
+            </w:pPr>
+            <w:r>
+              <w:rPr>
+                <w:rFonts w:ascii="Aptos" w:hAnsi="Aptos"/>
+                <w:b w:val="0"/>
+                <w:sz w:val="18"/>
+              </w:rPr>
+              <w:t>Oversized bodies (Kestrel default ~28 MB)</w:t>
+            </w:r>
+          </w:p>
+        </w:tc>
+        <w:tc>
+          <w:tcPr>
+            <w:tcW w:type="dxa" w:w="920"/>
+          </w:tcPr>
+          <w:p>
+            <w:pPr>
+              <w:spacing w:after="0" w:line="240" w:lineRule="auto"/>
+            </w:pPr>
+            <w:r>
+              <w:rPr>
+                <w:rFonts w:ascii="Aptos" w:hAnsi="Aptos"/>
+                <w:b w:val="0"/>
+                <w:sz w:val="18"/>
+              </w:rPr>
+              <w:t>Low</w:t>
+            </w:r>
+          </w:p>
+        </w:tc>
+        <w:tc>
+          <w:tcPr>
+            <w:tcW w:type="dxa" w:w="3778"/>
+          </w:tcPr>
+          <w:p>
+            <w:pPr>
+              <w:spacing w:after="0" w:line="240" w:lineRule="auto"/>
+            </w:pPr>
+            <w:r>
+              <w:rPr>
+                <w:rFonts w:ascii="Aptos" w:hAnsi="Aptos"/>
+                <w:b w:val="0"/>
+                <w:sz w:val="18"/>
+              </w:rPr>
+              <w:t>Lower MaxRequestBodySize</w:t>
+            </w:r>
+          </w:p>
+        </w:tc>
+        <w:tc>
+          <w:tcPr>
+            <w:tcW w:type="dxa" w:w="1476"/>
+          </w:tcPr>
+          <w:p>
+            <w:pPr>
+              <w:spacing w:after="0" w:line="240" w:lineRule="auto"/>
+            </w:pPr>
+            <w:r>
+              <w:rPr>
+                <w:rFonts w:ascii="Aptos" w:hAnsi="Aptos"/>
+                <w:b w:val="0"/>
+                <w:sz w:val="18"/>
+              </w:rPr>
+              <w:t>Planned</w:t>
             </w:r>
           </w:p>
         </w:tc>
@@ -3474,25 +3474,25 @@
       <w:tr>
         <w:tc>
           <w:tcPr>
-            <w:tcW w:type="dxa" w:w="472"/>
-          </w:tcPr>
-          <w:p>
-            <w:pPr>
-              <w:spacing w:after="0" w:line="240" w:lineRule="auto"/>
-            </w:pPr>
-            <w:r>
-              <w:rPr>
-                <w:rFonts w:ascii="Aptos" w:hAnsi="Aptos"/>
-                <w:b w:val="0"/>
-                <w:sz w:val="18"/>
-              </w:rPr>
-              <w:t>E2</w:t>
-            </w:r>
-          </w:p>
-        </w:tc>
-        <w:tc>
-          <w:tcPr>
-            <w:tcW w:type="dxa" w:w="1528"/>
+            <w:tcW w:type="dxa" w:w="465"/>
+          </w:tcPr>
+          <w:p>
+            <w:pPr>
+              <w:spacing w:after="0" w:line="240" w:lineRule="auto"/>
+            </w:pPr>
+            <w:r>
+              <w:rPr>
+                <w:rFonts w:ascii="Aptos" w:hAnsi="Aptos"/>
+                <w:b w:val="0"/>
+                <w:sz w:val="18"/>
+              </w:rPr>
+              <w:t>E1</w:t>
+            </w:r>
+          </w:p>
+        </w:tc>
+        <w:tc>
+          <w:tcPr>
+            <w:tcW w:type="dxa" w:w="1497"/>
           </w:tcPr>
           <w:p>
             <w:pPr>
@@ -3510,79 +3510,79 @@
         </w:tc>
         <w:tc>
           <w:tcPr>
-            <w:tcW w:type="dxa" w:w="1303"/>
-          </w:tcPr>
-          <w:p>
-            <w:pPr>
-              <w:spacing w:after="0" w:line="240" w:lineRule="auto"/>
-            </w:pPr>
-            <w:r>
-              <w:rPr>
-                <w:rFonts w:ascii="Aptos" w:hAnsi="Aptos"/>
-                <w:b w:val="0"/>
-                <w:sz w:val="18"/>
-              </w:rPr>
-              <w:t>Clients</w:t>
-            </w:r>
-          </w:p>
-        </w:tc>
-        <w:tc>
-          <w:tcPr>
-            <w:tcW w:type="dxa" w:w="3217"/>
-          </w:tcPr>
-          <w:p>
-            <w:pPr>
-              <w:spacing w:after="0" w:line="240" w:lineRule="auto"/>
-            </w:pPr>
-            <w:r>
-              <w:rPr>
-                <w:rFonts w:ascii="Aptos" w:hAnsi="Aptos"/>
-                <w:b w:val="0"/>
-                <w:sz w:val="18"/>
-              </w:rPr>
-              <w:t>Stolen access token reused</w:t>
-            </w:r>
-          </w:p>
-        </w:tc>
-        <w:tc>
-          <w:tcPr>
-            <w:tcW w:type="dxa" w:w="937"/>
-          </w:tcPr>
-          <w:p>
-            <w:pPr>
-              <w:spacing w:after="0" w:line="240" w:lineRule="auto"/>
-            </w:pPr>
-            <w:r>
-              <w:rPr>
-                <w:rFonts w:ascii="Aptos" w:hAnsi="Aptos"/>
-                <w:b w:val="0"/>
-                <w:sz w:val="18"/>
-              </w:rPr>
-              <w:t>Medium</w:t>
-            </w:r>
-          </w:p>
-        </w:tc>
-        <w:tc>
-          <w:tcPr>
-            <w:tcW w:type="dxa" w:w="4004"/>
-          </w:tcPr>
-          <w:p>
-            <w:pPr>
-              <w:spacing w:after="0" w:line="240" w:lineRule="auto"/>
-            </w:pPr>
-            <w:r>
-              <w:rPr>
-                <w:rFonts w:ascii="Aptos" w:hAnsi="Aptos"/>
-                <w:b w:val="0"/>
-                <w:sz w:val="18"/>
-              </w:rPr>
-              <w:t>15-min lifetime; refresh token rotated on each use</w:t>
-            </w:r>
-          </w:p>
-        </w:tc>
-        <w:tc>
-          <w:tcPr>
-            <w:tcW w:type="dxa" w:w="1500"/>
+            <w:tcW w:type="dxa" w:w="1273"/>
+          </w:tcPr>
+          <w:p>
+            <w:pPr>
+              <w:spacing w:after="0" w:line="240" w:lineRule="auto"/>
+            </w:pPr>
+            <w:r>
+              <w:rPr>
+                <w:rFonts w:ascii="Aptos" w:hAnsi="Aptos"/>
+                <w:b w:val="0"/>
+                <w:sz w:val="18"/>
+              </w:rPr>
+              <w:t>Gateway, services</w:t>
+            </w:r>
+          </w:p>
+        </w:tc>
+        <w:tc>
+          <w:tcPr>
+            <w:tcW w:type="dxa" w:w="3551"/>
+          </w:tcPr>
+          <w:p>
+            <w:pPr>
+              <w:spacing w:after="0" w:line="240" w:lineRule="auto"/>
+            </w:pPr>
+            <w:r>
+              <w:rPr>
+                <w:rFonts w:ascii="Aptos" w:hAnsi="Aptos"/>
+                <w:b w:val="0"/>
+                <w:sz w:val="18"/>
+              </w:rPr>
+              <w:t>Basic user calls admin endpoint (BFLA)</w:t>
+            </w:r>
+          </w:p>
+        </w:tc>
+        <w:tc>
+          <w:tcPr>
+            <w:tcW w:type="dxa" w:w="920"/>
+          </w:tcPr>
+          <w:p>
+            <w:pPr>
+              <w:spacing w:after="0" w:line="240" w:lineRule="auto"/>
+            </w:pPr>
+            <w:r>
+              <w:rPr>
+                <w:rFonts w:ascii="Aptos" w:hAnsi="Aptos"/>
+                <w:b w:val="0"/>
+                <w:sz w:val="18"/>
+              </w:rPr>
+              <w:t>High</w:t>
+            </w:r>
+          </w:p>
+        </w:tc>
+        <w:tc>
+          <w:tcPr>
+            <w:tcW w:type="dxa" w:w="3778"/>
+          </w:tcPr>
+          <w:p>
+            <w:pPr>
+              <w:spacing w:after="0" w:line="240" w:lineRule="auto"/>
+            </w:pPr>
+            <w:r>
+              <w:rPr>
+                <w:rFonts w:ascii="Aptos" w:hAnsi="Aptos"/>
+                <w:b w:val="0"/>
+                <w:sz w:val="18"/>
+              </w:rPr>
+              <w:t>Permission claim at gateway (RouteClaimsRequirement) + [HasPermission] in service</w:t>
+            </w:r>
+          </w:p>
+        </w:tc>
+        <w:tc>
+          <w:tcPr>
+            <w:tcW w:type="dxa" w:w="1476"/>
           </w:tcPr>
           <w:p>
             <w:pPr>
@@ -3602,25 +3602,25 @@
       <w:tr>
         <w:tc>
           <w:tcPr>
-            <w:tcW w:type="dxa" w:w="472"/>
-          </w:tcPr>
-          <w:p>
-            <w:pPr>
-              <w:spacing w:after="0" w:line="240" w:lineRule="auto"/>
-            </w:pPr>
-            <w:r>
-              <w:rPr>
-                <w:rFonts w:ascii="Aptos" w:hAnsi="Aptos"/>
-                <w:b w:val="0"/>
-                <w:sz w:val="18"/>
-              </w:rPr>
-              <w:t>E3</w:t>
-            </w:r>
-          </w:p>
-        </w:tc>
-        <w:tc>
-          <w:tcPr>
-            <w:tcW w:type="dxa" w:w="1528"/>
+            <w:tcW w:type="dxa" w:w="465"/>
+          </w:tcPr>
+          <w:p>
+            <w:pPr>
+              <w:spacing w:after="0" w:line="240" w:lineRule="auto"/>
+            </w:pPr>
+            <w:r>
+              <w:rPr>
+                <w:rFonts w:ascii="Aptos" w:hAnsi="Aptos"/>
+                <w:b w:val="0"/>
+                <w:sz w:val="18"/>
+              </w:rPr>
+              <w:t>E2</w:t>
+            </w:r>
+          </w:p>
+        </w:tc>
+        <w:tc>
+          <w:tcPr>
+            <w:tcW w:type="dxa" w:w="1497"/>
           </w:tcPr>
           <w:p>
             <w:pPr>
@@ -3638,43 +3638,43 @@
         </w:tc>
         <w:tc>
           <w:tcPr>
-            <w:tcW w:type="dxa" w:w="1303"/>
-          </w:tcPr>
-          <w:p>
-            <w:pPr>
-              <w:spacing w:after="0" w:line="240" w:lineRule="auto"/>
-            </w:pPr>
-            <w:r>
-              <w:rPr>
-                <w:rFonts w:ascii="Aptos" w:hAnsi="Aptos"/>
-                <w:b w:val="0"/>
-                <w:sz w:val="18"/>
-              </w:rPr>
-              <w:t>Identity</w:t>
-            </w:r>
-          </w:p>
-        </w:tc>
-        <w:tc>
-          <w:tcPr>
-            <w:tcW w:type="dxa" w:w="3217"/>
-          </w:tcPr>
-          <w:p>
-            <w:pPr>
-              <w:spacing w:after="0" w:line="240" w:lineRule="auto"/>
-            </w:pPr>
-            <w:r>
-              <w:rPr>
-                <w:rFonts w:ascii="Aptos" w:hAnsi="Aptos"/>
-                <w:b w:val="0"/>
-                <w:sz w:val="18"/>
-              </w:rPr>
-              <w:t>Old access token + leaked refresh token -&gt; new session</w:t>
-            </w:r>
-          </w:p>
-        </w:tc>
-        <w:tc>
-          <w:tcPr>
-            <w:tcW w:type="dxa" w:w="937"/>
+            <w:tcW w:type="dxa" w:w="1273"/>
+          </w:tcPr>
+          <w:p>
+            <w:pPr>
+              <w:spacing w:after="0" w:line="240" w:lineRule="auto"/>
+            </w:pPr>
+            <w:r>
+              <w:rPr>
+                <w:rFonts w:ascii="Aptos" w:hAnsi="Aptos"/>
+                <w:b w:val="0"/>
+                <w:sz w:val="18"/>
+              </w:rPr>
+              <w:t>Clients</w:t>
+            </w:r>
+          </w:p>
+        </w:tc>
+        <w:tc>
+          <w:tcPr>
+            <w:tcW w:type="dxa" w:w="3551"/>
+          </w:tcPr>
+          <w:p>
+            <w:pPr>
+              <w:spacing w:after="0" w:line="240" w:lineRule="auto"/>
+            </w:pPr>
+            <w:r>
+              <w:rPr>
+                <w:rFonts w:ascii="Aptos" w:hAnsi="Aptos"/>
+                <w:b w:val="0"/>
+                <w:sz w:val="18"/>
+              </w:rPr>
+              <w:t>Stolen access token reused</w:t>
+            </w:r>
+          </w:p>
+        </w:tc>
+        <w:tc>
+          <w:tcPr>
+            <w:tcW w:type="dxa" w:w="920"/>
           </w:tcPr>
           <w:p>
             <w:pPr>
@@ -3692,37 +3692,37 @@
         </w:tc>
         <w:tc>
           <w:tcPr>
-            <w:tcW w:type="dxa" w:w="4004"/>
-          </w:tcPr>
-          <w:p>
-            <w:pPr>
-              <w:spacing w:after="0" w:line="240" w:lineRule="auto"/>
-            </w:pPr>
-            <w:r>
-              <w:rPr>
-                <w:rFonts w:ascii="Aptos" w:hAnsi="Aptos"/>
-                <w:b w:val="0"/>
-                <w:sz w:val="18"/>
-              </w:rPr>
-              <w:t>Rotation, 1-day expiry; add reuse detection, revoke endpoint</w:t>
-            </w:r>
-          </w:p>
-        </w:tc>
-        <w:tc>
-          <w:tcPr>
-            <w:tcW w:type="dxa" w:w="1500"/>
-          </w:tcPr>
-          <w:p>
-            <w:pPr>
-              <w:spacing w:after="0" w:line="240" w:lineRule="auto"/>
-            </w:pPr>
-            <w:r>
-              <w:rPr>
-                <w:rFonts w:ascii="Aptos" w:hAnsi="Aptos"/>
-                <w:b w:val="0"/>
-                <w:sz w:val="18"/>
-              </w:rPr>
-              <w:t>Partial</w:t>
+            <w:tcW w:type="dxa" w:w="3778"/>
+          </w:tcPr>
+          <w:p>
+            <w:pPr>
+              <w:spacing w:after="0" w:line="240" w:lineRule="auto"/>
+            </w:pPr>
+            <w:r>
+              <w:rPr>
+                <w:rFonts w:ascii="Aptos" w:hAnsi="Aptos"/>
+                <w:b w:val="0"/>
+                <w:sz w:val="18"/>
+              </w:rPr>
+              <w:t>15-min lifetime; refresh token rotated on each use</w:t>
+            </w:r>
+          </w:p>
+        </w:tc>
+        <w:tc>
+          <w:tcPr>
+            <w:tcW w:type="dxa" w:w="1476"/>
+          </w:tcPr>
+          <w:p>
+            <w:pPr>
+              <w:spacing w:after="0" w:line="240" w:lineRule="auto"/>
+            </w:pPr>
+            <w:r>
+              <w:rPr>
+                <w:rFonts w:ascii="Aptos" w:hAnsi="Aptos"/>
+                <w:b w:val="0"/>
+                <w:sz w:val="18"/>
+              </w:rPr>
+              <w:t>Done</w:t>
             </w:r>
           </w:p>
         </w:tc>
@@ -3730,25 +3730,25 @@
       <w:tr>
         <w:tc>
           <w:tcPr>
-            <w:tcW w:type="dxa" w:w="472"/>
-          </w:tcPr>
-          <w:p>
-            <w:pPr>
-              <w:spacing w:after="0" w:line="240" w:lineRule="auto"/>
-            </w:pPr>
-            <w:r>
-              <w:rPr>
-                <w:rFonts w:ascii="Aptos" w:hAnsi="Aptos"/>
-                <w:b w:val="0"/>
-                <w:sz w:val="18"/>
-              </w:rPr>
-              <w:t>E4</w:t>
-            </w:r>
-          </w:p>
-        </w:tc>
-        <w:tc>
-          <w:tcPr>
-            <w:tcW w:type="dxa" w:w="1528"/>
+            <w:tcW w:type="dxa" w:w="465"/>
+          </w:tcPr>
+          <w:p>
+            <w:pPr>
+              <w:spacing w:after="0" w:line="240" w:lineRule="auto"/>
+            </w:pPr>
+            <w:r>
+              <w:rPr>
+                <w:rFonts w:ascii="Aptos" w:hAnsi="Aptos"/>
+                <w:b w:val="0"/>
+                <w:sz w:val="18"/>
+              </w:rPr>
+              <w:t>E3</w:t>
+            </w:r>
+          </w:p>
+        </w:tc>
+        <w:tc>
+          <w:tcPr>
+            <w:tcW w:type="dxa" w:w="1497"/>
           </w:tcPr>
           <w:p>
             <w:pPr>
@@ -3766,91 +3766,91 @@
         </w:tc>
         <w:tc>
           <w:tcPr>
-            <w:tcW w:type="dxa" w:w="1303"/>
-          </w:tcPr>
-          <w:p>
-            <w:pPr>
-              <w:spacing w:after="0" w:line="240" w:lineRule="auto"/>
-            </w:pPr>
-            <w:r>
-              <w:rPr>
-                <w:rFonts w:ascii="Aptos" w:hAnsi="Aptos"/>
-                <w:b w:val="0"/>
-                <w:sz w:val="18"/>
-              </w:rPr>
-              <w:t>Services</w:t>
-            </w:r>
-          </w:p>
-        </w:tc>
-        <w:tc>
-          <w:tcPr>
-            <w:tcW w:type="dxa" w:w="3217"/>
-          </w:tcPr>
-          <w:p>
-            <w:pPr>
-              <w:spacing w:after="0" w:line="240" w:lineRule="auto"/>
-            </w:pPr>
-            <w:r>
-              <w:rPr>
-                <w:rFonts w:ascii="Aptos" w:hAnsi="Aptos"/>
-                <w:b w:val="0"/>
-                <w:sz w:val="18"/>
-              </w:rPr>
-              <w:t>BOLA/IDOR on records</w:t>
-            </w:r>
-          </w:p>
-        </w:tc>
-        <w:tc>
-          <w:tcPr>
-            <w:tcW w:type="dxa" w:w="937"/>
-          </w:tcPr>
-          <w:p>
-            <w:pPr>
-              <w:spacing w:after="0" w:line="240" w:lineRule="auto"/>
-            </w:pPr>
-            <w:r>
-              <w:rPr>
-                <w:rFonts w:ascii="Aptos" w:hAnsi="Aptos"/>
-                <w:b w:val="0"/>
-                <w:sz w:val="18"/>
-              </w:rPr>
-              <w:t>Low</w:t>
-            </w:r>
-          </w:p>
-        </w:tc>
-        <w:tc>
-          <w:tcPr>
-            <w:tcW w:type="dxa" w:w="4004"/>
-          </w:tcPr>
-          <w:p>
-            <w:pPr>
-              <w:spacing w:after="0" w:line="240" w:lineRule="auto"/>
-            </w:pPr>
-            <w:r>
-              <w:rPr>
-                <w:rFonts w:ascii="Aptos" w:hAnsi="Aptos"/>
-                <w:b w:val="0"/>
-                <w:sz w:val="18"/>
-              </w:rPr>
-              <w:t>No per-user records in current model; revisit if ownership added</w:t>
-            </w:r>
-          </w:p>
-        </w:tc>
-        <w:tc>
-          <w:tcPr>
-            <w:tcW w:type="dxa" w:w="1500"/>
-          </w:tcPr>
-          <w:p>
-            <w:pPr>
-              <w:spacing w:after="0" w:line="240" w:lineRule="auto"/>
-            </w:pPr>
-            <w:r>
-              <w:rPr>
-                <w:rFonts w:ascii="Aptos" w:hAnsi="Aptos"/>
-                <w:b w:val="0"/>
-                <w:sz w:val="18"/>
-              </w:rPr>
-              <w:t>N/A</w:t>
+            <w:tcW w:type="dxa" w:w="1273"/>
+          </w:tcPr>
+          <w:p>
+            <w:pPr>
+              <w:spacing w:after="0" w:line="240" w:lineRule="auto"/>
+            </w:pPr>
+            <w:r>
+              <w:rPr>
+                <w:rFonts w:ascii="Aptos" w:hAnsi="Aptos"/>
+                <w:b w:val="0"/>
+                <w:sz w:val="18"/>
+              </w:rPr>
+              <w:t>Identity</w:t>
+            </w:r>
+          </w:p>
+        </w:tc>
+        <w:tc>
+          <w:tcPr>
+            <w:tcW w:type="dxa" w:w="3551"/>
+          </w:tcPr>
+          <w:p>
+            <w:pPr>
+              <w:spacing w:after="0" w:line="240" w:lineRule="auto"/>
+            </w:pPr>
+            <w:r>
+              <w:rPr>
+                <w:rFonts w:ascii="Aptos" w:hAnsi="Aptos"/>
+                <w:b w:val="0"/>
+                <w:sz w:val="18"/>
+              </w:rPr>
+              <w:t>Old access token + leaked refresh token -&gt; new session</w:t>
+            </w:r>
+          </w:p>
+        </w:tc>
+        <w:tc>
+          <w:tcPr>
+            <w:tcW w:type="dxa" w:w="920"/>
+          </w:tcPr>
+          <w:p>
+            <w:pPr>
+              <w:spacing w:after="0" w:line="240" w:lineRule="auto"/>
+            </w:pPr>
+            <w:r>
+              <w:rPr>
+                <w:rFonts w:ascii="Aptos" w:hAnsi="Aptos"/>
+                <w:b w:val="0"/>
+                <w:sz w:val="18"/>
+              </w:rPr>
+              <w:t>Medium</w:t>
+            </w:r>
+          </w:p>
+        </w:tc>
+        <w:tc>
+          <w:tcPr>
+            <w:tcW w:type="dxa" w:w="3778"/>
+          </w:tcPr>
+          <w:p>
+            <w:pPr>
+              <w:spacing w:after="0" w:line="240" w:lineRule="auto"/>
+            </w:pPr>
+            <w:r>
+              <w:rPr>
+                <w:rFonts w:ascii="Aptos" w:hAnsi="Aptos"/>
+                <w:b w:val="0"/>
+                <w:sz w:val="18"/>
+              </w:rPr>
+              <w:t>Rotation, 1-day expiry; add reuse detection, revoke endpoint</w:t>
+            </w:r>
+          </w:p>
+        </w:tc>
+        <w:tc>
+          <w:tcPr>
+            <w:tcW w:type="dxa" w:w="1476"/>
+          </w:tcPr>
+          <w:p>
+            <w:pPr>
+              <w:spacing w:after="0" w:line="240" w:lineRule="auto"/>
+            </w:pPr>
+            <w:r>
+              <w:rPr>
+                <w:rFonts w:ascii="Aptos" w:hAnsi="Aptos"/>
+                <w:b w:val="0"/>
+                <w:sz w:val="18"/>
+              </w:rPr>
+              <w:t>Partial</w:t>
             </w:r>
           </w:p>
         </w:tc>
@@ -3858,7 +3858,135 @@
       <w:tr>
         <w:tc>
           <w:tcPr>
-            <w:tcW w:type="dxa" w:w="472"/>
+            <w:tcW w:type="dxa" w:w="465"/>
+          </w:tcPr>
+          <w:p>
+            <w:pPr>
+              <w:spacing w:after="0" w:line="240" w:lineRule="auto"/>
+            </w:pPr>
+            <w:r>
+              <w:rPr>
+                <w:rFonts w:ascii="Aptos" w:hAnsi="Aptos"/>
+                <w:b w:val="0"/>
+                <w:sz w:val="18"/>
+              </w:rPr>
+              <w:t>E4</w:t>
+            </w:r>
+          </w:p>
+        </w:tc>
+        <w:tc>
+          <w:tcPr>
+            <w:tcW w:type="dxa" w:w="1497"/>
+          </w:tcPr>
+          <w:p>
+            <w:pPr>
+              <w:spacing w:after="0" w:line="240" w:lineRule="auto"/>
+            </w:pPr>
+            <w:r>
+              <w:rPr>
+                <w:rFonts w:ascii="Aptos" w:hAnsi="Aptos"/>
+                <w:b w:val="0"/>
+                <w:sz w:val="18"/>
+              </w:rPr>
+              <w:t>EoP</w:t>
+            </w:r>
+          </w:p>
+        </w:tc>
+        <w:tc>
+          <w:tcPr>
+            <w:tcW w:type="dxa" w:w="1273"/>
+          </w:tcPr>
+          <w:p>
+            <w:pPr>
+              <w:spacing w:after="0" w:line="240" w:lineRule="auto"/>
+            </w:pPr>
+            <w:r>
+              <w:rPr>
+                <w:rFonts w:ascii="Aptos" w:hAnsi="Aptos"/>
+                <w:b w:val="0"/>
+                <w:sz w:val="18"/>
+              </w:rPr>
+              <w:t>Services</w:t>
+            </w:r>
+          </w:p>
+        </w:tc>
+        <w:tc>
+          <w:tcPr>
+            <w:tcW w:type="dxa" w:w="3551"/>
+          </w:tcPr>
+          <w:p>
+            <w:pPr>
+              <w:spacing w:after="0" w:line="240" w:lineRule="auto"/>
+            </w:pPr>
+            <w:r>
+              <w:rPr>
+                <w:rFonts w:ascii="Aptos" w:hAnsi="Aptos"/>
+                <w:b w:val="0"/>
+                <w:sz w:val="18"/>
+              </w:rPr>
+              <w:t>BOLA/IDOR on records</w:t>
+            </w:r>
+          </w:p>
+        </w:tc>
+        <w:tc>
+          <w:tcPr>
+            <w:tcW w:type="dxa" w:w="920"/>
+          </w:tcPr>
+          <w:p>
+            <w:pPr>
+              <w:spacing w:after="0" w:line="240" w:lineRule="auto"/>
+            </w:pPr>
+            <w:r>
+              <w:rPr>
+                <w:rFonts w:ascii="Aptos" w:hAnsi="Aptos"/>
+                <w:b w:val="0"/>
+                <w:sz w:val="18"/>
+              </w:rPr>
+              <w:t>Low</w:t>
+            </w:r>
+          </w:p>
+        </w:tc>
+        <w:tc>
+          <w:tcPr>
+            <w:tcW w:type="dxa" w:w="3778"/>
+          </w:tcPr>
+          <w:p>
+            <w:pPr>
+              <w:spacing w:after="0" w:line="240" w:lineRule="auto"/>
+            </w:pPr>
+            <w:r>
+              <w:rPr>
+                <w:rFonts w:ascii="Aptos" w:hAnsi="Aptos"/>
+                <w:b w:val="0"/>
+                <w:sz w:val="18"/>
+              </w:rPr>
+              <w:t>No per-user records in current model; revisit if ownership added</w:t>
+            </w:r>
+          </w:p>
+        </w:tc>
+        <w:tc>
+          <w:tcPr>
+            <w:tcW w:type="dxa" w:w="1476"/>
+          </w:tcPr>
+          <w:p>
+            <w:pPr>
+              <w:spacing w:after="0" w:line="240" w:lineRule="auto"/>
+            </w:pPr>
+            <w:r>
+              <w:rPr>
+                <w:rFonts w:ascii="Aptos" w:hAnsi="Aptos"/>
+                <w:b w:val="0"/>
+                <w:sz w:val="18"/>
+              </w:rPr>
+              <w:t>N/A</w:t>
+            </w:r>
+          </w:p>
+        </w:tc>
+      </w:tr>
+      <w:tr>
+        <w:tc>
+          <w:tcPr>
+            <w:tcW w:type="dxa" w:w="465"/>
           </w:tcPr>
           <w:p>
             <w:pPr>
@@ -3876,7 +4004,7 @@
         </w:tc>
         <w:tc>
           <w:tcPr>
-            <w:tcW w:type="dxa" w:w="1528"/>
+            <w:tcW w:type="dxa" w:w="1497"/>
           </w:tcPr>
           <w:p>
             <w:pPr>
@@ -3894,7 +4022,7 @@
         </w:tc>
         <w:tc>
           <w:tcPr>
-            <w:tcW w:type="dxa" w:w="1303"/>
+            <w:tcW w:type="dxa" w:w="1273"/>
           </w:tcPr>
           <w:p>
             <w:pPr>
@@ -3912,7 +4040,7 @@
         </w:tc>
         <w:tc>
           <w:tcPr>
-            <w:tcW w:type="dxa" w:w="3217"/>
+            <w:tcW w:type="dxa" w:w="3551"/>
           </w:tcPr>
           <w:p>
             <w:pPr>
@@ -3930,7 +4058,7 @@
         </w:tc>
         <w:tc>
           <w:tcPr>
-            <w:tcW w:type="dxa" w:w="937"/>
+            <w:tcW w:type="dxa" w:w="920"/>
           </w:tcPr>
           <w:p>
             <w:pPr>
@@ -3948,7 +4076,7 @@
         </w:tc>
         <w:tc>
           <w:tcPr>
-            <w:tcW w:type="dxa" w:w="4004"/>
+            <w:tcW w:type="dxa" w:w="3778"/>
           </w:tcPr>
           <w:p>
             <w:pPr>
@@ -3966,7 +4094,7 @@
         </w:tc>
         <w:tc>
           <w:tcPr>
-            <w:tcW w:type="dxa" w:w="1500"/>
+            <w:tcW w:type="dxa" w:w="1476"/>
           </w:tcPr>
           <w:p>
             <w:pPr>

</xml_diff>

<commit_message>
Fact-check corrections across docs, report, diagram
</commit_message>
<xml_diff>
--- a/docs/report/MCSC6002_Final_Report.docx
+++ b/docs/report/MCSC6002_Final_Report.docx
@@ -96,12 +96,12 @@
     </w:p>
     <w:p>
       <w:r>
-        <w:t>The Identity service manages users, roles and permissions and issues tokens. The Product service manages brands and products; when a product is created or deleted it publishes an event. The Inventory service consumes these events and creates or removes the matching stock items, so the two services stay consistent without calling each other (eventual consistency). All client traffic enters through the API gateway.</w:t>
+        <w:t>The Identity service manages users, roles and permissions and issues tokens. The Product service manages brands and products; when a product is created or deleted it publishes an event. The Inventory service consumes these events and creates or removes the matching stock items, so stock follows the catalog without Product calling Inventory (eventual consistency). When Inventory returns stock items, it looks up product details through the gateway. All client traffic enters through the API gateway.</w:t>
       </w:r>
     </w:p>
     <w:p>
       <w:r>
-        <w:t xml:space="preserve">Each service has its own SQL Server database. The Product service caches its product list in Redis. The services use .NET 10 with Clean Architecture, CQRS through MediatR, Entity Framework Core, FluentValidation and ASP.NET Core Identity, and MassTransit for RabbitMQ. Two shared NuGet libraries hold the permission constants and the request and response contracts. For local runs, SQL Server, RabbitMQ and Redis start with Docker Compose and the services run with </w:t>
+        <w:t xml:space="preserve">Each service has its own database on one SQL Server instance. The Product service caches its product list in Redis. The services use .NET 10 with Clean Architecture, CQRS through MediatR, Entity Framework Core, FluentValidation and ASP.NET Core Identity, and MassTransit for RabbitMQ. Two shared NuGet libraries hold the permission constants and the request and response contracts. For local runs, SQL Server, RabbitMQ and Redis start with Docker Compose and the services run with </w:t>
       </w:r>
       <w:r>
         <w:rPr>
@@ -134,7 +134,7 @@
         <w:t>scripts/run.sh</w:t>
       </w:r>
       <w:r>
-        <w:t>); container images for the services are future work. Users cannot register themselves: an administrator creates accounts, which suits an internal company inventory system. Queue messages are not encrypted field by field. The connection to RabbitMQ uses TLS, and events carry only product ids, names and quantities, so TLS in transit and the HMAC signature cover the risk.</w:t>
+        <w:t>); container images for the services are future work. Users cannot register themselves: an administrator creates accounts, which suits an internal company inventory system. Queue messages are not encrypted field by field. The connection to RabbitMQ uses TLS, and events carry only product ids, names, quantities and reorder thresholds, so TLS in transit and the HMAC signature cover the risk.</w:t>
       </w:r>
     </w:p>
     <w:p>
@@ -320,7 +320,7 @@
     </w:p>
     <w:p>
       <w:r>
-        <w:t xml:space="preserve">Authorization is permission based. The gateway checks the permission claim required by each route before forwarding the request, and the service checks the same permission again with its own </w:t>
+        <w:t xml:space="preserve">Authorization is permission based. The gateway checks the permission claim required by each protected route before forwarding the request, and the service checks the same permission again with its own </w:t>
       </w:r>
       <w:r>
         <w:rPr>
@@ -330,7 +330,17 @@
         <w:t>[HasPermission]</w:t>
       </w:r>
       <w:r>
-        <w:t xml:space="preserve"> attribute. Passwords must have at least 12 characters with 6 different ones, following the length-over-composition advice in NIST SP 800-63B (Grassi et al., 2017). After 5 failed logins an account is locked for 15 minutes, and the gateway allows at most 5 login or refresh requests per minute per IP address. Wrong passwords, unknown users and locked accounts all get the same message, so a response does not reveal whether an account exists or is locked.</w:t>
+        <w:t xml:space="preserve"> attribute. Passwords must have at least 12 characters, following the length-over-composition advice in NIST SP 800-63B (Grassi et al., 2017), and at least 6 different characters, a rule of our own. After 5 failed logins an account is locked for 15 minutes, and the gateway allows at most 5 requests per minute per IP address to its </w:t>
+      </w:r>
+      <w:r>
+        <w:rPr>
+          <w:rFonts w:ascii="Consolas" w:hAnsi="Consolas"/>
+          <w:shd w:val="clear" w:color="auto" w:fill="EDEDED"/>
+        </w:rPr>
+        <w:t>/auth</w:t>
+      </w:r>
+      <w:r>
+        <w:t xml:space="preserve"> routes (login, refresh and revoke). Wrong passwords, unknown users and locked accounts all get the same message, so a response does not reveal whether an account exists or is locked.</w:t>
       </w:r>
     </w:p>
     <w:p>
@@ -343,7 +353,7 @@
     </w:p>
     <w:p>
       <w:r>
-        <w:t xml:space="preserve">Clients reach the gateway over HTTPS, with HSTS outside development. Between the gateway and the services we use mutual TLS. A project certificate authority issues a client certificate to the gateway, and each service accepts only a client certificate issued by that CA with the name </w:t>
+        <w:t xml:space="preserve">The gateway listens only on HTTPS, with HSTS outside development. Between the gateway and the services we use mutual TLS. A project certificate authority issues a client certificate to the gateway, and each service accepts only a client certificate issued by that CA with the name </w:t>
       </w:r>
       <w:r>
         <w:rPr>
@@ -353,7 +363,7 @@
         <w:t>api-gateway</w:t>
       </w:r>
       <w:r>
-        <w:t>. The gateway in turn accepts only service certificates from the same CA and checks the host name. The services no longer listen on plain HTTP, so even a host inside the network cannot call a service directly. The connection to RabbitMQ also uses TLS: the broker listens only on its TLS port, with a certificate from the same CA, and the services check that certificate and its host name.</w:t>
+        <w:t>. The gateway in turn accepts only service certificates from the same CA and checks the host name. The services no longer listen on plain HTTP, so even a host inside the network cannot call a service directly. The connection to RabbitMQ also uses TLS: the broker accepts AMQP only on its TLS port, with a certificate from the same CA, and the services check that certificate and its host name. Its management interface is still plain HTTP, reachable only from the local machine.</w:t>
       </w:r>
     </w:p>
     <w:p>
@@ -366,7 +376,7 @@
     </w:p>
     <w:p>
       <w:r>
-        <w:t>Passwords are stored as salted PBKDF2 hashes by ASP.NET Core Identity. Refresh tokens are stored only as SHA-256 hashes, so a copy of the database holds no usable session. Queue events carry an HMAC-SHA256 signature (Krawczyk et al., 1997) over the event type, a timestamp and the message body. The Inventory service verifies the signature in a filter that runs before every consumer and rejects events that are unsigned, altered or older than five minutes. Rejected events go to an error queue as evidence instead of being retried.</w:t>
+        <w:t>Passwords are stored as salted PBKDF2 hashes by ASP.NET Core Identity. Refresh tokens are stored only as SHA-256 hashes, so a copy of the database holds no usable session. Queue events carry an HMAC-SHA256 signature (Krawczyk et al., 1997) over the event type, a timestamp and the message content. The Inventory service verifies the signature in a filter that runs before every consumer and rejects events that are unsigned, altered or older than five minutes. Rejected events go to an error queue as evidence instead of being retried.</w:t>
       </w:r>
     </w:p>
     <w:p>
@@ -379,7 +389,7 @@
     </w:p>
     <w:p>
       <w:r>
-        <w:t>Request bodies in all three services are validated with FluentValidation for type, length and range, and the Inventory service accepts only known stock statuses. The gateway rejects bodies larger than 2 MB. Entity Framework Core sends all queries with parameters, which prevents SQL injection. Product quantity is limited to 1 to 1000, because the Inventory service creates one record per unit. The consumer checks the same limit again, in case an event bypasses the Product service.</w:t>
+        <w:t>FluentValidation checks the create and update requests for length, range and allowed values: users in Identity, brands and products in Product, and stock status changes in Inventory. Requests with wrong types are rejected before they reach a handler. Login and the other Identity requests are not validated this way; they rely on parameterized queries and generic error messages. The gateway rejects bodies larger than 2 MB. Entity Framework Core sends all queries with parameters, which prevents SQL injection. Product quantity is limited to 1 to 1000, because the Inventory service creates one record per unit. The consumer checks the same limit again, in case an event bypasses the Product service.</w:t>
       </w:r>
     </w:p>
     <w:p>
@@ -392,7 +402,7 @@
     </w:p>
     <w:p>
       <w:r>
-        <w:t xml:space="preserve">No password or key is committed. Infrastructure and seed passwords live in a git-ignored </w:t>
+        <w:t xml:space="preserve">No password or key in use is committed. The retired HS256 secret remains in early commits and, on purpose, in the attack suite, which shows it is rejected (test A4); early commits also hold old seed passwords that are no longer used. Infrastructure and seed passwords live in a git-ignored </w:t>
       </w:r>
       <w:r>
         <w:rPr>
@@ -450,7 +460,7 @@
     </w:p>
     <w:p>
       <w:r>
-        <w:t>The highest risks at the start were forged tokens (a signing secret shared by four services and committed to git), direct calls to services that bypass the gateway, password guessing, forged or altered queue events and an unbounded quantity that let one event create any number of records. All of these are now mitigated and tested.</w:t>
+        <w:t>The highest risks at the start were forged tokens (a signing secret shared by four services and committed to git), direct calls to services that bypass the gateway, password guessing, forged or altered queue events and an unbounded quantity that let one event create any number of records. All of these are now mitigated and tested; for queue events, replay within five minutes remains (threat T3).</w:t>
       </w:r>
     </w:p>
     <w:p>
@@ -513,7 +523,7 @@
     </w:p>
     <w:p>
       <w:r>
-        <w:t>We tested in four ways. A scripted suite of 37 attack cases (Appendix B) runs against the live system, and each case maps to a threat ID. Semgrep scanned the source of all seven repositories, Gitleaks scanned their git history and OWASP ZAP ran an authenticated active scan of all 19 gateway routes.</w:t>
+        <w:t>We tested in four ways. A scripted suite of 37 attack cases (Appendix B) runs against the live system; 35 cases map to a threat ID and two are controls that show normal use still works. Semgrep scanned the source of all seven repositories, Gitleaks scanned their git history and OWASP ZAP ran an authenticated active scan of the 19 gateway routes that existed at the time. These three scans ran before the final changes (refresh token hashing, the 2 MB limit, hiding of service errors and broker TLS), which attack cases A14, V9 and N4 cover.</w:t>
       </w:r>
     </w:p>
     <w:p>
@@ -533,12 +543,12 @@
         <w:t>ValidateLifetime = false</w:t>
       </w:r>
       <w:r>
-        <w:t xml:space="preserve"> in the refresh flow. Gitleaks found the old HS256 secret in the history of four repositories; it is no longer used and test A4 shows it is rejected. ZAP found no high risk issues. Its one medium alert is a false positive caused by our own SQL injection test data, and the missing HSTS header is expected in development mode.</w:t>
+        <w:t xml:space="preserve"> in the refresh flow. Gitleaks found the old HS256 secret in the history of four repositories; it is no longer used and test A4 shows it is rejected. The attack suite keeps that retired secret on purpose for this test. ZAP found no high risk issues. Its one medium alert is a false positive caused by our own SQL injection test data, and the missing HSTS header is expected in development mode.</w:t>
       </w:r>
     </w:p>
     <w:p>
       <w:r>
-        <w:t>Testing also found real defects, which we fixed and retested. Forged tokens crashed the request instead of returning 401, because the framework placed the authentication middleware before our header middleware. The product list stayed cached for an hour after changes. ZAP reported three missing response headers and an unneeded static page on the gateway. A final end-to-end check found that the Inventory service could not call the Product service through the gateway, and that the resulting error page leaked a stack trace and the caller's token; the gateway now uses a certificate from our own authority and hides error bodies from the services. A restore on a clean machine also showed that our shared libraries were not on nuget.org, where unrelated packages use the same names: the build silently took a stranger's AuthLibrary 2.0.0. Each service now ships the exact packages and maps those names to them only.</w:t>
+        <w:t>Testing also found real defects, which we fixed and retested. Forged tokens crashed the request instead of returning 401, because the framework placed the authentication middleware before our header middleware. The product list could stay cached for up to a day after changes. ZAP reported two missing security headers and an unneeded static page on the gateway. A final end-to-end check found that the Inventory service could not call the Product service through the gateway, and that the resulting error page leaked a stack trace and the caller's token; the gateway now uses a certificate from our own authority and hides error bodies from the services. A restore on a clean machine also showed that our shared libraries were not on nuget.org, where unrelated packages use the same names: the build silently took a stranger's AuthLibrary 2.0.0. Each service now ships the exact packages and maps those names to them only.</w:t>
       </w:r>
     </w:p>
     <w:p>
@@ -551,7 +561,7 @@
     </w:p>
     <w:p>
       <w:r>
-        <w:t>The largest delay came from dependencies. MassTransit 9 requires a commercial license, and two services failed at startup until we moved to version 8, which is open source. MediatR 14 has a similar license that allows only development use. Checking licenses early would have saved time.</w:t>
+        <w:t>The largest delay came from dependencies. MassTransit 9 requires a commercial license, and two services failed at startup until we moved to version 8, which is open source. MediatR has also moved to a commercial license; we kept version 14 for this prototype and noted it as a check before any production use. Checking licenses early would have saved time.</w:t>
       </w:r>
     </w:p>
     <w:p>
@@ -582,7 +592,7 @@
     </w:p>
     <w:p>
       <w:r>
-        <w:t>Mario Silveira built the Identity, Product and Inventory services, the shared libraries and their build pipelines. Arman Akhmetov built the token and gateway security (RS256 signing and validation, route permissions, mutual TLS, rate limiting, lockout and password policy, refresh token hashing and revocation, error handling), the message signing and broker TLS, the local infrastructure, the threat model and diagrams, and the testing, and wrote this report.</w:t>
+        <w:t>Mario Silveira built the Identity, Product and Inventory services, the API gateway project and its routes, the shared libraries and their build pipelines. Arman Akhmetov built the token and gateway security (RS256 signing and validation, route permissions, mutual TLS, rate limiting, lockout and password policy, refresh token hashing and revocation, error handling), the message signing and broker TLS, the local infrastructure, the threat model and diagrams, and the testing, and wrote this report.</w:t>
       </w:r>
     </w:p>
     <w:p>
@@ -681,7 +691,7 @@
         </w:trPr>
         <w:tc>
           <w:tcPr>
-            <w:tcW w:type="dxa" w:w="470"/>
+            <w:tcW w:type="dxa" w:w="468"/>
           </w:tcPr>
           <w:p>
             <w:pPr>
@@ -699,7 +709,7 @@
         </w:tc>
         <w:tc>
           <w:tcPr>
-            <w:tcW w:type="dxa" w:w="1519"/>
+            <w:tcW w:type="dxa" w:w="1512"/>
           </w:tcPr>
           <w:p>
             <w:pPr>
@@ -717,7 +727,7 @@
         </w:tc>
         <w:tc>
           <w:tcPr>
-            <w:tcW w:type="dxa" w:w="1293"/>
+            <w:tcW w:type="dxa" w:w="1287"/>
           </w:tcPr>
           <w:p>
             <w:pPr>
@@ -735,7 +745,7 @@
         </w:tc>
         <w:tc>
           <w:tcPr>
-            <w:tcW w:type="dxa" w:w="3665"/>
+            <w:tcW w:type="dxa" w:w="3630"/>
           </w:tcPr>
           <w:p>
             <w:pPr>
@@ -753,7 +763,7 @@
         </w:tc>
         <w:tc>
           <w:tcPr>
-            <w:tcW w:type="dxa" w:w="932"/>
+            <w:tcW w:type="dxa" w:w="929"/>
           </w:tcPr>
           <w:p>
             <w:pPr>
@@ -771,7 +781,7 @@
         </w:tc>
         <w:tc>
           <w:tcPr>
-            <w:tcW w:type="dxa" w:w="4037"/>
+            <w:tcW w:type="dxa" w:w="4093"/>
           </w:tcPr>
           <w:p>
             <w:pPr>
@@ -789,7 +799,7 @@
         </w:tc>
         <w:tc>
           <w:tcPr>
-            <w:tcW w:type="dxa" w:w="1044"/>
+            <w:tcW w:type="dxa" w:w="1040"/>
           </w:tcPr>
           <w:p>
             <w:pPr>
@@ -809,7 +819,7 @@
       <w:tr>
         <w:tc>
           <w:tcPr>
-            <w:tcW w:type="dxa" w:w="470"/>
+            <w:tcW w:type="dxa" w:w="468"/>
           </w:tcPr>
           <w:p>
             <w:pPr>
@@ -827,7 +837,7 @@
         </w:tc>
         <w:tc>
           <w:tcPr>
-            <w:tcW w:type="dxa" w:w="1519"/>
+            <w:tcW w:type="dxa" w:w="1512"/>
           </w:tcPr>
           <w:p>
             <w:pPr>
@@ -845,7 +855,7 @@
         </w:tc>
         <w:tc>
           <w:tcPr>
-            <w:tcW w:type="dxa" w:w="1293"/>
+            <w:tcW w:type="dxa" w:w="1287"/>
           </w:tcPr>
           <w:p>
             <w:pPr>
@@ -863,7 +873,7 @@
         </w:tc>
         <w:tc>
           <w:tcPr>
-            <w:tcW w:type="dxa" w:w="3665"/>
+            <w:tcW w:type="dxa" w:w="3630"/>
           </w:tcPr>
           <w:p>
             <w:pPr>
@@ -881,7 +891,7 @@
         </w:tc>
         <w:tc>
           <w:tcPr>
-            <w:tcW w:type="dxa" w:w="932"/>
+            <w:tcW w:type="dxa" w:w="929"/>
           </w:tcPr>
           <w:p>
             <w:pPr>
@@ -899,7 +909,7 @@
         </w:tc>
         <w:tc>
           <w:tcPr>
-            <w:tcW w:type="dxa" w:w="4037"/>
+            <w:tcW w:type="dxa" w:w="4093"/>
           </w:tcPr>
           <w:p>
             <w:pPr>
@@ -917,7 +927,7 @@
         </w:tc>
         <w:tc>
           <w:tcPr>
-            <w:tcW w:type="dxa" w:w="1044"/>
+            <w:tcW w:type="dxa" w:w="1040"/>
           </w:tcPr>
           <w:p>
             <w:pPr>
@@ -937,7 +947,7 @@
       <w:tr>
         <w:tc>
           <w:tcPr>
-            <w:tcW w:type="dxa" w:w="470"/>
+            <w:tcW w:type="dxa" w:w="468"/>
           </w:tcPr>
           <w:p>
             <w:pPr>
@@ -955,7 +965,7 @@
         </w:tc>
         <w:tc>
           <w:tcPr>
-            <w:tcW w:type="dxa" w:w="1519"/>
+            <w:tcW w:type="dxa" w:w="1512"/>
           </w:tcPr>
           <w:p>
             <w:pPr>
@@ -973,7 +983,7 @@
         </w:tc>
         <w:tc>
           <w:tcPr>
-            <w:tcW w:type="dxa" w:w="1293"/>
+            <w:tcW w:type="dxa" w:w="1287"/>
           </w:tcPr>
           <w:p>
             <w:pPr>
@@ -991,7 +1001,7 @@
         </w:tc>
         <w:tc>
           <w:tcPr>
-            <w:tcW w:type="dxa" w:w="3665"/>
+            <w:tcW w:type="dxa" w:w="3630"/>
           </w:tcPr>
           <w:p>
             <w:pPr>
@@ -1009,7 +1019,7 @@
         </w:tc>
         <w:tc>
           <w:tcPr>
-            <w:tcW w:type="dxa" w:w="932"/>
+            <w:tcW w:type="dxa" w:w="929"/>
           </w:tcPr>
           <w:p>
             <w:pPr>
@@ -1027,7 +1037,7 @@
         </w:tc>
         <w:tc>
           <w:tcPr>
-            <w:tcW w:type="dxa" w:w="4037"/>
+            <w:tcW w:type="dxa" w:w="4093"/>
           </w:tcPr>
           <w:p>
             <w:pPr>
@@ -1045,7 +1055,7 @@
         </w:tc>
         <w:tc>
           <w:tcPr>
-            <w:tcW w:type="dxa" w:w="1044"/>
+            <w:tcW w:type="dxa" w:w="1040"/>
           </w:tcPr>
           <w:p>
             <w:pPr>
@@ -1065,7 +1075,7 @@
       <w:tr>
         <w:tc>
           <w:tcPr>
-            <w:tcW w:type="dxa" w:w="470"/>
+            <w:tcW w:type="dxa" w:w="468"/>
           </w:tcPr>
           <w:p>
             <w:pPr>
@@ -1083,7 +1093,7 @@
         </w:tc>
         <w:tc>
           <w:tcPr>
-            <w:tcW w:type="dxa" w:w="1519"/>
+            <w:tcW w:type="dxa" w:w="1512"/>
           </w:tcPr>
           <w:p>
             <w:pPr>
@@ -1101,7 +1111,7 @@
         </w:tc>
         <w:tc>
           <w:tcPr>
-            <w:tcW w:type="dxa" w:w="1293"/>
+            <w:tcW w:type="dxa" w:w="1287"/>
           </w:tcPr>
           <w:p>
             <w:pPr>
@@ -1119,7 +1129,7 @@
         </w:tc>
         <w:tc>
           <w:tcPr>
-            <w:tcW w:type="dxa" w:w="3665"/>
+            <w:tcW w:type="dxa" w:w="3630"/>
           </w:tcPr>
           <w:p>
             <w:pPr>
@@ -1137,7 +1147,7 @@
         </w:tc>
         <w:tc>
           <w:tcPr>
-            <w:tcW w:type="dxa" w:w="932"/>
+            <w:tcW w:type="dxa" w:w="929"/>
           </w:tcPr>
           <w:p>
             <w:pPr>
@@ -1155,7 +1165,7 @@
         </w:tc>
         <w:tc>
           <w:tcPr>
-            <w:tcW w:type="dxa" w:w="4037"/>
+            <w:tcW w:type="dxa" w:w="4093"/>
           </w:tcPr>
           <w:p>
             <w:pPr>
@@ -1173,7 +1183,7 @@
         </w:tc>
         <w:tc>
           <w:tcPr>
-            <w:tcW w:type="dxa" w:w="1044"/>
+            <w:tcW w:type="dxa" w:w="1040"/>
           </w:tcPr>
           <w:p>
             <w:pPr>
@@ -1193,7 +1203,7 @@
       <w:tr>
         <w:tc>
           <w:tcPr>
-            <w:tcW w:type="dxa" w:w="470"/>
+            <w:tcW w:type="dxa" w:w="468"/>
           </w:tcPr>
           <w:p>
             <w:pPr>
@@ -1211,7 +1221,7 @@
         </w:tc>
         <w:tc>
           <w:tcPr>
-            <w:tcW w:type="dxa" w:w="1519"/>
+            <w:tcW w:type="dxa" w:w="1512"/>
           </w:tcPr>
           <w:p>
             <w:pPr>
@@ -1229,7 +1239,7 @@
         </w:tc>
         <w:tc>
           <w:tcPr>
-            <w:tcW w:type="dxa" w:w="1293"/>
+            <w:tcW w:type="dxa" w:w="1287"/>
           </w:tcPr>
           <w:p>
             <w:pPr>
@@ -1247,7 +1257,7 @@
         </w:tc>
         <w:tc>
           <w:tcPr>
-            <w:tcW w:type="dxa" w:w="3665"/>
+            <w:tcW w:type="dxa" w:w="3630"/>
           </w:tcPr>
           <w:p>
             <w:pPr>
@@ -1265,7 +1275,7 @@
         </w:tc>
         <w:tc>
           <w:tcPr>
-            <w:tcW w:type="dxa" w:w="932"/>
+            <w:tcW w:type="dxa" w:w="929"/>
           </w:tcPr>
           <w:p>
             <w:pPr>
@@ -1283,25 +1293,25 @@
         </w:tc>
         <w:tc>
           <w:tcPr>
-            <w:tcW w:type="dxa" w:w="4037"/>
-          </w:tcPr>
-          <w:p>
-            <w:pPr>
-              <w:spacing w:after="0" w:line="240" w:lineRule="auto"/>
-            </w:pPr>
-            <w:r>
-              <w:rPr>
-                <w:rFonts w:ascii="Aptos" w:hAnsi="Aptos"/>
-                <w:b w:val="0"/>
-                <w:sz w:val="18"/>
-              </w:rPr>
-              <w:t>Gateway 5 req/min per IP on /auth/*; lockout after 5 failures (15 min); min 12 chars, 6 unique (NIST 800-63B), enforced on user creation</w:t>
-            </w:r>
-          </w:p>
-        </w:tc>
-        <w:tc>
-          <w:tcPr>
-            <w:tcW w:type="dxa" w:w="1044"/>
+            <w:tcW w:type="dxa" w:w="4093"/>
+          </w:tcPr>
+          <w:p>
+            <w:pPr>
+              <w:spacing w:after="0" w:line="240" w:lineRule="auto"/>
+            </w:pPr>
+            <w:r>
+              <w:rPr>
+                <w:rFonts w:ascii="Aptos" w:hAnsi="Aptos"/>
+                <w:b w:val="0"/>
+                <w:sz w:val="18"/>
+              </w:rPr>
+              <w:t>Gateway 5 req/min per IP on /auth/*; lockout after 5 failures (15 min); min 12 chars (NIST 800-63B: length over composition) and 6 unique (our rule), enforced on user creation; seeded users get random 24-char passwords. Accepted residual: lockout lets an attacker lock a known account</w:t>
+            </w:r>
+          </w:p>
+        </w:tc>
+        <w:tc>
+          <w:tcPr>
+            <w:tcW w:type="dxa" w:w="1040"/>
           </w:tcPr>
           <w:p>
             <w:pPr>
@@ -1321,7 +1331,7 @@
       <w:tr>
         <w:tc>
           <w:tcPr>
-            <w:tcW w:type="dxa" w:w="470"/>
+            <w:tcW w:type="dxa" w:w="468"/>
           </w:tcPr>
           <w:p>
             <w:pPr>
@@ -1339,7 +1349,7 @@
         </w:tc>
         <w:tc>
           <w:tcPr>
-            <w:tcW w:type="dxa" w:w="1519"/>
+            <w:tcW w:type="dxa" w:w="1512"/>
           </w:tcPr>
           <w:p>
             <w:pPr>
@@ -1357,7 +1367,7 @@
         </w:tc>
         <w:tc>
           <w:tcPr>
-            <w:tcW w:type="dxa" w:w="1293"/>
+            <w:tcW w:type="dxa" w:w="1287"/>
           </w:tcPr>
           <w:p>
             <w:pPr>
@@ -1375,7 +1385,7 @@
         </w:tc>
         <w:tc>
           <w:tcPr>
-            <w:tcW w:type="dxa" w:w="3665"/>
+            <w:tcW w:type="dxa" w:w="3630"/>
           </w:tcPr>
           <w:p>
             <w:pPr>
@@ -1393,7 +1403,7 @@
         </w:tc>
         <w:tc>
           <w:tcPr>
-            <w:tcW w:type="dxa" w:w="932"/>
+            <w:tcW w:type="dxa" w:w="929"/>
           </w:tcPr>
           <w:p>
             <w:pPr>
@@ -1411,25 +1421,25 @@
         </w:tc>
         <w:tc>
           <w:tcPr>
-            <w:tcW w:type="dxa" w:w="4037"/>
-          </w:tcPr>
-          <w:p>
-            <w:pPr>
-              <w:spacing w:after="0" w:line="240" w:lineRule="auto"/>
-            </w:pPr>
-            <w:r>
-              <w:rPr>
-                <w:rFonts w:ascii="Aptos" w:hAnsi="Aptos"/>
-                <w:b w:val="0"/>
-                <w:sz w:val="18"/>
-              </w:rPr>
-              <w:t>Dedicated broker user from user-secrets; Inventory accepts only events HMAC-signed with a key shared by Product and Inventory</w:t>
-            </w:r>
-          </w:p>
-        </w:tc>
-        <w:tc>
-          <w:tcPr>
-            <w:tcW w:type="dxa" w:w="1044"/>
+            <w:tcW w:type="dxa" w:w="4093"/>
+          </w:tcPr>
+          <w:p>
+            <w:pPr>
+              <w:spacing w:after="0" w:line="240" w:lineRule="auto"/>
+            </w:pPr>
+            <w:r>
+              <w:rPr>
+                <w:rFonts w:ascii="Aptos" w:hAnsi="Aptos"/>
+                <w:b w:val="0"/>
+                <w:sz w:val="18"/>
+              </w:rPr>
+              <w:t>Own broker account (not guest) from user-secrets; Inventory accepts only events HMAC-signed with a key shared by Product and Inventory</w:t>
+            </w:r>
+          </w:p>
+        </w:tc>
+        <w:tc>
+          <w:tcPr>
+            <w:tcW w:type="dxa" w:w="1040"/>
           </w:tcPr>
           <w:p>
             <w:pPr>
@@ -1449,7 +1459,7 @@
       <w:tr>
         <w:tc>
           <w:tcPr>
-            <w:tcW w:type="dxa" w:w="470"/>
+            <w:tcW w:type="dxa" w:w="468"/>
           </w:tcPr>
           <w:p>
             <w:pPr>
@@ -1467,7 +1477,7 @@
         </w:tc>
         <w:tc>
           <w:tcPr>
-            <w:tcW w:type="dxa" w:w="1519"/>
+            <w:tcW w:type="dxa" w:w="1512"/>
           </w:tcPr>
           <w:p>
             <w:pPr>
@@ -1485,7 +1495,7 @@
         </w:tc>
         <w:tc>
           <w:tcPr>
-            <w:tcW w:type="dxa" w:w="1293"/>
+            <w:tcW w:type="dxa" w:w="1287"/>
           </w:tcPr>
           <w:p>
             <w:pPr>
@@ -1503,7 +1513,7 @@
         </w:tc>
         <w:tc>
           <w:tcPr>
-            <w:tcW w:type="dxa" w:w="3665"/>
+            <w:tcW w:type="dxa" w:w="3630"/>
           </w:tcPr>
           <w:p>
             <w:pPr>
@@ -1521,7 +1531,7 @@
         </w:tc>
         <w:tc>
           <w:tcPr>
-            <w:tcW w:type="dxa" w:w="932"/>
+            <w:tcW w:type="dxa" w:w="929"/>
           </w:tcPr>
           <w:p>
             <w:pPr>
@@ -1539,7 +1549,7 @@
         </w:tc>
         <w:tc>
           <w:tcPr>
-            <w:tcW w:type="dxa" w:w="4037"/>
+            <w:tcW w:type="dxa" w:w="4093"/>
           </w:tcPr>
           <w:p>
             <w:pPr>
@@ -1557,7 +1567,7 @@
         </w:tc>
         <w:tc>
           <w:tcPr>
-            <w:tcW w:type="dxa" w:w="1044"/>
+            <w:tcW w:type="dxa" w:w="1040"/>
           </w:tcPr>
           <w:p>
             <w:pPr>
@@ -1577,7 +1587,7 @@
       <w:tr>
         <w:tc>
           <w:tcPr>
-            <w:tcW w:type="dxa" w:w="470"/>
+            <w:tcW w:type="dxa" w:w="468"/>
           </w:tcPr>
           <w:p>
             <w:pPr>
@@ -1595,7 +1605,7 @@
         </w:tc>
         <w:tc>
           <w:tcPr>
-            <w:tcW w:type="dxa" w:w="1519"/>
+            <w:tcW w:type="dxa" w:w="1512"/>
           </w:tcPr>
           <w:p>
             <w:pPr>
@@ -1613,7 +1623,7 @@
         </w:tc>
         <w:tc>
           <w:tcPr>
-            <w:tcW w:type="dxa" w:w="1293"/>
+            <w:tcW w:type="dxa" w:w="1287"/>
           </w:tcPr>
           <w:p>
             <w:pPr>
@@ -1631,7 +1641,7 @@
         </w:tc>
         <w:tc>
           <w:tcPr>
-            <w:tcW w:type="dxa" w:w="3665"/>
+            <w:tcW w:type="dxa" w:w="3630"/>
           </w:tcPr>
           <w:p>
             <w:pPr>
@@ -1649,7 +1659,7 @@
         </w:tc>
         <w:tc>
           <w:tcPr>
-            <w:tcW w:type="dxa" w:w="932"/>
+            <w:tcW w:type="dxa" w:w="929"/>
           </w:tcPr>
           <w:p>
             <w:pPr>
@@ -1667,7 +1677,7 @@
         </w:tc>
         <w:tc>
           <w:tcPr>
-            <w:tcW w:type="dxa" w:w="4037"/>
+            <w:tcW w:type="dxa" w:w="4093"/>
           </w:tcPr>
           <w:p>
             <w:pPr>
@@ -1685,7 +1695,7 @@
         </w:tc>
         <w:tc>
           <w:tcPr>
-            <w:tcW w:type="dxa" w:w="1044"/>
+            <w:tcW w:type="dxa" w:w="1040"/>
           </w:tcPr>
           <w:p>
             <w:pPr>
@@ -1705,7 +1715,7 @@
       <w:tr>
         <w:tc>
           <w:tcPr>
-            <w:tcW w:type="dxa" w:w="470"/>
+            <w:tcW w:type="dxa" w:w="468"/>
           </w:tcPr>
           <w:p>
             <w:pPr>
@@ -1723,7 +1733,7 @@
         </w:tc>
         <w:tc>
           <w:tcPr>
-            <w:tcW w:type="dxa" w:w="1519"/>
+            <w:tcW w:type="dxa" w:w="1512"/>
           </w:tcPr>
           <w:p>
             <w:pPr>
@@ -1741,7 +1751,7 @@
         </w:tc>
         <w:tc>
           <w:tcPr>
-            <w:tcW w:type="dxa" w:w="1293"/>
+            <w:tcW w:type="dxa" w:w="1287"/>
           </w:tcPr>
           <w:p>
             <w:pPr>
@@ -1759,7 +1769,7 @@
         </w:tc>
         <w:tc>
           <w:tcPr>
-            <w:tcW w:type="dxa" w:w="3665"/>
+            <w:tcW w:type="dxa" w:w="3630"/>
           </w:tcPr>
           <w:p>
             <w:pPr>
@@ -1777,7 +1787,7 @@
         </w:tc>
         <w:tc>
           <w:tcPr>
-            <w:tcW w:type="dxa" w:w="932"/>
+            <w:tcW w:type="dxa" w:w="929"/>
           </w:tcPr>
           <w:p>
             <w:pPr>
@@ -1795,25 +1805,25 @@
         </w:tc>
         <w:tc>
           <w:tcPr>
-            <w:tcW w:type="dxa" w:w="4037"/>
-          </w:tcPr>
-          <w:p>
-            <w:pPr>
-              <w:spacing w:after="0" w:line="240" w:lineRule="auto"/>
-            </w:pPr>
-            <w:r>
-              <w:rPr>
-                <w:rFonts w:ascii="Aptos" w:hAnsi="Aptos"/>
-                <w:b w:val="0"/>
-                <w:sz w:val="18"/>
-              </w:rPr>
-              <w:t>HMAC over type + timestamp + body, checked in a consume filter; rejects go to the _error queue (done). AMQP over TLS with project CA cert, plain port closed (done). Replays within 5 min (planned)</w:t>
-            </w:r>
-          </w:p>
-        </w:tc>
-        <w:tc>
-          <w:tcPr>
-            <w:tcW w:type="dxa" w:w="1044"/>
+            <w:tcW w:type="dxa" w:w="4093"/>
+          </w:tcPr>
+          <w:p>
+            <w:pPr>
+              <w:spacing w:after="0" w:line="240" w:lineRule="auto"/>
+            </w:pPr>
+            <w:r>
+              <w:rPr>
+                <w:rFonts w:ascii="Aptos" w:hAnsi="Aptos"/>
+                <w:b w:val="0"/>
+                <w:sz w:val="18"/>
+              </w:rPr>
+              <w:t>HMAC over type + timestamp + serialized message, checked in a consume filter; rejects go to the _error queue (done). AMQP over TLS with project CA cert, plain port closed (done). Open: replays within 5 min; one key shared by Product and Inventory, so Inventory could also sign events. Planned: message ids, per-service keys</w:t>
+            </w:r>
+          </w:p>
+        </w:tc>
+        <w:tc>
+          <w:tcPr>
+            <w:tcW w:type="dxa" w:w="1040"/>
           </w:tcPr>
           <w:p>
             <w:pPr>
@@ -1833,7 +1843,7 @@
       <w:tr>
         <w:tc>
           <w:tcPr>
-            <w:tcW w:type="dxa" w:w="470"/>
+            <w:tcW w:type="dxa" w:w="468"/>
           </w:tcPr>
           <w:p>
             <w:pPr>
@@ -1851,7 +1861,7 @@
         </w:tc>
         <w:tc>
           <w:tcPr>
-            <w:tcW w:type="dxa" w:w="1519"/>
+            <w:tcW w:type="dxa" w:w="1512"/>
           </w:tcPr>
           <w:p>
             <w:pPr>
@@ -1869,7 +1879,7 @@
         </w:tc>
         <w:tc>
           <w:tcPr>
-            <w:tcW w:type="dxa" w:w="1293"/>
+            <w:tcW w:type="dxa" w:w="1287"/>
           </w:tcPr>
           <w:p>
             <w:pPr>
@@ -1887,7 +1897,7 @@
         </w:tc>
         <w:tc>
           <w:tcPr>
-            <w:tcW w:type="dxa" w:w="3665"/>
+            <w:tcW w:type="dxa" w:w="3630"/>
           </w:tcPr>
           <w:p>
             <w:pPr>
@@ -1905,7 +1915,7 @@
         </w:tc>
         <w:tc>
           <w:tcPr>
-            <w:tcW w:type="dxa" w:w="932"/>
+            <w:tcW w:type="dxa" w:w="929"/>
           </w:tcPr>
           <w:p>
             <w:pPr>
@@ -1923,7 +1933,7 @@
         </w:tc>
         <w:tc>
           <w:tcPr>
-            <w:tcW w:type="dxa" w:w="4037"/>
+            <w:tcW w:type="dxa" w:w="4093"/>
           </w:tcPr>
           <w:p>
             <w:pPr>
@@ -1941,7 +1951,7 @@
         </w:tc>
         <w:tc>
           <w:tcPr>
-            <w:tcW w:type="dxa" w:w="1044"/>
+            <w:tcW w:type="dxa" w:w="1040"/>
           </w:tcPr>
           <w:p>
             <w:pPr>
@@ -1961,7 +1971,7 @@
       <w:tr>
         <w:tc>
           <w:tcPr>
-            <w:tcW w:type="dxa" w:w="470"/>
+            <w:tcW w:type="dxa" w:w="468"/>
           </w:tcPr>
           <w:p>
             <w:pPr>
@@ -1979,7 +1989,7 @@
         </w:tc>
         <w:tc>
           <w:tcPr>
-            <w:tcW w:type="dxa" w:w="1519"/>
+            <w:tcW w:type="dxa" w:w="1512"/>
           </w:tcPr>
           <w:p>
             <w:pPr>
@@ -1997,7 +2007,7 @@
         </w:tc>
         <w:tc>
           <w:tcPr>
-            <w:tcW w:type="dxa" w:w="1293"/>
+            <w:tcW w:type="dxa" w:w="1287"/>
           </w:tcPr>
           <w:p>
             <w:pPr>
@@ -2015,7 +2025,7 @@
         </w:tc>
         <w:tc>
           <w:tcPr>
-            <w:tcW w:type="dxa" w:w="3665"/>
+            <w:tcW w:type="dxa" w:w="3630"/>
           </w:tcPr>
           <w:p>
             <w:pPr>
@@ -2033,7 +2043,7 @@
         </w:tc>
         <w:tc>
           <w:tcPr>
-            <w:tcW w:type="dxa" w:w="932"/>
+            <w:tcW w:type="dxa" w:w="929"/>
           </w:tcPr>
           <w:p>
             <w:pPr>
@@ -2051,7 +2061,7 @@
         </w:tc>
         <w:tc>
           <w:tcPr>
-            <w:tcW w:type="dxa" w:w="4037"/>
+            <w:tcW w:type="dxa" w:w="4093"/>
           </w:tcPr>
           <w:p>
             <w:pPr>
@@ -2069,7 +2079,7 @@
         </w:tc>
         <w:tc>
           <w:tcPr>
-            <w:tcW w:type="dxa" w:w="1044"/>
+            <w:tcW w:type="dxa" w:w="1040"/>
           </w:tcPr>
           <w:p>
             <w:pPr>
@@ -2089,7 +2099,7 @@
       <w:tr>
         <w:tc>
           <w:tcPr>
-            <w:tcW w:type="dxa" w:w="470"/>
+            <w:tcW w:type="dxa" w:w="468"/>
           </w:tcPr>
           <w:p>
             <w:pPr>
@@ -2107,7 +2117,7 @@
         </w:tc>
         <w:tc>
           <w:tcPr>
-            <w:tcW w:type="dxa" w:w="1519"/>
+            <w:tcW w:type="dxa" w:w="1512"/>
           </w:tcPr>
           <w:p>
             <w:pPr>
@@ -2125,7 +2135,7 @@
         </w:tc>
         <w:tc>
           <w:tcPr>
-            <w:tcW w:type="dxa" w:w="1293"/>
+            <w:tcW w:type="dxa" w:w="1287"/>
           </w:tcPr>
           <w:p>
             <w:pPr>
@@ -2143,7 +2153,7 @@
         </w:tc>
         <w:tc>
           <w:tcPr>
-            <w:tcW w:type="dxa" w:w="3665"/>
+            <w:tcW w:type="dxa" w:w="3630"/>
           </w:tcPr>
           <w:p>
             <w:pPr>
@@ -2161,7 +2171,7 @@
         </w:tc>
         <w:tc>
           <w:tcPr>
-            <w:tcW w:type="dxa" w:w="932"/>
+            <w:tcW w:type="dxa" w:w="929"/>
           </w:tcPr>
           <w:p>
             <w:pPr>
@@ -2179,7 +2189,7 @@
         </w:tc>
         <w:tc>
           <w:tcPr>
-            <w:tcW w:type="dxa" w:w="4037"/>
+            <w:tcW w:type="dxa" w:w="4093"/>
           </w:tcPr>
           <w:p>
             <w:pPr>
@@ -2197,7 +2207,7 @@
         </w:tc>
         <w:tc>
           <w:tcPr>
-            <w:tcW w:type="dxa" w:w="1044"/>
+            <w:tcW w:type="dxa" w:w="1040"/>
           </w:tcPr>
           <w:p>
             <w:pPr>
@@ -2217,7 +2227,7 @@
       <w:tr>
         <w:tc>
           <w:tcPr>
-            <w:tcW w:type="dxa" w:w="470"/>
+            <w:tcW w:type="dxa" w:w="468"/>
           </w:tcPr>
           <w:p>
             <w:pPr>
@@ -2235,7 +2245,7 @@
         </w:tc>
         <w:tc>
           <w:tcPr>
-            <w:tcW w:type="dxa" w:w="1519"/>
+            <w:tcW w:type="dxa" w:w="1512"/>
           </w:tcPr>
           <w:p>
             <w:pPr>
@@ -2253,7 +2263,7 @@
         </w:tc>
         <w:tc>
           <w:tcPr>
-            <w:tcW w:type="dxa" w:w="1293"/>
+            <w:tcW w:type="dxa" w:w="1287"/>
           </w:tcPr>
           <w:p>
             <w:pPr>
@@ -2271,7 +2281,7 @@
         </w:tc>
         <w:tc>
           <w:tcPr>
-            <w:tcW w:type="dxa" w:w="3665"/>
+            <w:tcW w:type="dxa" w:w="3630"/>
           </w:tcPr>
           <w:p>
             <w:pPr>
@@ -2289,7 +2299,7 @@
         </w:tc>
         <w:tc>
           <w:tcPr>
-            <w:tcW w:type="dxa" w:w="932"/>
+            <w:tcW w:type="dxa" w:w="929"/>
           </w:tcPr>
           <w:p>
             <w:pPr>
@@ -2307,7 +2317,7 @@
         </w:tc>
         <w:tc>
           <w:tcPr>
-            <w:tcW w:type="dxa" w:w="4037"/>
+            <w:tcW w:type="dxa" w:w="4093"/>
           </w:tcPr>
           <w:p>
             <w:pPr>
@@ -2325,7 +2335,7 @@
         </w:tc>
         <w:tc>
           <w:tcPr>
-            <w:tcW w:type="dxa" w:w="1044"/>
+            <w:tcW w:type="dxa" w:w="1040"/>
           </w:tcPr>
           <w:p>
             <w:pPr>
@@ -2345,7 +2355,7 @@
       <w:tr>
         <w:tc>
           <w:tcPr>
-            <w:tcW w:type="dxa" w:w="470"/>
+            <w:tcW w:type="dxa" w:w="468"/>
           </w:tcPr>
           <w:p>
             <w:pPr>
@@ -2363,7 +2373,7 @@
         </w:tc>
         <w:tc>
           <w:tcPr>
-            <w:tcW w:type="dxa" w:w="1519"/>
+            <w:tcW w:type="dxa" w:w="1512"/>
           </w:tcPr>
           <w:p>
             <w:pPr>
@@ -2381,7 +2391,7 @@
         </w:tc>
         <w:tc>
           <w:tcPr>
-            <w:tcW w:type="dxa" w:w="1293"/>
+            <w:tcW w:type="dxa" w:w="1287"/>
           </w:tcPr>
           <w:p>
             <w:pPr>
@@ -2399,7 +2409,7 @@
         </w:tc>
         <w:tc>
           <w:tcPr>
-            <w:tcW w:type="dxa" w:w="3665"/>
+            <w:tcW w:type="dxa" w:w="3630"/>
           </w:tcPr>
           <w:p>
             <w:pPr>
@@ -2417,7 +2427,7 @@
         </w:tc>
         <w:tc>
           <w:tcPr>
-            <w:tcW w:type="dxa" w:w="932"/>
+            <w:tcW w:type="dxa" w:w="929"/>
           </w:tcPr>
           <w:p>
             <w:pPr>
@@ -2435,7 +2445,7 @@
         </w:tc>
         <w:tc>
           <w:tcPr>
-            <w:tcW w:type="dxa" w:w="4037"/>
+            <w:tcW w:type="dxa" w:w="4093"/>
           </w:tcPr>
           <w:p>
             <w:pPr>
@@ -2453,7 +2463,7 @@
         </w:tc>
         <w:tc>
           <w:tcPr>
-            <w:tcW w:type="dxa" w:w="1044"/>
+            <w:tcW w:type="dxa" w:w="1040"/>
           </w:tcPr>
           <w:p>
             <w:pPr>
@@ -2473,7 +2483,7 @@
       <w:tr>
         <w:tc>
           <w:tcPr>
-            <w:tcW w:type="dxa" w:w="470"/>
+            <w:tcW w:type="dxa" w:w="468"/>
           </w:tcPr>
           <w:p>
             <w:pPr>
@@ -2491,7 +2501,7 @@
         </w:tc>
         <w:tc>
           <w:tcPr>
-            <w:tcW w:type="dxa" w:w="1519"/>
+            <w:tcW w:type="dxa" w:w="1512"/>
           </w:tcPr>
           <w:p>
             <w:pPr>
@@ -2509,7 +2519,7 @@
         </w:tc>
         <w:tc>
           <w:tcPr>
-            <w:tcW w:type="dxa" w:w="1293"/>
+            <w:tcW w:type="dxa" w:w="1287"/>
           </w:tcPr>
           <w:p>
             <w:pPr>
@@ -2527,7 +2537,7 @@
         </w:tc>
         <w:tc>
           <w:tcPr>
-            <w:tcW w:type="dxa" w:w="3665"/>
+            <w:tcW w:type="dxa" w:w="3630"/>
           </w:tcPr>
           <w:p>
             <w:pPr>
@@ -2545,7 +2555,7 @@
         </w:tc>
         <w:tc>
           <w:tcPr>
-            <w:tcW w:type="dxa" w:w="932"/>
+            <w:tcW w:type="dxa" w:w="929"/>
           </w:tcPr>
           <w:p>
             <w:pPr>
@@ -2563,7 +2573,7 @@
         </w:tc>
         <w:tc>
           <w:tcPr>
-            <w:tcW w:type="dxa" w:w="4037"/>
+            <w:tcW w:type="dxa" w:w="4093"/>
           </w:tcPr>
           <w:p>
             <w:pPr>
@@ -2581,7 +2591,7 @@
         </w:tc>
         <w:tc>
           <w:tcPr>
-            <w:tcW w:type="dxa" w:w="1044"/>
+            <w:tcW w:type="dxa" w:w="1040"/>
           </w:tcPr>
           <w:p>
             <w:pPr>
@@ -2601,7 +2611,7 @@
       <w:tr>
         <w:tc>
           <w:tcPr>
-            <w:tcW w:type="dxa" w:w="470"/>
+            <w:tcW w:type="dxa" w:w="468"/>
           </w:tcPr>
           <w:p>
             <w:pPr>
@@ -2619,7 +2629,7 @@
         </w:tc>
         <w:tc>
           <w:tcPr>
-            <w:tcW w:type="dxa" w:w="1519"/>
+            <w:tcW w:type="dxa" w:w="1512"/>
           </w:tcPr>
           <w:p>
             <w:pPr>
@@ -2637,7 +2647,7 @@
         </w:tc>
         <w:tc>
           <w:tcPr>
-            <w:tcW w:type="dxa" w:w="1293"/>
+            <w:tcW w:type="dxa" w:w="1287"/>
           </w:tcPr>
           <w:p>
             <w:pPr>
@@ -2655,7 +2665,7 @@
         </w:tc>
         <w:tc>
           <w:tcPr>
-            <w:tcW w:type="dxa" w:w="3665"/>
+            <w:tcW w:type="dxa" w:w="3630"/>
           </w:tcPr>
           <w:p>
             <w:pPr>
@@ -2673,7 +2683,7 @@
         </w:tc>
         <w:tc>
           <w:tcPr>
-            <w:tcW w:type="dxa" w:w="932"/>
+            <w:tcW w:type="dxa" w:w="929"/>
           </w:tcPr>
           <w:p>
             <w:pPr>
@@ -2691,7 +2701,7 @@
         </w:tc>
         <w:tc>
           <w:tcPr>
-            <w:tcW w:type="dxa" w:w="4037"/>
+            <w:tcW w:type="dxa" w:w="4093"/>
           </w:tcPr>
           <w:p>
             <w:pPr>
@@ -2709,7 +2719,7 @@
         </w:tc>
         <w:tc>
           <w:tcPr>
-            <w:tcW w:type="dxa" w:w="1044"/>
+            <w:tcW w:type="dxa" w:w="1040"/>
           </w:tcPr>
           <w:p>
             <w:pPr>
@@ -2729,7 +2739,7 @@
       <w:tr>
         <w:tc>
           <w:tcPr>
-            <w:tcW w:type="dxa" w:w="470"/>
+            <w:tcW w:type="dxa" w:w="468"/>
           </w:tcPr>
           <w:p>
             <w:pPr>
@@ -2747,7 +2757,7 @@
         </w:tc>
         <w:tc>
           <w:tcPr>
-            <w:tcW w:type="dxa" w:w="1519"/>
+            <w:tcW w:type="dxa" w:w="1512"/>
           </w:tcPr>
           <w:p>
             <w:pPr>
@@ -2765,7 +2775,7 @@
         </w:tc>
         <w:tc>
           <w:tcPr>
-            <w:tcW w:type="dxa" w:w="1293"/>
+            <w:tcW w:type="dxa" w:w="1287"/>
           </w:tcPr>
           <w:p>
             <w:pPr>
@@ -2783,7 +2793,7 @@
         </w:tc>
         <w:tc>
           <w:tcPr>
-            <w:tcW w:type="dxa" w:w="3665"/>
+            <w:tcW w:type="dxa" w:w="3630"/>
           </w:tcPr>
           <w:p>
             <w:pPr>
@@ -2801,7 +2811,7 @@
         </w:tc>
         <w:tc>
           <w:tcPr>
-            <w:tcW w:type="dxa" w:w="932"/>
+            <w:tcW w:type="dxa" w:w="929"/>
           </w:tcPr>
           <w:p>
             <w:pPr>
@@ -2819,7 +2829,7 @@
         </w:tc>
         <w:tc>
           <w:tcPr>
-            <w:tcW w:type="dxa" w:w="4037"/>
+            <w:tcW w:type="dxa" w:w="4093"/>
           </w:tcPr>
           <w:p>
             <w:pPr>
@@ -2837,7 +2847,7 @@
         </w:tc>
         <w:tc>
           <w:tcPr>
-            <w:tcW w:type="dxa" w:w="1044"/>
+            <w:tcW w:type="dxa" w:w="1040"/>
           </w:tcPr>
           <w:p>
             <w:pPr>
@@ -2857,7 +2867,7 @@
       <w:tr>
         <w:tc>
           <w:tcPr>
-            <w:tcW w:type="dxa" w:w="470"/>
+            <w:tcW w:type="dxa" w:w="468"/>
           </w:tcPr>
           <w:p>
             <w:pPr>
@@ -2875,7 +2885,7 @@
         </w:tc>
         <w:tc>
           <w:tcPr>
-            <w:tcW w:type="dxa" w:w="1519"/>
+            <w:tcW w:type="dxa" w:w="1512"/>
           </w:tcPr>
           <w:p>
             <w:pPr>
@@ -2893,7 +2903,7 @@
         </w:tc>
         <w:tc>
           <w:tcPr>
-            <w:tcW w:type="dxa" w:w="1293"/>
+            <w:tcW w:type="dxa" w:w="1287"/>
           </w:tcPr>
           <w:p>
             <w:pPr>
@@ -2911,7 +2921,7 @@
         </w:tc>
         <w:tc>
           <w:tcPr>
-            <w:tcW w:type="dxa" w:w="3665"/>
+            <w:tcW w:type="dxa" w:w="3630"/>
           </w:tcPr>
           <w:p>
             <w:pPr>
@@ -2929,7 +2939,7 @@
         </w:tc>
         <w:tc>
           <w:tcPr>
-            <w:tcW w:type="dxa" w:w="932"/>
+            <w:tcW w:type="dxa" w:w="929"/>
           </w:tcPr>
           <w:p>
             <w:pPr>
@@ -2947,7 +2957,7 @@
         </w:tc>
         <w:tc>
           <w:tcPr>
-            <w:tcW w:type="dxa" w:w="4037"/>
+            <w:tcW w:type="dxa" w:w="4093"/>
           </w:tcPr>
           <w:p>
             <w:pPr>
@@ -2965,7 +2975,7 @@
         </w:tc>
         <w:tc>
           <w:tcPr>
-            <w:tcW w:type="dxa" w:w="1044"/>
+            <w:tcW w:type="dxa" w:w="1040"/>
           </w:tcPr>
           <w:p>
             <w:pPr>
@@ -2985,7 +2995,7 @@
       <w:tr>
         <w:tc>
           <w:tcPr>
-            <w:tcW w:type="dxa" w:w="470"/>
+            <w:tcW w:type="dxa" w:w="468"/>
           </w:tcPr>
           <w:p>
             <w:pPr>
@@ -3003,7 +3013,7 @@
         </w:tc>
         <w:tc>
           <w:tcPr>
-            <w:tcW w:type="dxa" w:w="1519"/>
+            <w:tcW w:type="dxa" w:w="1512"/>
           </w:tcPr>
           <w:p>
             <w:pPr>
@@ -3021,7 +3031,7 @@
         </w:tc>
         <w:tc>
           <w:tcPr>
-            <w:tcW w:type="dxa" w:w="1293"/>
+            <w:tcW w:type="dxa" w:w="1287"/>
           </w:tcPr>
           <w:p>
             <w:pPr>
@@ -3039,7 +3049,7 @@
         </w:tc>
         <w:tc>
           <w:tcPr>
-            <w:tcW w:type="dxa" w:w="3665"/>
+            <w:tcW w:type="dxa" w:w="3630"/>
           </w:tcPr>
           <w:p>
             <w:pPr>
@@ -3057,7 +3067,7 @@
         </w:tc>
         <w:tc>
           <w:tcPr>
-            <w:tcW w:type="dxa" w:w="932"/>
+            <w:tcW w:type="dxa" w:w="929"/>
           </w:tcPr>
           <w:p>
             <w:pPr>
@@ -3075,7 +3085,7 @@
         </w:tc>
         <w:tc>
           <w:tcPr>
-            <w:tcW w:type="dxa" w:w="4037"/>
+            <w:tcW w:type="dxa" w:w="4093"/>
           </w:tcPr>
           <w:p>
             <w:pPr>
@@ -3093,7 +3103,7 @@
         </w:tc>
         <w:tc>
           <w:tcPr>
-            <w:tcW w:type="dxa" w:w="1044"/>
+            <w:tcW w:type="dxa" w:w="1040"/>
           </w:tcPr>
           <w:p>
             <w:pPr>
@@ -3113,7 +3123,7 @@
       <w:tr>
         <w:tc>
           <w:tcPr>
-            <w:tcW w:type="dxa" w:w="470"/>
+            <w:tcW w:type="dxa" w:w="468"/>
           </w:tcPr>
           <w:p>
             <w:pPr>
@@ -3131,7 +3141,7 @@
         </w:tc>
         <w:tc>
           <w:tcPr>
-            <w:tcW w:type="dxa" w:w="1519"/>
+            <w:tcW w:type="dxa" w:w="1512"/>
           </w:tcPr>
           <w:p>
             <w:pPr>
@@ -3149,7 +3159,7 @@
         </w:tc>
         <w:tc>
           <w:tcPr>
-            <w:tcW w:type="dxa" w:w="1293"/>
+            <w:tcW w:type="dxa" w:w="1287"/>
           </w:tcPr>
           <w:p>
             <w:pPr>
@@ -3167,7 +3177,7 @@
         </w:tc>
         <w:tc>
           <w:tcPr>
-            <w:tcW w:type="dxa" w:w="3665"/>
+            <w:tcW w:type="dxa" w:w="3630"/>
           </w:tcPr>
           <w:p>
             <w:pPr>
@@ -3185,7 +3195,7 @@
         </w:tc>
         <w:tc>
           <w:tcPr>
-            <w:tcW w:type="dxa" w:w="932"/>
+            <w:tcW w:type="dxa" w:w="929"/>
           </w:tcPr>
           <w:p>
             <w:pPr>
@@ -3203,7 +3213,7 @@
         </w:tc>
         <w:tc>
           <w:tcPr>
-            <w:tcW w:type="dxa" w:w="4037"/>
+            <w:tcW w:type="dxa" w:w="4093"/>
           </w:tcPr>
           <w:p>
             <w:pPr>
@@ -3221,7 +3231,7 @@
         </w:tc>
         <w:tc>
           <w:tcPr>
-            <w:tcW w:type="dxa" w:w="1044"/>
+            <w:tcW w:type="dxa" w:w="1040"/>
           </w:tcPr>
           <w:p>
             <w:pPr>
@@ -3241,7 +3251,7 @@
       <w:tr>
         <w:tc>
           <w:tcPr>
-            <w:tcW w:type="dxa" w:w="470"/>
+            <w:tcW w:type="dxa" w:w="468"/>
           </w:tcPr>
           <w:p>
             <w:pPr>
@@ -3259,7 +3269,7 @@
         </w:tc>
         <w:tc>
           <w:tcPr>
-            <w:tcW w:type="dxa" w:w="1519"/>
+            <w:tcW w:type="dxa" w:w="1512"/>
           </w:tcPr>
           <w:p>
             <w:pPr>
@@ -3277,7 +3287,7 @@
         </w:tc>
         <w:tc>
           <w:tcPr>
-            <w:tcW w:type="dxa" w:w="1293"/>
+            <w:tcW w:type="dxa" w:w="1287"/>
           </w:tcPr>
           <w:p>
             <w:pPr>
@@ -3295,7 +3305,7 @@
         </w:tc>
         <w:tc>
           <w:tcPr>
-            <w:tcW w:type="dxa" w:w="3665"/>
+            <w:tcW w:type="dxa" w:w="3630"/>
           </w:tcPr>
           <w:p>
             <w:pPr>
@@ -3313,7 +3323,7 @@
         </w:tc>
         <w:tc>
           <w:tcPr>
-            <w:tcW w:type="dxa" w:w="932"/>
+            <w:tcW w:type="dxa" w:w="929"/>
           </w:tcPr>
           <w:p>
             <w:pPr>
@@ -3331,7 +3341,7 @@
         </w:tc>
         <w:tc>
           <w:tcPr>
-            <w:tcW w:type="dxa" w:w="4037"/>
+            <w:tcW w:type="dxa" w:w="4093"/>
           </w:tcPr>
           <w:p>
             <w:pPr>
@@ -3349,7 +3359,7 @@
         </w:tc>
         <w:tc>
           <w:tcPr>
-            <w:tcW w:type="dxa" w:w="1044"/>
+            <w:tcW w:type="dxa" w:w="1040"/>
           </w:tcPr>
           <w:p>
             <w:pPr>
@@ -3369,7 +3379,7 @@
       <w:tr>
         <w:tc>
           <w:tcPr>
-            <w:tcW w:type="dxa" w:w="470"/>
+            <w:tcW w:type="dxa" w:w="468"/>
           </w:tcPr>
           <w:p>
             <w:pPr>
@@ -3387,7 +3397,7 @@
         </w:tc>
         <w:tc>
           <w:tcPr>
-            <w:tcW w:type="dxa" w:w="1519"/>
+            <w:tcW w:type="dxa" w:w="1512"/>
           </w:tcPr>
           <w:p>
             <w:pPr>
@@ -3405,7 +3415,7 @@
         </w:tc>
         <w:tc>
           <w:tcPr>
-            <w:tcW w:type="dxa" w:w="1293"/>
+            <w:tcW w:type="dxa" w:w="1287"/>
           </w:tcPr>
           <w:p>
             <w:pPr>
@@ -3423,7 +3433,7 @@
         </w:tc>
         <w:tc>
           <w:tcPr>
-            <w:tcW w:type="dxa" w:w="3665"/>
+            <w:tcW w:type="dxa" w:w="3630"/>
           </w:tcPr>
           <w:p>
             <w:pPr>
@@ -3441,7 +3451,7 @@
         </w:tc>
         <w:tc>
           <w:tcPr>
-            <w:tcW w:type="dxa" w:w="932"/>
+            <w:tcW w:type="dxa" w:w="929"/>
           </w:tcPr>
           <w:p>
             <w:pPr>
@@ -3459,7 +3469,7 @@
         </w:tc>
         <w:tc>
           <w:tcPr>
-            <w:tcW w:type="dxa" w:w="4037"/>
+            <w:tcW w:type="dxa" w:w="4093"/>
           </w:tcPr>
           <w:p>
             <w:pPr>
@@ -3477,7 +3487,7 @@
         </w:tc>
         <w:tc>
           <w:tcPr>
-            <w:tcW w:type="dxa" w:w="1044"/>
+            <w:tcW w:type="dxa" w:w="1040"/>
           </w:tcPr>
           <w:p>
             <w:pPr>
@@ -3497,7 +3507,7 @@
       <w:tr>
         <w:tc>
           <w:tcPr>
-            <w:tcW w:type="dxa" w:w="470"/>
+            <w:tcW w:type="dxa" w:w="468"/>
           </w:tcPr>
           <w:p>
             <w:pPr>
@@ -3515,7 +3525,7 @@
         </w:tc>
         <w:tc>
           <w:tcPr>
-            <w:tcW w:type="dxa" w:w="1519"/>
+            <w:tcW w:type="dxa" w:w="1512"/>
           </w:tcPr>
           <w:p>
             <w:pPr>
@@ -3533,7 +3543,7 @@
         </w:tc>
         <w:tc>
           <w:tcPr>
-            <w:tcW w:type="dxa" w:w="1293"/>
+            <w:tcW w:type="dxa" w:w="1287"/>
           </w:tcPr>
           <w:p>
             <w:pPr>
@@ -3551,7 +3561,7 @@
         </w:tc>
         <w:tc>
           <w:tcPr>
-            <w:tcW w:type="dxa" w:w="3665"/>
+            <w:tcW w:type="dxa" w:w="3630"/>
           </w:tcPr>
           <w:p>
             <w:pPr>
@@ -3569,7 +3579,7 @@
         </w:tc>
         <w:tc>
           <w:tcPr>
-            <w:tcW w:type="dxa" w:w="932"/>
+            <w:tcW w:type="dxa" w:w="929"/>
           </w:tcPr>
           <w:p>
             <w:pPr>
@@ -3587,7 +3597,7 @@
         </w:tc>
         <w:tc>
           <w:tcPr>
-            <w:tcW w:type="dxa" w:w="4037"/>
+            <w:tcW w:type="dxa" w:w="4093"/>
           </w:tcPr>
           <w:p>
             <w:pPr>
@@ -3605,7 +3615,7 @@
         </w:tc>
         <w:tc>
           <w:tcPr>
-            <w:tcW w:type="dxa" w:w="1044"/>
+            <w:tcW w:type="dxa" w:w="1040"/>
           </w:tcPr>
           <w:p>
             <w:pPr>
@@ -3625,7 +3635,7 @@
       <w:tr>
         <w:tc>
           <w:tcPr>
-            <w:tcW w:type="dxa" w:w="470"/>
+            <w:tcW w:type="dxa" w:w="468"/>
           </w:tcPr>
           <w:p>
             <w:pPr>
@@ -3643,7 +3653,7 @@
         </w:tc>
         <w:tc>
           <w:tcPr>
-            <w:tcW w:type="dxa" w:w="1519"/>
+            <w:tcW w:type="dxa" w:w="1512"/>
           </w:tcPr>
           <w:p>
             <w:pPr>
@@ -3661,7 +3671,7 @@
         </w:tc>
         <w:tc>
           <w:tcPr>
-            <w:tcW w:type="dxa" w:w="1293"/>
+            <w:tcW w:type="dxa" w:w="1287"/>
           </w:tcPr>
           <w:p>
             <w:pPr>
@@ -3679,7 +3689,7 @@
         </w:tc>
         <w:tc>
           <w:tcPr>
-            <w:tcW w:type="dxa" w:w="3665"/>
+            <w:tcW w:type="dxa" w:w="3630"/>
           </w:tcPr>
           <w:p>
             <w:pPr>
@@ -3697,7 +3707,7 @@
         </w:tc>
         <w:tc>
           <w:tcPr>
-            <w:tcW w:type="dxa" w:w="932"/>
+            <w:tcW w:type="dxa" w:w="929"/>
           </w:tcPr>
           <w:p>
             <w:pPr>
@@ -3715,7 +3725,7 @@
         </w:tc>
         <w:tc>
           <w:tcPr>
-            <w:tcW w:type="dxa" w:w="4037"/>
+            <w:tcW w:type="dxa" w:w="4093"/>
           </w:tcPr>
           <w:p>
             <w:pPr>
@@ -3733,7 +3743,7 @@
         </w:tc>
         <w:tc>
           <w:tcPr>
-            <w:tcW w:type="dxa" w:w="1044"/>
+            <w:tcW w:type="dxa" w:w="1040"/>
           </w:tcPr>
           <w:p>
             <w:pPr>
@@ -3753,7 +3763,7 @@
       <w:tr>
         <w:tc>
           <w:tcPr>
-            <w:tcW w:type="dxa" w:w="470"/>
+            <w:tcW w:type="dxa" w:w="468"/>
           </w:tcPr>
           <w:p>
             <w:pPr>
@@ -3771,7 +3781,7 @@
         </w:tc>
         <w:tc>
           <w:tcPr>
-            <w:tcW w:type="dxa" w:w="1519"/>
+            <w:tcW w:type="dxa" w:w="1512"/>
           </w:tcPr>
           <w:p>
             <w:pPr>
@@ -3789,7 +3799,7 @@
         </w:tc>
         <w:tc>
           <w:tcPr>
-            <w:tcW w:type="dxa" w:w="1293"/>
+            <w:tcW w:type="dxa" w:w="1287"/>
           </w:tcPr>
           <w:p>
             <w:pPr>
@@ -3807,7 +3817,7 @@
         </w:tc>
         <w:tc>
           <w:tcPr>
-            <w:tcW w:type="dxa" w:w="3665"/>
+            <w:tcW w:type="dxa" w:w="3630"/>
           </w:tcPr>
           <w:p>
             <w:pPr>
@@ -3825,7 +3835,7 @@
         </w:tc>
         <w:tc>
           <w:tcPr>
-            <w:tcW w:type="dxa" w:w="932"/>
+            <w:tcW w:type="dxa" w:w="929"/>
           </w:tcPr>
           <w:p>
             <w:pPr>
@@ -3843,7 +3853,7 @@
         </w:tc>
         <w:tc>
           <w:tcPr>
-            <w:tcW w:type="dxa" w:w="4037"/>
+            <w:tcW w:type="dxa" w:w="4093"/>
           </w:tcPr>
           <w:p>
             <w:pPr>
@@ -3861,7 +3871,7 @@
         </w:tc>
         <w:tc>
           <w:tcPr>
-            <w:tcW w:type="dxa" w:w="1044"/>
+            <w:tcW w:type="dxa" w:w="1040"/>
           </w:tcPr>
           <w:p>
             <w:pPr>
@@ -3881,7 +3891,7 @@
       <w:tr>
         <w:tc>
           <w:tcPr>
-            <w:tcW w:type="dxa" w:w="470"/>
+            <w:tcW w:type="dxa" w:w="468"/>
           </w:tcPr>
           <w:p>
             <w:pPr>
@@ -3899,7 +3909,7 @@
         </w:tc>
         <w:tc>
           <w:tcPr>
-            <w:tcW w:type="dxa" w:w="1519"/>
+            <w:tcW w:type="dxa" w:w="1512"/>
           </w:tcPr>
           <w:p>
             <w:pPr>
@@ -3917,7 +3927,7 @@
         </w:tc>
         <w:tc>
           <w:tcPr>
-            <w:tcW w:type="dxa" w:w="1293"/>
+            <w:tcW w:type="dxa" w:w="1287"/>
           </w:tcPr>
           <w:p>
             <w:pPr>
@@ -3935,7 +3945,7 @@
         </w:tc>
         <w:tc>
           <w:tcPr>
-            <w:tcW w:type="dxa" w:w="3665"/>
+            <w:tcW w:type="dxa" w:w="3630"/>
           </w:tcPr>
           <w:p>
             <w:pPr>
@@ -3953,7 +3963,7 @@
         </w:tc>
         <w:tc>
           <w:tcPr>
-            <w:tcW w:type="dxa" w:w="932"/>
+            <w:tcW w:type="dxa" w:w="929"/>
           </w:tcPr>
           <w:p>
             <w:pPr>
@@ -3971,7 +3981,7 @@
         </w:tc>
         <w:tc>
           <w:tcPr>
-            <w:tcW w:type="dxa" w:w="4037"/>
+            <w:tcW w:type="dxa" w:w="4093"/>
           </w:tcPr>
           <w:p>
             <w:pPr>
@@ -3989,7 +3999,7 @@
         </w:tc>
         <w:tc>
           <w:tcPr>
-            <w:tcW w:type="dxa" w:w="1044"/>
+            <w:tcW w:type="dxa" w:w="1040"/>
           </w:tcPr>
           <w:p>
             <w:pPr>
@@ -4009,7 +4019,7 @@
       <w:tr>
         <w:tc>
           <w:tcPr>
-            <w:tcW w:type="dxa" w:w="470"/>
+            <w:tcW w:type="dxa" w:w="468"/>
           </w:tcPr>
           <w:p>
             <w:pPr>
@@ -4027,7 +4037,7 @@
         </w:tc>
         <w:tc>
           <w:tcPr>
-            <w:tcW w:type="dxa" w:w="1519"/>
+            <w:tcW w:type="dxa" w:w="1512"/>
           </w:tcPr>
           <w:p>
             <w:pPr>
@@ -4045,7 +4055,7 @@
         </w:tc>
         <w:tc>
           <w:tcPr>
-            <w:tcW w:type="dxa" w:w="1293"/>
+            <w:tcW w:type="dxa" w:w="1287"/>
           </w:tcPr>
           <w:p>
             <w:pPr>
@@ -4063,7 +4073,7 @@
         </w:tc>
         <w:tc>
           <w:tcPr>
-            <w:tcW w:type="dxa" w:w="3665"/>
+            <w:tcW w:type="dxa" w:w="3630"/>
           </w:tcPr>
           <w:p>
             <w:pPr>
@@ -4081,7 +4091,7 @@
         </w:tc>
         <w:tc>
           <w:tcPr>
-            <w:tcW w:type="dxa" w:w="932"/>
+            <w:tcW w:type="dxa" w:w="929"/>
           </w:tcPr>
           <w:p>
             <w:pPr>
@@ -4099,7 +4109,7 @@
         </w:tc>
         <w:tc>
           <w:tcPr>
-            <w:tcW w:type="dxa" w:w="4037"/>
+            <w:tcW w:type="dxa" w:w="4093"/>
           </w:tcPr>
           <w:p>
             <w:pPr>
@@ -4117,7 +4127,7 @@
         </w:tc>
         <w:tc>
           <w:tcPr>
-            <w:tcW w:type="dxa" w:w="1044"/>
+            <w:tcW w:type="dxa" w:w="1040"/>
           </w:tcPr>
           <w:p>
             <w:pPr>
@@ -4181,7 +4191,7 @@
         </w:tc>
         <w:tc>
           <w:tcPr>
-            <w:tcW w:type="dxa" w:w="1083"/>
+            <w:tcW w:type="dxa" w:w="1080"/>
           </w:tcPr>
           <w:p>
             <w:pPr>
@@ -4199,7 +4209,7 @@
         </w:tc>
         <w:tc>
           <w:tcPr>
-            <w:tcW w:type="dxa" w:w="5039"/>
+            <w:tcW w:type="dxa" w:w="5045"/>
           </w:tcPr>
           <w:p>
             <w:pPr>
@@ -4217,7 +4227,7 @@
         </w:tc>
         <w:tc>
           <w:tcPr>
-            <w:tcW w:type="dxa" w:w="2616"/>
+            <w:tcW w:type="dxa" w:w="2613"/>
           </w:tcPr>
           <w:p>
             <w:pPr>
@@ -4235,7 +4245,7 @@
         </w:tc>
         <w:tc>
           <w:tcPr>
-            <w:tcW w:type="dxa" w:w="3454"/>
+            <w:tcW w:type="dxa" w:w="3453"/>
           </w:tcPr>
           <w:p>
             <w:pPr>
@@ -4273,7 +4283,7 @@
         </w:tc>
         <w:tc>
           <w:tcPr>
-            <w:tcW w:type="dxa" w:w="1083"/>
+            <w:tcW w:type="dxa" w:w="1080"/>
           </w:tcPr>
           <w:p>
             <w:pPr>
@@ -4291,7 +4301,7 @@
         </w:tc>
         <w:tc>
           <w:tcPr>
-            <w:tcW w:type="dxa" w:w="5039"/>
+            <w:tcW w:type="dxa" w:w="5045"/>
           </w:tcPr>
           <w:p>
             <w:pPr>
@@ -4309,7 +4319,7 @@
         </w:tc>
         <w:tc>
           <w:tcPr>
-            <w:tcW w:type="dxa" w:w="2616"/>
+            <w:tcW w:type="dxa" w:w="2613"/>
           </w:tcPr>
           <w:p>
             <w:pPr>
@@ -4327,7 +4337,7 @@
         </w:tc>
         <w:tc>
           <w:tcPr>
-            <w:tcW w:type="dxa" w:w="3454"/>
+            <w:tcW w:type="dxa" w:w="3453"/>
           </w:tcPr>
           <w:p>
             <w:pPr>
@@ -4365,7 +4375,7 @@
         </w:tc>
         <w:tc>
           <w:tcPr>
-            <w:tcW w:type="dxa" w:w="1083"/>
+            <w:tcW w:type="dxa" w:w="1080"/>
           </w:tcPr>
           <w:p>
             <w:pPr>
@@ -4383,7 +4393,7 @@
         </w:tc>
         <w:tc>
           <w:tcPr>
-            <w:tcW w:type="dxa" w:w="5039"/>
+            <w:tcW w:type="dxa" w:w="5045"/>
           </w:tcPr>
           <w:p>
             <w:pPr>
@@ -4401,7 +4411,7 @@
         </w:tc>
         <w:tc>
           <w:tcPr>
-            <w:tcW w:type="dxa" w:w="2616"/>
+            <w:tcW w:type="dxa" w:w="2613"/>
           </w:tcPr>
           <w:p>
             <w:pPr>
@@ -4419,7 +4429,7 @@
         </w:tc>
         <w:tc>
           <w:tcPr>
-            <w:tcW w:type="dxa" w:w="3454"/>
+            <w:tcW w:type="dxa" w:w="3453"/>
           </w:tcPr>
           <w:p>
             <w:pPr>
@@ -4457,7 +4467,7 @@
         </w:tc>
         <w:tc>
           <w:tcPr>
-            <w:tcW w:type="dxa" w:w="1083"/>
+            <w:tcW w:type="dxa" w:w="1080"/>
           </w:tcPr>
           <w:p>
             <w:pPr>
@@ -4475,7 +4485,7 @@
         </w:tc>
         <w:tc>
           <w:tcPr>
-            <w:tcW w:type="dxa" w:w="5039"/>
+            <w:tcW w:type="dxa" w:w="5045"/>
           </w:tcPr>
           <w:p>
             <w:pPr>
@@ -4493,7 +4503,7 @@
         </w:tc>
         <w:tc>
           <w:tcPr>
-            <w:tcW w:type="dxa" w:w="2616"/>
+            <w:tcW w:type="dxa" w:w="2613"/>
           </w:tcPr>
           <w:p>
             <w:pPr>
@@ -4511,7 +4521,7 @@
         </w:tc>
         <w:tc>
           <w:tcPr>
-            <w:tcW w:type="dxa" w:w="3454"/>
+            <w:tcW w:type="dxa" w:w="3453"/>
           </w:tcPr>
           <w:p>
             <w:pPr>
@@ -4549,7 +4559,7 @@
         </w:tc>
         <w:tc>
           <w:tcPr>
-            <w:tcW w:type="dxa" w:w="1083"/>
+            <w:tcW w:type="dxa" w:w="1080"/>
           </w:tcPr>
           <w:p>
             <w:pPr>
@@ -4567,7 +4577,7 @@
         </w:tc>
         <w:tc>
           <w:tcPr>
-            <w:tcW w:type="dxa" w:w="5039"/>
+            <w:tcW w:type="dxa" w:w="5045"/>
           </w:tcPr>
           <w:p>
             <w:pPr>
@@ -4585,7 +4595,7 @@
         </w:tc>
         <w:tc>
           <w:tcPr>
-            <w:tcW w:type="dxa" w:w="2616"/>
+            <w:tcW w:type="dxa" w:w="2613"/>
           </w:tcPr>
           <w:p>
             <w:pPr>
@@ -4603,7 +4613,7 @@
         </w:tc>
         <w:tc>
           <w:tcPr>
-            <w:tcW w:type="dxa" w:w="3454"/>
+            <w:tcW w:type="dxa" w:w="3453"/>
           </w:tcPr>
           <w:p>
             <w:pPr>
@@ -4641,7 +4651,7 @@
         </w:tc>
         <w:tc>
           <w:tcPr>
-            <w:tcW w:type="dxa" w:w="1083"/>
+            <w:tcW w:type="dxa" w:w="1080"/>
           </w:tcPr>
           <w:p>
             <w:pPr>
@@ -4659,7 +4669,7 @@
         </w:tc>
         <w:tc>
           <w:tcPr>
-            <w:tcW w:type="dxa" w:w="5039"/>
+            <w:tcW w:type="dxa" w:w="5045"/>
           </w:tcPr>
           <w:p>
             <w:pPr>
@@ -4677,7 +4687,7 @@
         </w:tc>
         <w:tc>
           <w:tcPr>
-            <w:tcW w:type="dxa" w:w="2616"/>
+            <w:tcW w:type="dxa" w:w="2613"/>
           </w:tcPr>
           <w:p>
             <w:pPr>
@@ -4695,7 +4705,7 @@
         </w:tc>
         <w:tc>
           <w:tcPr>
-            <w:tcW w:type="dxa" w:w="3454"/>
+            <w:tcW w:type="dxa" w:w="3453"/>
           </w:tcPr>
           <w:p>
             <w:pPr>
@@ -4733,7 +4743,7 @@
         </w:tc>
         <w:tc>
           <w:tcPr>
-            <w:tcW w:type="dxa" w:w="1083"/>
+            <w:tcW w:type="dxa" w:w="1080"/>
           </w:tcPr>
           <w:p>
             <w:pPr>
@@ -4751,7 +4761,7 @@
         </w:tc>
         <w:tc>
           <w:tcPr>
-            <w:tcW w:type="dxa" w:w="5039"/>
+            <w:tcW w:type="dxa" w:w="5045"/>
           </w:tcPr>
           <w:p>
             <w:pPr>
@@ -4769,7 +4779,7 @@
         </w:tc>
         <w:tc>
           <w:tcPr>
-            <w:tcW w:type="dxa" w:w="2616"/>
+            <w:tcW w:type="dxa" w:w="2613"/>
           </w:tcPr>
           <w:p>
             <w:pPr>
@@ -4787,7 +4797,7 @@
         </w:tc>
         <w:tc>
           <w:tcPr>
-            <w:tcW w:type="dxa" w:w="3454"/>
+            <w:tcW w:type="dxa" w:w="3453"/>
           </w:tcPr>
           <w:p>
             <w:pPr>
@@ -4825,7 +4835,7 @@
         </w:tc>
         <w:tc>
           <w:tcPr>
-            <w:tcW w:type="dxa" w:w="1083"/>
+            <w:tcW w:type="dxa" w:w="1080"/>
           </w:tcPr>
           <w:p>
             <w:pPr>
@@ -4843,7 +4853,7 @@
         </w:tc>
         <w:tc>
           <w:tcPr>
-            <w:tcW w:type="dxa" w:w="5039"/>
+            <w:tcW w:type="dxa" w:w="5045"/>
           </w:tcPr>
           <w:p>
             <w:pPr>
@@ -4861,7 +4871,7 @@
         </w:tc>
         <w:tc>
           <w:tcPr>
-            <w:tcW w:type="dxa" w:w="2616"/>
+            <w:tcW w:type="dxa" w:w="2613"/>
           </w:tcPr>
           <w:p>
             <w:pPr>
@@ -4879,7 +4889,7 @@
         </w:tc>
         <w:tc>
           <w:tcPr>
-            <w:tcW w:type="dxa" w:w="3454"/>
+            <w:tcW w:type="dxa" w:w="3453"/>
           </w:tcPr>
           <w:p>
             <w:pPr>
@@ -4917,7 +4927,7 @@
         </w:tc>
         <w:tc>
           <w:tcPr>
-            <w:tcW w:type="dxa" w:w="1083"/>
+            <w:tcW w:type="dxa" w:w="1080"/>
           </w:tcPr>
           <w:p>
             <w:pPr>
@@ -4935,7 +4945,7 @@
         </w:tc>
         <w:tc>
           <w:tcPr>
-            <w:tcW w:type="dxa" w:w="5039"/>
+            <w:tcW w:type="dxa" w:w="5045"/>
           </w:tcPr>
           <w:p>
             <w:pPr>
@@ -4953,7 +4963,7 @@
         </w:tc>
         <w:tc>
           <w:tcPr>
-            <w:tcW w:type="dxa" w:w="2616"/>
+            <w:tcW w:type="dxa" w:w="2613"/>
           </w:tcPr>
           <w:p>
             <w:pPr>
@@ -4971,7 +4981,7 @@
         </w:tc>
         <w:tc>
           <w:tcPr>
-            <w:tcW w:type="dxa" w:w="3454"/>
+            <w:tcW w:type="dxa" w:w="3453"/>
           </w:tcPr>
           <w:p>
             <w:pPr>
@@ -5009,7 +5019,7 @@
         </w:tc>
         <w:tc>
           <w:tcPr>
-            <w:tcW w:type="dxa" w:w="1083"/>
+            <w:tcW w:type="dxa" w:w="1080"/>
           </w:tcPr>
           <w:p>
             <w:pPr>
@@ -5027,7 +5037,7 @@
         </w:tc>
         <w:tc>
           <w:tcPr>
-            <w:tcW w:type="dxa" w:w="5039"/>
+            <w:tcW w:type="dxa" w:w="5045"/>
           </w:tcPr>
           <w:p>
             <w:pPr>
@@ -5045,7 +5055,7 @@
         </w:tc>
         <w:tc>
           <w:tcPr>
-            <w:tcW w:type="dxa" w:w="2616"/>
+            <w:tcW w:type="dxa" w:w="2613"/>
           </w:tcPr>
           <w:p>
             <w:pPr>
@@ -5063,7 +5073,7 @@
         </w:tc>
         <w:tc>
           <w:tcPr>
-            <w:tcW w:type="dxa" w:w="3454"/>
+            <w:tcW w:type="dxa" w:w="3453"/>
           </w:tcPr>
           <w:p>
             <w:pPr>
@@ -5101,7 +5111,7 @@
         </w:tc>
         <w:tc>
           <w:tcPr>
-            <w:tcW w:type="dxa" w:w="1083"/>
+            <w:tcW w:type="dxa" w:w="1080"/>
           </w:tcPr>
           <w:p>
             <w:pPr>
@@ -5119,7 +5129,7 @@
         </w:tc>
         <w:tc>
           <w:tcPr>
-            <w:tcW w:type="dxa" w:w="5039"/>
+            <w:tcW w:type="dxa" w:w="5045"/>
           </w:tcPr>
           <w:p>
             <w:pPr>
@@ -5137,7 +5147,7 @@
         </w:tc>
         <w:tc>
           <w:tcPr>
-            <w:tcW w:type="dxa" w:w="2616"/>
+            <w:tcW w:type="dxa" w:w="2613"/>
           </w:tcPr>
           <w:p>
             <w:pPr>
@@ -5155,7 +5165,7 @@
         </w:tc>
         <w:tc>
           <w:tcPr>
-            <w:tcW w:type="dxa" w:w="3454"/>
+            <w:tcW w:type="dxa" w:w="3453"/>
           </w:tcPr>
           <w:p>
             <w:pPr>
@@ -5193,7 +5203,7 @@
         </w:tc>
         <w:tc>
           <w:tcPr>
-            <w:tcW w:type="dxa" w:w="1083"/>
+            <w:tcW w:type="dxa" w:w="1080"/>
           </w:tcPr>
           <w:p>
             <w:pPr>
@@ -5211,25 +5221,25 @@
         </w:tc>
         <w:tc>
           <w:tcPr>
-            <w:tcW w:type="dxa" w:w="5039"/>
-          </w:tcPr>
-          <w:p>
-            <w:pPr>
-              <w:spacing w:after="0" w:line="240" w:lineRule="auto"/>
-            </w:pPr>
-            <w:r>
-              <w:rPr>
-                <w:rFonts w:ascii="Aptos" w:hAnsi="Aptos"/>
-                <w:b w:val="0"/>
-                <w:sz w:val="18"/>
-              </w:rPr>
-              <w:t>6th login attempt within one minute</w:t>
-            </w:r>
-          </w:p>
-        </w:tc>
-        <w:tc>
-          <w:tcPr>
-            <w:tcW w:type="dxa" w:w="2616"/>
+            <w:tcW w:type="dxa" w:w="5045"/>
+          </w:tcPr>
+          <w:p>
+            <w:pPr>
+              <w:spacing w:after="0" w:line="240" w:lineRule="auto"/>
+            </w:pPr>
+            <w:r>
+              <w:rPr>
+                <w:rFonts w:ascii="Aptos" w:hAnsi="Aptos"/>
+                <w:b w:val="0"/>
+                <w:sz w:val="18"/>
+              </w:rPr>
+              <w:t>6th request to /auth/* within one minute</w:t>
+            </w:r>
+          </w:p>
+        </w:tc>
+        <w:tc>
+          <w:tcPr>
+            <w:tcW w:type="dxa" w:w="2613"/>
           </w:tcPr>
           <w:p>
             <w:pPr>
@@ -5247,7 +5257,7 @@
         </w:tc>
         <w:tc>
           <w:tcPr>
-            <w:tcW w:type="dxa" w:w="3454"/>
+            <w:tcW w:type="dxa" w:w="3453"/>
           </w:tcPr>
           <w:p>
             <w:pPr>
@@ -5285,7 +5295,7 @@
         </w:tc>
         <w:tc>
           <w:tcPr>
-            <w:tcW w:type="dxa" w:w="1083"/>
+            <w:tcW w:type="dxa" w:w="1080"/>
           </w:tcPr>
           <w:p>
             <w:pPr>
@@ -5303,7 +5313,7 @@
         </w:tc>
         <w:tc>
           <w:tcPr>
-            <w:tcW w:type="dxa" w:w="5039"/>
+            <w:tcW w:type="dxa" w:w="5045"/>
           </w:tcPr>
           <w:p>
             <w:pPr>
@@ -5321,7 +5331,7 @@
         </w:tc>
         <w:tc>
           <w:tcPr>
-            <w:tcW w:type="dxa" w:w="2616"/>
+            <w:tcW w:type="dxa" w:w="2613"/>
           </w:tcPr>
           <w:p>
             <w:pPr>
@@ -5339,7 +5349,7 @@
         </w:tc>
         <w:tc>
           <w:tcPr>
-            <w:tcW w:type="dxa" w:w="3454"/>
+            <w:tcW w:type="dxa" w:w="3453"/>
           </w:tcPr>
           <w:p>
             <w:pPr>
@@ -5377,7 +5387,7 @@
         </w:tc>
         <w:tc>
           <w:tcPr>
-            <w:tcW w:type="dxa" w:w="1083"/>
+            <w:tcW w:type="dxa" w:w="1080"/>
           </w:tcPr>
           <w:p>
             <w:pPr>
@@ -5395,7 +5405,7 @@
         </w:tc>
         <w:tc>
           <w:tcPr>
-            <w:tcW w:type="dxa" w:w="5039"/>
+            <w:tcW w:type="dxa" w:w="5045"/>
           </w:tcPr>
           <w:p>
             <w:pPr>
@@ -5413,7 +5423,7 @@
         </w:tc>
         <w:tc>
           <w:tcPr>
-            <w:tcW w:type="dxa" w:w="2616"/>
+            <w:tcW w:type="dxa" w:w="2613"/>
           </w:tcPr>
           <w:p>
             <w:pPr>
@@ -5431,19 +5441,19 @@
         </w:tc>
         <w:tc>
           <w:tcPr>
-            <w:tcW w:type="dxa" w:w="3454"/>
-          </w:tcPr>
-          <w:p>
-            <w:pPr>
-              <w:spacing w:after="0" w:line="240" w:lineRule="auto"/>
-            </w:pPr>
-            <w:r>
-              <w:rPr>
-                <w:rFonts w:ascii="Aptos" w:hAnsi="Aptos"/>
-                <w:b w:val="0"/>
-                <w:sz w:val="18"/>
-              </w:rPr>
-              <w:t>Rejected (locked 15 min)</w:t>
+            <w:tcW w:type="dxa" w:w="3453"/>
+          </w:tcPr>
+          <w:p>
+            <w:pPr>
+              <w:spacing w:after="0" w:line="240" w:lineRule="auto"/>
+            </w:pPr>
+            <w:r>
+              <w:rPr>
+                <w:rFonts w:ascii="Aptos" w:hAnsi="Aptos"/>
+                <w:b w:val="0"/>
+                <w:sz w:val="18"/>
+              </w:rPr>
+              <w:t>Rejected (account locked)</w:t>
             </w:r>
           </w:p>
         </w:tc>
@@ -5469,7 +5479,7 @@
         </w:tc>
         <w:tc>
           <w:tcPr>
-            <w:tcW w:type="dxa" w:w="1083"/>
+            <w:tcW w:type="dxa" w:w="1080"/>
           </w:tcPr>
           <w:p>
             <w:pPr>
@@ -5487,7 +5497,7 @@
         </w:tc>
         <w:tc>
           <w:tcPr>
-            <w:tcW w:type="dxa" w:w="5039"/>
+            <w:tcW w:type="dxa" w:w="5045"/>
           </w:tcPr>
           <w:p>
             <w:pPr>
@@ -5505,7 +5515,7 @@
         </w:tc>
         <w:tc>
           <w:tcPr>
-            <w:tcW w:type="dxa" w:w="2616"/>
+            <w:tcW w:type="dxa" w:w="2613"/>
           </w:tcPr>
           <w:p>
             <w:pPr>
@@ -5523,7 +5533,7 @@
         </w:tc>
         <w:tc>
           <w:tcPr>
-            <w:tcW w:type="dxa" w:w="3454"/>
+            <w:tcW w:type="dxa" w:w="3453"/>
           </w:tcPr>
           <w:p>
             <w:pPr>
@@ -5561,7 +5571,7 @@
         </w:tc>
         <w:tc>
           <w:tcPr>
-            <w:tcW w:type="dxa" w:w="1083"/>
+            <w:tcW w:type="dxa" w:w="1080"/>
           </w:tcPr>
           <w:p>
             <w:pPr>
@@ -5579,7 +5589,7 @@
         </w:tc>
         <w:tc>
           <w:tcPr>
-            <w:tcW w:type="dxa" w:w="5039"/>
+            <w:tcW w:type="dxa" w:w="5045"/>
           </w:tcPr>
           <w:p>
             <w:pPr>
@@ -5597,7 +5607,7 @@
         </w:tc>
         <w:tc>
           <w:tcPr>
-            <w:tcW w:type="dxa" w:w="2616"/>
+            <w:tcW w:type="dxa" w:w="2613"/>
           </w:tcPr>
           <w:p>
             <w:pPr>
@@ -5615,7 +5625,7 @@
         </w:tc>
         <w:tc>
           <w:tcPr>
-            <w:tcW w:type="dxa" w:w="3454"/>
+            <w:tcW w:type="dxa" w:w="3453"/>
           </w:tcPr>
           <w:p>
             <w:pPr>
@@ -5653,7 +5663,7 @@
         </w:tc>
         <w:tc>
           <w:tcPr>
-            <w:tcW w:type="dxa" w:w="1083"/>
+            <w:tcW w:type="dxa" w:w="1080"/>
           </w:tcPr>
           <w:p>
             <w:pPr>
@@ -5671,7 +5681,7 @@
         </w:tc>
         <w:tc>
           <w:tcPr>
-            <w:tcW w:type="dxa" w:w="5039"/>
+            <w:tcW w:type="dxa" w:w="5045"/>
           </w:tcPr>
           <w:p>
             <w:pPr>
@@ -5689,7 +5699,7 @@
         </w:tc>
         <w:tc>
           <w:tcPr>
-            <w:tcW w:type="dxa" w:w="2616"/>
+            <w:tcW w:type="dxa" w:w="2613"/>
           </w:tcPr>
           <w:p>
             <w:pPr>
@@ -5707,7 +5717,7 @@
         </w:tc>
         <w:tc>
           <w:tcPr>
-            <w:tcW w:type="dxa" w:w="3454"/>
+            <w:tcW w:type="dxa" w:w="3453"/>
           </w:tcPr>
           <w:p>
             <w:pPr>
@@ -5745,7 +5755,7 @@
         </w:tc>
         <w:tc>
           <w:tcPr>
-            <w:tcW w:type="dxa" w:w="1083"/>
+            <w:tcW w:type="dxa" w:w="1080"/>
           </w:tcPr>
           <w:p>
             <w:pPr>
@@ -5763,7 +5773,7 @@
         </w:tc>
         <w:tc>
           <w:tcPr>
-            <w:tcW w:type="dxa" w:w="5039"/>
+            <w:tcW w:type="dxa" w:w="5045"/>
           </w:tcPr>
           <w:p>
             <w:pPr>
@@ -5781,7 +5791,7 @@
         </w:tc>
         <w:tc>
           <w:tcPr>
-            <w:tcW w:type="dxa" w:w="2616"/>
+            <w:tcW w:type="dxa" w:w="2613"/>
           </w:tcPr>
           <w:p>
             <w:pPr>
@@ -5799,7 +5809,7 @@
         </w:tc>
         <w:tc>
           <w:tcPr>
-            <w:tcW w:type="dxa" w:w="3454"/>
+            <w:tcW w:type="dxa" w:w="3453"/>
           </w:tcPr>
           <w:p>
             <w:pPr>
@@ -5837,7 +5847,7 @@
         </w:tc>
         <w:tc>
           <w:tcPr>
-            <w:tcW w:type="dxa" w:w="1083"/>
+            <w:tcW w:type="dxa" w:w="1080"/>
           </w:tcPr>
           <w:p>
             <w:pPr>
@@ -5855,7 +5865,7 @@
         </w:tc>
         <w:tc>
           <w:tcPr>
-            <w:tcW w:type="dxa" w:w="5039"/>
+            <w:tcW w:type="dxa" w:w="5045"/>
           </w:tcPr>
           <w:p>
             <w:pPr>
@@ -5873,7 +5883,7 @@
         </w:tc>
         <w:tc>
           <w:tcPr>
-            <w:tcW w:type="dxa" w:w="2616"/>
+            <w:tcW w:type="dxa" w:w="2613"/>
           </w:tcPr>
           <w:p>
             <w:pPr>
@@ -5891,7 +5901,7 @@
         </w:tc>
         <w:tc>
           <w:tcPr>
-            <w:tcW w:type="dxa" w:w="3454"/>
+            <w:tcW w:type="dxa" w:w="3453"/>
           </w:tcPr>
           <w:p>
             <w:pPr>
@@ -5929,7 +5939,7 @@
         </w:tc>
         <w:tc>
           <w:tcPr>
-            <w:tcW w:type="dxa" w:w="1083"/>
+            <w:tcW w:type="dxa" w:w="1080"/>
           </w:tcPr>
           <w:p>
             <w:pPr>
@@ -5947,7 +5957,7 @@
         </w:tc>
         <w:tc>
           <w:tcPr>
-            <w:tcW w:type="dxa" w:w="5039"/>
+            <w:tcW w:type="dxa" w:w="5045"/>
           </w:tcPr>
           <w:p>
             <w:pPr>
@@ -5982,7 +5992,7 @@
         </w:tc>
         <w:tc>
           <w:tcPr>
-            <w:tcW w:type="dxa" w:w="2616"/>
+            <w:tcW w:type="dxa" w:w="2613"/>
           </w:tcPr>
           <w:p>
             <w:pPr>
@@ -6000,7 +6010,7 @@
         </w:tc>
         <w:tc>
           <w:tcPr>
-            <w:tcW w:type="dxa" w:w="3454"/>
+            <w:tcW w:type="dxa" w:w="3453"/>
           </w:tcPr>
           <w:p>
             <w:pPr>
@@ -6038,7 +6048,7 @@
         </w:tc>
         <w:tc>
           <w:tcPr>
-            <w:tcW w:type="dxa" w:w="1083"/>
+            <w:tcW w:type="dxa" w:w="1080"/>
           </w:tcPr>
           <w:p>
             <w:pPr>
@@ -6056,7 +6066,7 @@
         </w:tc>
         <w:tc>
           <w:tcPr>
-            <w:tcW w:type="dxa" w:w="5039"/>
+            <w:tcW w:type="dxa" w:w="5045"/>
           </w:tcPr>
           <w:p>
             <w:pPr>
@@ -6074,7 +6084,7 @@
         </w:tc>
         <w:tc>
           <w:tcPr>
-            <w:tcW w:type="dxa" w:w="2616"/>
+            <w:tcW w:type="dxa" w:w="2613"/>
           </w:tcPr>
           <w:p>
             <w:pPr>
@@ -6092,7 +6102,7 @@
         </w:tc>
         <w:tc>
           <w:tcPr>
-            <w:tcW w:type="dxa" w:w="3454"/>
+            <w:tcW w:type="dxa" w:w="3453"/>
           </w:tcPr>
           <w:p>
             <w:pPr>
@@ -6130,7 +6140,7 @@
         </w:tc>
         <w:tc>
           <w:tcPr>
-            <w:tcW w:type="dxa" w:w="1083"/>
+            <w:tcW w:type="dxa" w:w="1080"/>
           </w:tcPr>
           <w:p>
             <w:pPr>
@@ -6148,7 +6158,7 @@
         </w:tc>
         <w:tc>
           <w:tcPr>
-            <w:tcW w:type="dxa" w:w="5039"/>
+            <w:tcW w:type="dxa" w:w="5045"/>
           </w:tcPr>
           <w:p>
             <w:pPr>
@@ -6166,7 +6176,7 @@
         </w:tc>
         <w:tc>
           <w:tcPr>
-            <w:tcW w:type="dxa" w:w="2616"/>
+            <w:tcW w:type="dxa" w:w="2613"/>
           </w:tcPr>
           <w:p>
             <w:pPr>
@@ -6184,7 +6194,7 @@
         </w:tc>
         <w:tc>
           <w:tcPr>
-            <w:tcW w:type="dxa" w:w="3454"/>
+            <w:tcW w:type="dxa" w:w="3453"/>
           </w:tcPr>
           <w:p>
             <w:pPr>
@@ -6222,7 +6232,7 @@
         </w:tc>
         <w:tc>
           <w:tcPr>
-            <w:tcW w:type="dxa" w:w="1083"/>
+            <w:tcW w:type="dxa" w:w="1080"/>
           </w:tcPr>
           <w:p>
             <w:pPr>
@@ -6240,7 +6250,7 @@
         </w:tc>
         <w:tc>
           <w:tcPr>
-            <w:tcW w:type="dxa" w:w="5039"/>
+            <w:tcW w:type="dxa" w:w="5045"/>
           </w:tcPr>
           <w:p>
             <w:pPr>
@@ -6275,7 +6285,7 @@
         </w:tc>
         <w:tc>
           <w:tcPr>
-            <w:tcW w:type="dxa" w:w="2616"/>
+            <w:tcW w:type="dxa" w:w="2613"/>
           </w:tcPr>
           <w:p>
             <w:pPr>
@@ -6293,7 +6303,7 @@
         </w:tc>
         <w:tc>
           <w:tcPr>
-            <w:tcW w:type="dxa" w:w="3454"/>
+            <w:tcW w:type="dxa" w:w="3453"/>
           </w:tcPr>
           <w:p>
             <w:pPr>
@@ -6331,7 +6341,7 @@
         </w:tc>
         <w:tc>
           <w:tcPr>
-            <w:tcW w:type="dxa" w:w="1083"/>
+            <w:tcW w:type="dxa" w:w="1080"/>
           </w:tcPr>
           <w:p>
             <w:pPr>
@@ -6349,7 +6359,7 @@
         </w:tc>
         <w:tc>
           <w:tcPr>
-            <w:tcW w:type="dxa" w:w="5039"/>
+            <w:tcW w:type="dxa" w:w="5045"/>
           </w:tcPr>
           <w:p>
             <w:pPr>
@@ -6367,7 +6377,7 @@
         </w:tc>
         <w:tc>
           <w:tcPr>
-            <w:tcW w:type="dxa" w:w="2616"/>
+            <w:tcW w:type="dxa" w:w="2613"/>
           </w:tcPr>
           <w:p>
             <w:pPr>
@@ -6385,7 +6395,7 @@
         </w:tc>
         <w:tc>
           <w:tcPr>
-            <w:tcW w:type="dxa" w:w="3454"/>
+            <w:tcW w:type="dxa" w:w="3453"/>
           </w:tcPr>
           <w:p>
             <w:pPr>
@@ -6423,7 +6433,7 @@
         </w:tc>
         <w:tc>
           <w:tcPr>
-            <w:tcW w:type="dxa" w:w="1083"/>
+            <w:tcW w:type="dxa" w:w="1080"/>
           </w:tcPr>
           <w:p>
             <w:pPr>
@@ -6441,7 +6451,7 @@
         </w:tc>
         <w:tc>
           <w:tcPr>
-            <w:tcW w:type="dxa" w:w="5039"/>
+            <w:tcW w:type="dxa" w:w="5045"/>
           </w:tcPr>
           <w:p>
             <w:pPr>
@@ -6459,7 +6469,7 @@
         </w:tc>
         <w:tc>
           <w:tcPr>
-            <w:tcW w:type="dxa" w:w="2616"/>
+            <w:tcW w:type="dxa" w:w="2613"/>
           </w:tcPr>
           <w:p>
             <w:pPr>
@@ -6477,7 +6487,7 @@
         </w:tc>
         <w:tc>
           <w:tcPr>
-            <w:tcW w:type="dxa" w:w="3454"/>
+            <w:tcW w:type="dxa" w:w="3453"/>
           </w:tcPr>
           <w:p>
             <w:pPr>
@@ -6515,7 +6525,7 @@
         </w:tc>
         <w:tc>
           <w:tcPr>
-            <w:tcW w:type="dxa" w:w="1083"/>
+            <w:tcW w:type="dxa" w:w="1080"/>
           </w:tcPr>
           <w:p>
             <w:pPr>
@@ -6533,7 +6543,7 @@
         </w:tc>
         <w:tc>
           <w:tcPr>
-            <w:tcW w:type="dxa" w:w="5039"/>
+            <w:tcW w:type="dxa" w:w="5045"/>
           </w:tcPr>
           <w:p>
             <w:pPr>
@@ -6551,7 +6561,7 @@
         </w:tc>
         <w:tc>
           <w:tcPr>
-            <w:tcW w:type="dxa" w:w="2616"/>
+            <w:tcW w:type="dxa" w:w="2613"/>
           </w:tcPr>
           <w:p>
             <w:pPr>
@@ -6569,7 +6579,7 @@
         </w:tc>
         <w:tc>
           <w:tcPr>
-            <w:tcW w:type="dxa" w:w="3454"/>
+            <w:tcW w:type="dxa" w:w="3453"/>
           </w:tcPr>
           <w:p>
             <w:pPr>
@@ -6607,7 +6617,7 @@
         </w:tc>
         <w:tc>
           <w:tcPr>
-            <w:tcW w:type="dxa" w:w="1083"/>
+            <w:tcW w:type="dxa" w:w="1080"/>
           </w:tcPr>
           <w:p>
             <w:pPr>
@@ -6625,7 +6635,7 @@
         </w:tc>
         <w:tc>
           <w:tcPr>
-            <w:tcW w:type="dxa" w:w="5039"/>
+            <w:tcW w:type="dxa" w:w="5045"/>
           </w:tcPr>
           <w:p>
             <w:pPr>
@@ -6652,7 +6662,7 @@
         </w:tc>
         <w:tc>
           <w:tcPr>
-            <w:tcW w:type="dxa" w:w="2616"/>
+            <w:tcW w:type="dxa" w:w="2613"/>
           </w:tcPr>
           <w:p>
             <w:pPr>
@@ -6670,7 +6680,7 @@
         </w:tc>
         <w:tc>
           <w:tcPr>
-            <w:tcW w:type="dxa" w:w="3454"/>
+            <w:tcW w:type="dxa" w:w="3453"/>
           </w:tcPr>
           <w:p>
             <w:pPr>
@@ -6708,7 +6718,7 @@
         </w:tc>
         <w:tc>
           <w:tcPr>
-            <w:tcW w:type="dxa" w:w="1083"/>
+            <w:tcW w:type="dxa" w:w="1080"/>
           </w:tcPr>
           <w:p>
             <w:pPr>
@@ -6726,7 +6736,7 @@
         </w:tc>
         <w:tc>
           <w:tcPr>
-            <w:tcW w:type="dxa" w:w="5039"/>
+            <w:tcW w:type="dxa" w:w="5045"/>
           </w:tcPr>
           <w:p>
             <w:pPr>
@@ -6761,7 +6771,7 @@
         </w:tc>
         <w:tc>
           <w:tcPr>
-            <w:tcW w:type="dxa" w:w="2616"/>
+            <w:tcW w:type="dxa" w:w="2613"/>
           </w:tcPr>
           <w:p>
             <w:pPr>
@@ -6779,7 +6789,7 @@
         </w:tc>
         <w:tc>
           <w:tcPr>
-            <w:tcW w:type="dxa" w:w="3454"/>
+            <w:tcW w:type="dxa" w:w="3453"/>
           </w:tcPr>
           <w:p>
             <w:pPr>
@@ -6817,7 +6827,7 @@
         </w:tc>
         <w:tc>
           <w:tcPr>
-            <w:tcW w:type="dxa" w:w="1083"/>
+            <w:tcW w:type="dxa" w:w="1080"/>
           </w:tcPr>
           <w:p>
             <w:pPr>
@@ -6835,7 +6845,7 @@
         </w:tc>
         <w:tc>
           <w:tcPr>
-            <w:tcW w:type="dxa" w:w="5039"/>
+            <w:tcW w:type="dxa" w:w="5045"/>
           </w:tcPr>
           <w:p>
             <w:pPr>
@@ -6853,7 +6863,7 @@
         </w:tc>
         <w:tc>
           <w:tcPr>
-            <w:tcW w:type="dxa" w:w="2616"/>
+            <w:tcW w:type="dxa" w:w="2613"/>
           </w:tcPr>
           <w:p>
             <w:pPr>
@@ -6871,7 +6881,7 @@
         </w:tc>
         <w:tc>
           <w:tcPr>
-            <w:tcW w:type="dxa" w:w="3454"/>
+            <w:tcW w:type="dxa" w:w="3453"/>
           </w:tcPr>
           <w:p>
             <w:pPr>
@@ -6909,7 +6919,7 @@
         </w:tc>
         <w:tc>
           <w:tcPr>
-            <w:tcW w:type="dxa" w:w="1083"/>
+            <w:tcW w:type="dxa" w:w="1080"/>
           </w:tcPr>
           <w:p>
             <w:pPr>
@@ -6927,7 +6937,7 @@
         </w:tc>
         <w:tc>
           <w:tcPr>
-            <w:tcW w:type="dxa" w:w="5039"/>
+            <w:tcW w:type="dxa" w:w="5045"/>
           </w:tcPr>
           <w:p>
             <w:pPr>
@@ -6945,7 +6955,7 @@
         </w:tc>
         <w:tc>
           <w:tcPr>
-            <w:tcW w:type="dxa" w:w="2616"/>
+            <w:tcW w:type="dxa" w:w="2613"/>
           </w:tcPr>
           <w:p>
             <w:pPr>
@@ -6963,7 +6973,7 @@
         </w:tc>
         <w:tc>
           <w:tcPr>
-            <w:tcW w:type="dxa" w:w="3454"/>
+            <w:tcW w:type="dxa" w:w="3453"/>
           </w:tcPr>
           <w:p>
             <w:pPr>
@@ -7001,7 +7011,7 @@
         </w:tc>
         <w:tc>
           <w:tcPr>
-            <w:tcW w:type="dxa" w:w="1083"/>
+            <w:tcW w:type="dxa" w:w="1080"/>
           </w:tcPr>
           <w:p>
             <w:pPr>
@@ -7019,7 +7029,7 @@
         </w:tc>
         <w:tc>
           <w:tcPr>
-            <w:tcW w:type="dxa" w:w="5039"/>
+            <w:tcW w:type="dxa" w:w="5045"/>
           </w:tcPr>
           <w:p>
             <w:pPr>
@@ -7037,7 +7047,7 @@
         </w:tc>
         <w:tc>
           <w:tcPr>
-            <w:tcW w:type="dxa" w:w="2616"/>
+            <w:tcW w:type="dxa" w:w="2613"/>
           </w:tcPr>
           <w:p>
             <w:pPr>
@@ -7055,7 +7065,7 @@
         </w:tc>
         <w:tc>
           <w:tcPr>
-            <w:tcW w:type="dxa" w:w="3454"/>
+            <w:tcW w:type="dxa" w:w="3453"/>
           </w:tcPr>
           <w:p>
             <w:pPr>
@@ -7093,7 +7103,7 @@
         </w:tc>
         <w:tc>
           <w:tcPr>
-            <w:tcW w:type="dxa" w:w="1083"/>
+            <w:tcW w:type="dxa" w:w="1080"/>
           </w:tcPr>
           <w:p>
             <w:pPr>
@@ -7111,7 +7121,7 @@
         </w:tc>
         <w:tc>
           <w:tcPr>
-            <w:tcW w:type="dxa" w:w="5039"/>
+            <w:tcW w:type="dxa" w:w="5045"/>
           </w:tcPr>
           <w:p>
             <w:pPr>
@@ -7129,7 +7139,7 @@
         </w:tc>
         <w:tc>
           <w:tcPr>
-            <w:tcW w:type="dxa" w:w="2616"/>
+            <w:tcW w:type="dxa" w:w="2613"/>
           </w:tcPr>
           <w:p>
             <w:pPr>
@@ -7147,7 +7157,7 @@
         </w:tc>
         <w:tc>
           <w:tcPr>
-            <w:tcW w:type="dxa" w:w="3454"/>
+            <w:tcW w:type="dxa" w:w="3453"/>
           </w:tcPr>
           <w:p>
             <w:pPr>
@@ -7185,7 +7195,7 @@
         </w:tc>
         <w:tc>
           <w:tcPr>
-            <w:tcW w:type="dxa" w:w="1083"/>
+            <w:tcW w:type="dxa" w:w="1080"/>
           </w:tcPr>
           <w:p>
             <w:pPr>
@@ -7203,7 +7213,7 @@
         </w:tc>
         <w:tc>
           <w:tcPr>
-            <w:tcW w:type="dxa" w:w="5039"/>
+            <w:tcW w:type="dxa" w:w="5045"/>
           </w:tcPr>
           <w:p>
             <w:pPr>
@@ -7221,7 +7231,7 @@
         </w:tc>
         <w:tc>
           <w:tcPr>
-            <w:tcW w:type="dxa" w:w="2616"/>
+            <w:tcW w:type="dxa" w:w="2613"/>
           </w:tcPr>
           <w:p>
             <w:pPr>
@@ -7239,7 +7249,7 @@
         </w:tc>
         <w:tc>
           <w:tcPr>
-            <w:tcW w:type="dxa" w:w="3454"/>
+            <w:tcW w:type="dxa" w:w="3453"/>
           </w:tcPr>
           <w:p>
             <w:pPr>
@@ -7277,7 +7287,7 @@
         </w:tc>
         <w:tc>
           <w:tcPr>
-            <w:tcW w:type="dxa" w:w="1083"/>
+            <w:tcW w:type="dxa" w:w="1080"/>
           </w:tcPr>
           <w:p>
             <w:pPr>
@@ -7295,7 +7305,7 @@
         </w:tc>
         <w:tc>
           <w:tcPr>
-            <w:tcW w:type="dxa" w:w="5039"/>
+            <w:tcW w:type="dxa" w:w="5045"/>
           </w:tcPr>
           <w:p>
             <w:pPr>
@@ -7313,7 +7323,7 @@
         </w:tc>
         <w:tc>
           <w:tcPr>
-            <w:tcW w:type="dxa" w:w="2616"/>
+            <w:tcW w:type="dxa" w:w="2613"/>
           </w:tcPr>
           <w:p>
             <w:pPr>
@@ -7331,7 +7341,7 @@
         </w:tc>
         <w:tc>
           <w:tcPr>
-            <w:tcW w:type="dxa" w:w="3454"/>
+            <w:tcW w:type="dxa" w:w="3453"/>
           </w:tcPr>
           <w:p>
             <w:pPr>
@@ -7369,7 +7379,7 @@
         </w:tc>
         <w:tc>
           <w:tcPr>
-            <w:tcW w:type="dxa" w:w="1083"/>
+            <w:tcW w:type="dxa" w:w="1080"/>
           </w:tcPr>
           <w:p>
             <w:pPr>
@@ -7387,7 +7397,7 @@
         </w:tc>
         <w:tc>
           <w:tcPr>
-            <w:tcW w:type="dxa" w:w="5039"/>
+            <w:tcW w:type="dxa" w:w="5045"/>
           </w:tcPr>
           <w:p>
             <w:pPr>
@@ -7405,7 +7415,7 @@
         </w:tc>
         <w:tc>
           <w:tcPr>
-            <w:tcW w:type="dxa" w:w="2616"/>
+            <w:tcW w:type="dxa" w:w="2613"/>
           </w:tcPr>
           <w:p>
             <w:pPr>
@@ -7423,7 +7433,7 @@
         </w:tc>
         <w:tc>
           <w:tcPr>
-            <w:tcW w:type="dxa" w:w="3454"/>
+            <w:tcW w:type="dxa" w:w="3453"/>
           </w:tcPr>
           <w:p>
             <w:pPr>
@@ -7461,7 +7471,7 @@
         </w:tc>
         <w:tc>
           <w:tcPr>
-            <w:tcW w:type="dxa" w:w="1083"/>
+            <w:tcW w:type="dxa" w:w="1080"/>
           </w:tcPr>
           <w:p>
             <w:pPr>
@@ -7479,7 +7489,7 @@
         </w:tc>
         <w:tc>
           <w:tcPr>
-            <w:tcW w:type="dxa" w:w="5039"/>
+            <w:tcW w:type="dxa" w:w="5045"/>
           </w:tcPr>
           <w:p>
             <w:pPr>
@@ -7497,7 +7507,7 @@
         </w:tc>
         <w:tc>
           <w:tcPr>
-            <w:tcW w:type="dxa" w:w="2616"/>
+            <w:tcW w:type="dxa" w:w="2613"/>
           </w:tcPr>
           <w:p>
             <w:pPr>
@@ -7515,7 +7525,7 @@
         </w:tc>
         <w:tc>
           <w:tcPr>
-            <w:tcW w:type="dxa" w:w="3454"/>
+            <w:tcW w:type="dxa" w:w="3453"/>
           </w:tcPr>
           <w:p>
             <w:pPr>
@@ -7553,25 +7563,25 @@
         </w:tc>
         <w:tc>
           <w:tcPr>
-            <w:tcW w:type="dxa" w:w="1083"/>
-          </w:tcPr>
-          <w:p>
-            <w:pPr>
-              <w:spacing w:after="0" w:line="240" w:lineRule="auto"/>
-            </w:pPr>
-            <w:r>
-              <w:rPr>
-                <w:rFonts w:ascii="Aptos" w:hAnsi="Aptos"/>
-                <w:b w:val="0"/>
-                <w:sz w:val="18"/>
-              </w:rPr>
-              <w:t>I1</w:t>
-            </w:r>
-          </w:p>
-        </w:tc>
-        <w:tc>
-          <w:tcPr>
-            <w:tcW w:type="dxa" w:w="5039"/>
+            <w:tcW w:type="dxa" w:w="1080"/>
+          </w:tcPr>
+          <w:p>
+            <w:pPr>
+              <w:spacing w:after="0" w:line="240" w:lineRule="auto"/>
+            </w:pPr>
+            <w:r>
+              <w:rPr>
+                <w:rFonts w:ascii="Aptos" w:hAnsi="Aptos"/>
+                <w:b w:val="0"/>
+                <w:sz w:val="18"/>
+              </w:rPr>
+              <w:t>-</w:t>
+            </w:r>
+          </w:p>
+        </w:tc>
+        <w:tc>
+          <w:tcPr>
+            <w:tcW w:type="dxa" w:w="5045"/>
           </w:tcPr>
           <w:p>
             <w:pPr>
@@ -7589,7 +7599,7 @@
         </w:tc>
         <w:tc>
           <w:tcPr>
-            <w:tcW w:type="dxa" w:w="2616"/>
+            <w:tcW w:type="dxa" w:w="2613"/>
           </w:tcPr>
           <w:p>
             <w:pPr>
@@ -7607,7 +7617,7 @@
         </w:tc>
         <w:tc>
           <w:tcPr>
-            <w:tcW w:type="dxa" w:w="3454"/>
+            <w:tcW w:type="dxa" w:w="3453"/>
           </w:tcPr>
           <w:p>
             <w:pPr>
@@ -7645,7 +7655,7 @@
         </w:tc>
         <w:tc>
           <w:tcPr>
-            <w:tcW w:type="dxa" w:w="1083"/>
+            <w:tcW w:type="dxa" w:w="1080"/>
           </w:tcPr>
           <w:p>
             <w:pPr>
@@ -7663,7 +7673,7 @@
         </w:tc>
         <w:tc>
           <w:tcPr>
-            <w:tcW w:type="dxa" w:w="5039"/>
+            <w:tcW w:type="dxa" w:w="5045"/>
           </w:tcPr>
           <w:p>
             <w:pPr>
@@ -7690,7 +7700,7 @@
         </w:tc>
         <w:tc>
           <w:tcPr>
-            <w:tcW w:type="dxa" w:w="2616"/>
+            <w:tcW w:type="dxa" w:w="2613"/>
           </w:tcPr>
           <w:p>
             <w:pPr>
@@ -7708,7 +7718,7 @@
         </w:tc>
         <w:tc>
           <w:tcPr>
-            <w:tcW w:type="dxa" w:w="3454"/>
+            <w:tcW w:type="dxa" w:w="3453"/>
           </w:tcPr>
           <w:p>
             <w:pPr>

</xml_diff>

<commit_message>
cs and report: Docker deployment, per-service certificates, fresh-clone test
</commit_message>
<xml_diff>
--- a/docs/report/MCSC6002_Final_Report.docx
+++ b/docs/report/MCSC6002_Final_Report.docx
@@ -101,17 +101,7 @@
     </w:p>
     <w:p>
       <w:r>
-        <w:t xml:space="preserve">Each service has its own database on one SQL Server instance. The Product service caches its product list in Redis. The services use .NET 10 with Clean Architecture, CQRS through MediatR, Entity Framework Core, FluentValidation and ASP.NET Core Identity, and MassTransit for RabbitMQ. Two shared NuGet libraries hold the permission constants and the request and response contracts. For local runs, SQL Server, RabbitMQ and Redis start with Docker Compose and the services run with </w:t>
-      </w:r>
-      <w:r>
-        <w:rPr>
-          <w:rFonts w:ascii="Consolas" w:hAnsi="Consolas"/>
-          <w:shd w:val="clear" w:color="auto" w:fill="EDEDED"/>
-        </w:rPr>
-        <w:t>dotnet run</w:t>
-      </w:r>
-      <w:r>
-        <w:t>.</w:t>
+        <w:t>Each service has its own database on one SQL Server instance. The Product service caches its product list in Redis. The services use .NET 10 with Clean Architecture, CQRS through MediatR, Entity Framework Core, FluentValidation and ASP.NET Core Identity, and MassTransit for RabbitMQ. Two shared NuGet libraries hold the permission constants and the request and response contracts. Docker Compose runs the whole system: SQL Server, RabbitMQ, Redis and the four services, each built from its own repository and run as a non-root user.</w:t>
       </w:r>
     </w:p>
     <w:p>
@@ -124,17 +114,7 @@
     </w:p>
     <w:p>
       <w:r>
-        <w:t>Three points differ from the proposal. Docker Compose runs SQL Server, RabbitMQ and Redis, but the four services run on the host, started together by one script (</w:t>
-      </w:r>
-      <w:r>
-        <w:rPr>
-          <w:rFonts w:ascii="Consolas" w:hAnsi="Consolas"/>
-          <w:shd w:val="clear" w:color="auto" w:fill="EDEDED"/>
-        </w:rPr>
-        <w:t>scripts/run.sh</w:t>
-      </w:r>
-      <w:r>
-        <w:t>); container images for the services are future work. Users cannot register themselves: an administrator creates accounts, which suits an internal company inventory system. Queue messages are not encrypted field by field. The connection to RabbitMQ uses TLS, and events carry only product ids, names, quantities and reorder thresholds, so TLS in transit and the HMAC signature cover the risk.</w:t>
+        <w:t>Two points differ from the proposal. Users cannot register themselves: an administrator creates accounts, which suits an internal company inventory system. Queue messages are not encrypted field by field. The connection to RabbitMQ uses TLS, and events carry only product ids, names, quantities and reorder thresholds, so TLS in transit and the HMAC signature cover the risk.</w:t>
       </w:r>
     </w:p>
     <w:p>
@@ -363,7 +343,7 @@
         <w:t>api-gateway</w:t>
       </w:r>
       <w:r>
-        <w:t>. The gateway in turn accepts only service certificates from the same CA and checks the host name. The services no longer listen on plain HTTP, so even a host inside the network cannot call a service directly. The connection to RabbitMQ also uses TLS: the broker accepts AMQP only on its TLS port, with a certificate from the same CA, and the services check that certificate and its host name. Its management interface is still plain HTTP, reachable only from the local machine.</w:t>
+        <w:t>. The gateway in turn accepts only service certificates from the same CA and checks the host name; each service has its own server certificate, named after its container. The services no longer listen on plain HTTP, so even a host inside the network cannot call a service directly. The connection to RabbitMQ also uses TLS: the broker accepts AMQP only on its TLS port, with a certificate from the same CA, and the services check that certificate and its host name. Its management interface is still plain HTTP, reachable only from the local machine.</w:t>
       </w:r>
     </w:p>
     <w:p>
@@ -412,7 +392,7 @@
         <w:t>.env</w:t>
       </w:r>
       <w:r>
-        <w:t xml:space="preserve"> file and in each service's .NET user secrets; signing keys and certificates are kept outside all repositories. RabbitMQ uses its own account instead of the default guest user, Redis requires a password and SQL connections are encrypted, although the server certificate is not yet validated. The gateway returns generic error messages, also in place of server errors from the services, logs the details server side and removes headers that reveal the server software. It also adds </w:t>
+        <w:t xml:space="preserve"> file, which Docker Compose passes to the containers as environment variables; signing keys and certificates are kept outside all repositories, and each container mounts only the files it needs, read-only. RabbitMQ uses its own account instead of the default guest user, Redis requires a password and SQL connections are encrypted, although the server certificate is not yet validated. The gateway returns generic error messages, also in place of server errors from the services, logs the details server side and removes headers that reveal the server software. It also adds </w:t>
       </w:r>
       <w:r>
         <w:rPr>
@@ -523,7 +503,7 @@
     </w:p>
     <w:p>
       <w:r>
-        <w:t>We tested in four ways. A scripted suite of 37 attack cases (Appendix B) runs against the live system; 35 cases map to a threat ID and two are controls that show normal use still works. Semgrep scanned the source of all seven repositories, Gitleaks scanned their git history and OWASP ZAP ran an authenticated active scan of the 19 gateway routes that existed at the time. These three scans ran before the final changes (refresh token hashing, the 2 MB limit, hiding of service errors and broker TLS), which attack cases A14, V9 and N4 cover.</w:t>
+        <w:t>We tested in four ways. A scripted suite of 37 attack cases (Appendix B) runs against the live system; 35 cases map to a threat ID and two are controls that show normal use still works. Semgrep scanned the source of all seven repositories, Gitleaks scanned their git history and OWASP ZAP ran an authenticated active scan of the 19 gateway routes that existed at the time. These three scans ran before the final changes (refresh token hashing, the 2 MB limit, hiding of service errors, broker TLS and the move to containers), which attack cases A14, V9 and N4 cover; the full suite was rerun on the containers and on a fresh clone of all repositories.</w:t>
       </w:r>
     </w:p>
     <w:p>
@@ -579,7 +559,7 @@
     </w:p>
     <w:p>
       <w:r>
-        <w:t>The prototype delivers the security controls promised in the proposal: RS256 tokens with short lifetimes and hashed, rotating refresh tokens, permission checks at the gateway and in every service, mutual TLS between them, TLS to the message broker, signed queue events, input validation and protection against password guessing. The threat model and the test results show how each control maps to a threat and that it works. The remaining work is refresh token reuse detection, protection against replayed events, an audit log and container images for the services themselves.</w:t>
+        <w:t>The prototype delivers the security controls promised in the proposal: RS256 tokens with short lifetimes and hashed, rotating refresh tokens, permission checks at the gateway and in every service, mutual TLS between them, TLS to the message broker, signed queue events, input validation and protection against password guessing. The threat model and the test results show how each control maps to a threat and that it works. The remaining work is refresh token reuse detection, protection against replayed events, an audit log and a secrets manager in place of environment variables.</w:t>
       </w:r>
     </w:p>
     <w:p>
@@ -709,7 +689,7 @@
         </w:tc>
         <w:tc>
           <w:tcPr>
-            <w:tcW w:type="dxa" w:w="1512"/>
+            <w:tcW w:type="dxa" w:w="1511"/>
           </w:tcPr>
           <w:p>
             <w:pPr>
@@ -727,7 +707,7 @@
         </w:tc>
         <w:tc>
           <w:tcPr>
-            <w:tcW w:type="dxa" w:w="1287"/>
+            <w:tcW w:type="dxa" w:w="1286"/>
           </w:tcPr>
           <w:p>
             <w:pPr>
@@ -745,7 +725,7 @@
         </w:tc>
         <w:tc>
           <w:tcPr>
-            <w:tcW w:type="dxa" w:w="3630"/>
+            <w:tcW w:type="dxa" w:w="3623"/>
           </w:tcPr>
           <w:p>
             <w:pPr>
@@ -763,7 +743,7 @@
         </w:tc>
         <w:tc>
           <w:tcPr>
-            <w:tcW w:type="dxa" w:w="929"/>
+            <w:tcW w:type="dxa" w:w="928"/>
           </w:tcPr>
           <w:p>
             <w:pPr>
@@ -781,7 +761,7 @@
         </w:tc>
         <w:tc>
           <w:tcPr>
-            <w:tcW w:type="dxa" w:w="4093"/>
+            <w:tcW w:type="dxa" w:w="4105"/>
           </w:tcPr>
           <w:p>
             <w:pPr>
@@ -837,7 +817,7 @@
         </w:tc>
         <w:tc>
           <w:tcPr>
-            <w:tcW w:type="dxa" w:w="1512"/>
+            <w:tcW w:type="dxa" w:w="1511"/>
           </w:tcPr>
           <w:p>
             <w:pPr>
@@ -855,7 +835,7 @@
         </w:tc>
         <w:tc>
           <w:tcPr>
-            <w:tcW w:type="dxa" w:w="1287"/>
+            <w:tcW w:type="dxa" w:w="1286"/>
           </w:tcPr>
           <w:p>
             <w:pPr>
@@ -873,7 +853,7 @@
         </w:tc>
         <w:tc>
           <w:tcPr>
-            <w:tcW w:type="dxa" w:w="3630"/>
+            <w:tcW w:type="dxa" w:w="3623"/>
           </w:tcPr>
           <w:p>
             <w:pPr>
@@ -891,7 +871,7 @@
         </w:tc>
         <w:tc>
           <w:tcPr>
-            <w:tcW w:type="dxa" w:w="929"/>
+            <w:tcW w:type="dxa" w:w="928"/>
           </w:tcPr>
           <w:p>
             <w:pPr>
@@ -909,7 +889,7 @@
         </w:tc>
         <w:tc>
           <w:tcPr>
-            <w:tcW w:type="dxa" w:w="4093"/>
+            <w:tcW w:type="dxa" w:w="4105"/>
           </w:tcPr>
           <w:p>
             <w:pPr>
@@ -965,7 +945,7 @@
         </w:tc>
         <w:tc>
           <w:tcPr>
-            <w:tcW w:type="dxa" w:w="1512"/>
+            <w:tcW w:type="dxa" w:w="1511"/>
           </w:tcPr>
           <w:p>
             <w:pPr>
@@ -983,7 +963,7 @@
         </w:tc>
         <w:tc>
           <w:tcPr>
-            <w:tcW w:type="dxa" w:w="1287"/>
+            <w:tcW w:type="dxa" w:w="1286"/>
           </w:tcPr>
           <w:p>
             <w:pPr>
@@ -1001,7 +981,7 @@
         </w:tc>
         <w:tc>
           <w:tcPr>
-            <w:tcW w:type="dxa" w:w="3630"/>
+            <w:tcW w:type="dxa" w:w="3623"/>
           </w:tcPr>
           <w:p>
             <w:pPr>
@@ -1019,7 +999,7 @@
         </w:tc>
         <w:tc>
           <w:tcPr>
-            <w:tcW w:type="dxa" w:w="929"/>
+            <w:tcW w:type="dxa" w:w="928"/>
           </w:tcPr>
           <w:p>
             <w:pPr>
@@ -1037,7 +1017,7 @@
         </w:tc>
         <w:tc>
           <w:tcPr>
-            <w:tcW w:type="dxa" w:w="4093"/>
+            <w:tcW w:type="dxa" w:w="4105"/>
           </w:tcPr>
           <w:p>
             <w:pPr>
@@ -1093,7 +1073,7 @@
         </w:tc>
         <w:tc>
           <w:tcPr>
-            <w:tcW w:type="dxa" w:w="1512"/>
+            <w:tcW w:type="dxa" w:w="1511"/>
           </w:tcPr>
           <w:p>
             <w:pPr>
@@ -1111,7 +1091,7 @@
         </w:tc>
         <w:tc>
           <w:tcPr>
-            <w:tcW w:type="dxa" w:w="1287"/>
+            <w:tcW w:type="dxa" w:w="1286"/>
           </w:tcPr>
           <w:p>
             <w:pPr>
@@ -1129,7 +1109,7 @@
         </w:tc>
         <w:tc>
           <w:tcPr>
-            <w:tcW w:type="dxa" w:w="3630"/>
+            <w:tcW w:type="dxa" w:w="3623"/>
           </w:tcPr>
           <w:p>
             <w:pPr>
@@ -1147,7 +1127,7 @@
         </w:tc>
         <w:tc>
           <w:tcPr>
-            <w:tcW w:type="dxa" w:w="929"/>
+            <w:tcW w:type="dxa" w:w="928"/>
           </w:tcPr>
           <w:p>
             <w:pPr>
@@ -1165,7 +1145,7 @@
         </w:tc>
         <w:tc>
           <w:tcPr>
-            <w:tcW w:type="dxa" w:w="4093"/>
+            <w:tcW w:type="dxa" w:w="4105"/>
           </w:tcPr>
           <w:p>
             <w:pPr>
@@ -1221,7 +1201,7 @@
         </w:tc>
         <w:tc>
           <w:tcPr>
-            <w:tcW w:type="dxa" w:w="1512"/>
+            <w:tcW w:type="dxa" w:w="1511"/>
           </w:tcPr>
           <w:p>
             <w:pPr>
@@ -1239,7 +1219,7 @@
         </w:tc>
         <w:tc>
           <w:tcPr>
-            <w:tcW w:type="dxa" w:w="1287"/>
+            <w:tcW w:type="dxa" w:w="1286"/>
           </w:tcPr>
           <w:p>
             <w:pPr>
@@ -1257,7 +1237,7 @@
         </w:tc>
         <w:tc>
           <w:tcPr>
-            <w:tcW w:type="dxa" w:w="3630"/>
+            <w:tcW w:type="dxa" w:w="3623"/>
           </w:tcPr>
           <w:p>
             <w:pPr>
@@ -1275,7 +1255,7 @@
         </w:tc>
         <w:tc>
           <w:tcPr>
-            <w:tcW w:type="dxa" w:w="929"/>
+            <w:tcW w:type="dxa" w:w="928"/>
           </w:tcPr>
           <w:p>
             <w:pPr>
@@ -1293,7 +1273,7 @@
         </w:tc>
         <w:tc>
           <w:tcPr>
-            <w:tcW w:type="dxa" w:w="4093"/>
+            <w:tcW w:type="dxa" w:w="4105"/>
           </w:tcPr>
           <w:p>
             <w:pPr>
@@ -1349,7 +1329,7 @@
         </w:tc>
         <w:tc>
           <w:tcPr>
-            <w:tcW w:type="dxa" w:w="1512"/>
+            <w:tcW w:type="dxa" w:w="1511"/>
           </w:tcPr>
           <w:p>
             <w:pPr>
@@ -1367,7 +1347,7 @@
         </w:tc>
         <w:tc>
           <w:tcPr>
-            <w:tcW w:type="dxa" w:w="1287"/>
+            <w:tcW w:type="dxa" w:w="1286"/>
           </w:tcPr>
           <w:p>
             <w:pPr>
@@ -1385,7 +1365,7 @@
         </w:tc>
         <w:tc>
           <w:tcPr>
-            <w:tcW w:type="dxa" w:w="3630"/>
+            <w:tcW w:type="dxa" w:w="3623"/>
           </w:tcPr>
           <w:p>
             <w:pPr>
@@ -1403,7 +1383,7 @@
         </w:tc>
         <w:tc>
           <w:tcPr>
-            <w:tcW w:type="dxa" w:w="929"/>
+            <w:tcW w:type="dxa" w:w="928"/>
           </w:tcPr>
           <w:p>
             <w:pPr>
@@ -1421,19 +1401,19 @@
         </w:tc>
         <w:tc>
           <w:tcPr>
-            <w:tcW w:type="dxa" w:w="4093"/>
-          </w:tcPr>
-          <w:p>
-            <w:pPr>
-              <w:spacing w:after="0" w:line="240" w:lineRule="auto"/>
-            </w:pPr>
-            <w:r>
-              <w:rPr>
-                <w:rFonts w:ascii="Aptos" w:hAnsi="Aptos"/>
-                <w:b w:val="0"/>
-                <w:sz w:val="18"/>
-              </w:rPr>
-              <w:t>Own broker account (not guest) from user-secrets; Inventory accepts only events HMAC-signed with a key shared by Product and Inventory</w:t>
+            <w:tcW w:type="dxa" w:w="4105"/>
+          </w:tcPr>
+          <w:p>
+            <w:pPr>
+              <w:spacing w:after="0" w:line="240" w:lineRule="auto"/>
+            </w:pPr>
+            <w:r>
+              <w:rPr>
+                <w:rFonts w:ascii="Aptos" w:hAnsi="Aptos"/>
+                <w:b w:val="0"/>
+                <w:sz w:val="18"/>
+              </w:rPr>
+              <w:t>Own broker account (not guest) from .env; Inventory accepts only events HMAC-signed with a key shared by Product and Inventory</w:t>
             </w:r>
           </w:p>
         </w:tc>
@@ -1477,7 +1457,7 @@
         </w:tc>
         <w:tc>
           <w:tcPr>
-            <w:tcW w:type="dxa" w:w="1512"/>
+            <w:tcW w:type="dxa" w:w="1511"/>
           </w:tcPr>
           <w:p>
             <w:pPr>
@@ -1495,7 +1475,7 @@
         </w:tc>
         <w:tc>
           <w:tcPr>
-            <w:tcW w:type="dxa" w:w="1287"/>
+            <w:tcW w:type="dxa" w:w="1286"/>
           </w:tcPr>
           <w:p>
             <w:pPr>
@@ -1513,7 +1493,7 @@
         </w:tc>
         <w:tc>
           <w:tcPr>
-            <w:tcW w:type="dxa" w:w="3630"/>
+            <w:tcW w:type="dxa" w:w="3623"/>
           </w:tcPr>
           <w:p>
             <w:pPr>
@@ -1531,7 +1511,7 @@
         </w:tc>
         <w:tc>
           <w:tcPr>
-            <w:tcW w:type="dxa" w:w="929"/>
+            <w:tcW w:type="dxa" w:w="928"/>
           </w:tcPr>
           <w:p>
             <w:pPr>
@@ -1549,7 +1529,7 @@
         </w:tc>
         <w:tc>
           <w:tcPr>
-            <w:tcW w:type="dxa" w:w="4093"/>
+            <w:tcW w:type="dxa" w:w="4105"/>
           </w:tcPr>
           <w:p>
             <w:pPr>
@@ -1605,7 +1585,7 @@
         </w:tc>
         <w:tc>
           <w:tcPr>
-            <w:tcW w:type="dxa" w:w="1512"/>
+            <w:tcW w:type="dxa" w:w="1511"/>
           </w:tcPr>
           <w:p>
             <w:pPr>
@@ -1623,7 +1603,7 @@
         </w:tc>
         <w:tc>
           <w:tcPr>
-            <w:tcW w:type="dxa" w:w="1287"/>
+            <w:tcW w:type="dxa" w:w="1286"/>
           </w:tcPr>
           <w:p>
             <w:pPr>
@@ -1641,7 +1621,7 @@
         </w:tc>
         <w:tc>
           <w:tcPr>
-            <w:tcW w:type="dxa" w:w="3630"/>
+            <w:tcW w:type="dxa" w:w="3623"/>
           </w:tcPr>
           <w:p>
             <w:pPr>
@@ -1659,7 +1639,7 @@
         </w:tc>
         <w:tc>
           <w:tcPr>
-            <w:tcW w:type="dxa" w:w="929"/>
+            <w:tcW w:type="dxa" w:w="928"/>
           </w:tcPr>
           <w:p>
             <w:pPr>
@@ -1677,7 +1657,7 @@
         </w:tc>
         <w:tc>
           <w:tcPr>
-            <w:tcW w:type="dxa" w:w="4093"/>
+            <w:tcW w:type="dxa" w:w="4105"/>
           </w:tcPr>
           <w:p>
             <w:pPr>
@@ -1733,7 +1713,7 @@
         </w:tc>
         <w:tc>
           <w:tcPr>
-            <w:tcW w:type="dxa" w:w="1512"/>
+            <w:tcW w:type="dxa" w:w="1511"/>
           </w:tcPr>
           <w:p>
             <w:pPr>
@@ -1751,7 +1731,7 @@
         </w:tc>
         <w:tc>
           <w:tcPr>
-            <w:tcW w:type="dxa" w:w="1287"/>
+            <w:tcW w:type="dxa" w:w="1286"/>
           </w:tcPr>
           <w:p>
             <w:pPr>
@@ -1769,7 +1749,7 @@
         </w:tc>
         <w:tc>
           <w:tcPr>
-            <w:tcW w:type="dxa" w:w="3630"/>
+            <w:tcW w:type="dxa" w:w="3623"/>
           </w:tcPr>
           <w:p>
             <w:pPr>
@@ -1787,7 +1767,7 @@
         </w:tc>
         <w:tc>
           <w:tcPr>
-            <w:tcW w:type="dxa" w:w="929"/>
+            <w:tcW w:type="dxa" w:w="928"/>
           </w:tcPr>
           <w:p>
             <w:pPr>
@@ -1805,7 +1785,7 @@
         </w:tc>
         <w:tc>
           <w:tcPr>
-            <w:tcW w:type="dxa" w:w="4093"/>
+            <w:tcW w:type="dxa" w:w="4105"/>
           </w:tcPr>
           <w:p>
             <w:pPr>
@@ -1861,7 +1841,7 @@
         </w:tc>
         <w:tc>
           <w:tcPr>
-            <w:tcW w:type="dxa" w:w="1512"/>
+            <w:tcW w:type="dxa" w:w="1511"/>
           </w:tcPr>
           <w:p>
             <w:pPr>
@@ -1879,7 +1859,7 @@
         </w:tc>
         <w:tc>
           <w:tcPr>
-            <w:tcW w:type="dxa" w:w="1287"/>
+            <w:tcW w:type="dxa" w:w="1286"/>
           </w:tcPr>
           <w:p>
             <w:pPr>
@@ -1897,7 +1877,7 @@
         </w:tc>
         <w:tc>
           <w:tcPr>
-            <w:tcW w:type="dxa" w:w="3630"/>
+            <w:tcW w:type="dxa" w:w="3623"/>
           </w:tcPr>
           <w:p>
             <w:pPr>
@@ -1915,7 +1895,7 @@
         </w:tc>
         <w:tc>
           <w:tcPr>
-            <w:tcW w:type="dxa" w:w="929"/>
+            <w:tcW w:type="dxa" w:w="928"/>
           </w:tcPr>
           <w:p>
             <w:pPr>
@@ -1933,7 +1913,7 @@
         </w:tc>
         <w:tc>
           <w:tcPr>
-            <w:tcW w:type="dxa" w:w="4093"/>
+            <w:tcW w:type="dxa" w:w="4105"/>
           </w:tcPr>
           <w:p>
             <w:pPr>
@@ -1989,7 +1969,7 @@
         </w:tc>
         <w:tc>
           <w:tcPr>
-            <w:tcW w:type="dxa" w:w="1512"/>
+            <w:tcW w:type="dxa" w:w="1511"/>
           </w:tcPr>
           <w:p>
             <w:pPr>
@@ -2007,7 +1987,7 @@
         </w:tc>
         <w:tc>
           <w:tcPr>
-            <w:tcW w:type="dxa" w:w="1287"/>
+            <w:tcW w:type="dxa" w:w="1286"/>
           </w:tcPr>
           <w:p>
             <w:pPr>
@@ -2025,7 +2005,7 @@
         </w:tc>
         <w:tc>
           <w:tcPr>
-            <w:tcW w:type="dxa" w:w="3630"/>
+            <w:tcW w:type="dxa" w:w="3623"/>
           </w:tcPr>
           <w:p>
             <w:pPr>
@@ -2043,7 +2023,7 @@
         </w:tc>
         <w:tc>
           <w:tcPr>
-            <w:tcW w:type="dxa" w:w="929"/>
+            <w:tcW w:type="dxa" w:w="928"/>
           </w:tcPr>
           <w:p>
             <w:pPr>
@@ -2061,7 +2041,7 @@
         </w:tc>
         <w:tc>
           <w:tcPr>
-            <w:tcW w:type="dxa" w:w="4093"/>
+            <w:tcW w:type="dxa" w:w="4105"/>
           </w:tcPr>
           <w:p>
             <w:pPr>
@@ -2117,7 +2097,7 @@
         </w:tc>
         <w:tc>
           <w:tcPr>
-            <w:tcW w:type="dxa" w:w="1512"/>
+            <w:tcW w:type="dxa" w:w="1511"/>
           </w:tcPr>
           <w:p>
             <w:pPr>
@@ -2135,7 +2115,7 @@
         </w:tc>
         <w:tc>
           <w:tcPr>
-            <w:tcW w:type="dxa" w:w="1287"/>
+            <w:tcW w:type="dxa" w:w="1286"/>
           </w:tcPr>
           <w:p>
             <w:pPr>
@@ -2153,7 +2133,7 @@
         </w:tc>
         <w:tc>
           <w:tcPr>
-            <w:tcW w:type="dxa" w:w="3630"/>
+            <w:tcW w:type="dxa" w:w="3623"/>
           </w:tcPr>
           <w:p>
             <w:pPr>
@@ -2171,7 +2151,7 @@
         </w:tc>
         <w:tc>
           <w:tcPr>
-            <w:tcW w:type="dxa" w:w="929"/>
+            <w:tcW w:type="dxa" w:w="928"/>
           </w:tcPr>
           <w:p>
             <w:pPr>
@@ -2189,7 +2169,7 @@
         </w:tc>
         <w:tc>
           <w:tcPr>
-            <w:tcW w:type="dxa" w:w="4093"/>
+            <w:tcW w:type="dxa" w:w="4105"/>
           </w:tcPr>
           <w:p>
             <w:pPr>
@@ -2245,7 +2225,7 @@
         </w:tc>
         <w:tc>
           <w:tcPr>
-            <w:tcW w:type="dxa" w:w="1512"/>
+            <w:tcW w:type="dxa" w:w="1511"/>
           </w:tcPr>
           <w:p>
             <w:pPr>
@@ -2263,7 +2243,7 @@
         </w:tc>
         <w:tc>
           <w:tcPr>
-            <w:tcW w:type="dxa" w:w="1287"/>
+            <w:tcW w:type="dxa" w:w="1286"/>
           </w:tcPr>
           <w:p>
             <w:pPr>
@@ -2281,7 +2261,7 @@
         </w:tc>
         <w:tc>
           <w:tcPr>
-            <w:tcW w:type="dxa" w:w="3630"/>
+            <w:tcW w:type="dxa" w:w="3623"/>
           </w:tcPr>
           <w:p>
             <w:pPr>
@@ -2299,7 +2279,7 @@
         </w:tc>
         <w:tc>
           <w:tcPr>
-            <w:tcW w:type="dxa" w:w="929"/>
+            <w:tcW w:type="dxa" w:w="928"/>
           </w:tcPr>
           <w:p>
             <w:pPr>
@@ -2317,7 +2297,7 @@
         </w:tc>
         <w:tc>
           <w:tcPr>
-            <w:tcW w:type="dxa" w:w="4093"/>
+            <w:tcW w:type="dxa" w:w="4105"/>
           </w:tcPr>
           <w:p>
             <w:pPr>
@@ -2373,7 +2353,7 @@
         </w:tc>
         <w:tc>
           <w:tcPr>
-            <w:tcW w:type="dxa" w:w="1512"/>
+            <w:tcW w:type="dxa" w:w="1511"/>
           </w:tcPr>
           <w:p>
             <w:pPr>
@@ -2391,7 +2371,7 @@
         </w:tc>
         <w:tc>
           <w:tcPr>
-            <w:tcW w:type="dxa" w:w="1287"/>
+            <w:tcW w:type="dxa" w:w="1286"/>
           </w:tcPr>
           <w:p>
             <w:pPr>
@@ -2409,7 +2389,7 @@
         </w:tc>
         <w:tc>
           <w:tcPr>
-            <w:tcW w:type="dxa" w:w="3630"/>
+            <w:tcW w:type="dxa" w:w="3623"/>
           </w:tcPr>
           <w:p>
             <w:pPr>
@@ -2427,7 +2407,7 @@
         </w:tc>
         <w:tc>
           <w:tcPr>
-            <w:tcW w:type="dxa" w:w="929"/>
+            <w:tcW w:type="dxa" w:w="928"/>
           </w:tcPr>
           <w:p>
             <w:pPr>
@@ -2445,7 +2425,7 @@
         </w:tc>
         <w:tc>
           <w:tcPr>
-            <w:tcW w:type="dxa" w:w="4093"/>
+            <w:tcW w:type="dxa" w:w="4105"/>
           </w:tcPr>
           <w:p>
             <w:pPr>
@@ -2501,7 +2481,7 @@
         </w:tc>
         <w:tc>
           <w:tcPr>
-            <w:tcW w:type="dxa" w:w="1512"/>
+            <w:tcW w:type="dxa" w:w="1511"/>
           </w:tcPr>
           <w:p>
             <w:pPr>
@@ -2519,7 +2499,7 @@
         </w:tc>
         <w:tc>
           <w:tcPr>
-            <w:tcW w:type="dxa" w:w="1287"/>
+            <w:tcW w:type="dxa" w:w="1286"/>
           </w:tcPr>
           <w:p>
             <w:pPr>
@@ -2537,7 +2517,7 @@
         </w:tc>
         <w:tc>
           <w:tcPr>
-            <w:tcW w:type="dxa" w:w="3630"/>
+            <w:tcW w:type="dxa" w:w="3623"/>
           </w:tcPr>
           <w:p>
             <w:pPr>
@@ -2555,7 +2535,7 @@
         </w:tc>
         <w:tc>
           <w:tcPr>
-            <w:tcW w:type="dxa" w:w="929"/>
+            <w:tcW w:type="dxa" w:w="928"/>
           </w:tcPr>
           <w:p>
             <w:pPr>
@@ -2573,7 +2553,7 @@
         </w:tc>
         <w:tc>
           <w:tcPr>
-            <w:tcW w:type="dxa" w:w="4093"/>
+            <w:tcW w:type="dxa" w:w="4105"/>
           </w:tcPr>
           <w:p>
             <w:pPr>
@@ -2629,7 +2609,7 @@
         </w:tc>
         <w:tc>
           <w:tcPr>
-            <w:tcW w:type="dxa" w:w="1512"/>
+            <w:tcW w:type="dxa" w:w="1511"/>
           </w:tcPr>
           <w:p>
             <w:pPr>
@@ -2647,7 +2627,7 @@
         </w:tc>
         <w:tc>
           <w:tcPr>
-            <w:tcW w:type="dxa" w:w="1287"/>
+            <w:tcW w:type="dxa" w:w="1286"/>
           </w:tcPr>
           <w:p>
             <w:pPr>
@@ -2665,7 +2645,7 @@
         </w:tc>
         <w:tc>
           <w:tcPr>
-            <w:tcW w:type="dxa" w:w="3630"/>
+            <w:tcW w:type="dxa" w:w="3623"/>
           </w:tcPr>
           <w:p>
             <w:pPr>
@@ -2683,7 +2663,7 @@
         </w:tc>
         <w:tc>
           <w:tcPr>
-            <w:tcW w:type="dxa" w:w="929"/>
+            <w:tcW w:type="dxa" w:w="928"/>
           </w:tcPr>
           <w:p>
             <w:pPr>
@@ -2701,19 +2681,19 @@
         </w:tc>
         <w:tc>
           <w:tcPr>
-            <w:tcW w:type="dxa" w:w="4093"/>
-          </w:tcPr>
-          <w:p>
-            <w:pPr>
-              <w:spacing w:after="0" w:line="240" w:lineRule="auto"/>
-            </w:pPr>
-            <w:r>
-              <w:rPr>
-                <w:rFonts w:ascii="Aptos" w:hAnsi="Aptos"/>
-                <w:b w:val="0"/>
-                <w:sz w:val="18"/>
-              </w:rPr>
-              <w:t>DB/broker/Redis/seed passwords moved to user-secrets (.env, git-ignored); HS256 secret in history but unused; all services share SQL sa login</w:t>
+            <w:tcW w:type="dxa" w:w="4105"/>
+          </w:tcPr>
+          <w:p>
+            <w:pPr>
+              <w:spacing w:after="0" w:line="240" w:lineRule="auto"/>
+            </w:pPr>
+            <w:r>
+              <w:rPr>
+                <w:rFonts w:ascii="Aptos" w:hAnsi="Aptos"/>
+                <w:b w:val="0"/>
+                <w:sz w:val="18"/>
+              </w:rPr>
+              <w:t>DB/broker/Redis/seed passwords moved to a git-ignored .env, passed to the containers as environment variables; HS256 secret in history but unused; all services share SQL sa login</w:t>
             </w:r>
           </w:p>
         </w:tc>
@@ -2757,7 +2737,7 @@
         </w:tc>
         <w:tc>
           <w:tcPr>
-            <w:tcW w:type="dxa" w:w="1512"/>
+            <w:tcW w:type="dxa" w:w="1511"/>
           </w:tcPr>
           <w:p>
             <w:pPr>
@@ -2775,7 +2755,7 @@
         </w:tc>
         <w:tc>
           <w:tcPr>
-            <w:tcW w:type="dxa" w:w="1287"/>
+            <w:tcW w:type="dxa" w:w="1286"/>
           </w:tcPr>
           <w:p>
             <w:pPr>
@@ -2793,7 +2773,7 @@
         </w:tc>
         <w:tc>
           <w:tcPr>
-            <w:tcW w:type="dxa" w:w="3630"/>
+            <w:tcW w:type="dxa" w:w="3623"/>
           </w:tcPr>
           <w:p>
             <w:pPr>
@@ -2811,7 +2791,7 @@
         </w:tc>
         <w:tc>
           <w:tcPr>
-            <w:tcW w:type="dxa" w:w="929"/>
+            <w:tcW w:type="dxa" w:w="928"/>
           </w:tcPr>
           <w:p>
             <w:pPr>
@@ -2829,7 +2809,7 @@
         </w:tc>
         <w:tc>
           <w:tcPr>
-            <w:tcW w:type="dxa" w:w="4093"/>
+            <w:tcW w:type="dxa" w:w="4105"/>
           </w:tcPr>
           <w:p>
             <w:pPr>
@@ -2885,7 +2865,7 @@
         </w:tc>
         <w:tc>
           <w:tcPr>
-            <w:tcW w:type="dxa" w:w="1512"/>
+            <w:tcW w:type="dxa" w:w="1511"/>
           </w:tcPr>
           <w:p>
             <w:pPr>
@@ -2903,7 +2883,7 @@
         </w:tc>
         <w:tc>
           <w:tcPr>
-            <w:tcW w:type="dxa" w:w="1287"/>
+            <w:tcW w:type="dxa" w:w="1286"/>
           </w:tcPr>
           <w:p>
             <w:pPr>
@@ -2921,7 +2901,7 @@
         </w:tc>
         <w:tc>
           <w:tcPr>
-            <w:tcW w:type="dxa" w:w="3630"/>
+            <w:tcW w:type="dxa" w:w="3623"/>
           </w:tcPr>
           <w:p>
             <w:pPr>
@@ -2939,7 +2919,7 @@
         </w:tc>
         <w:tc>
           <w:tcPr>
-            <w:tcW w:type="dxa" w:w="929"/>
+            <w:tcW w:type="dxa" w:w="928"/>
           </w:tcPr>
           <w:p>
             <w:pPr>
@@ -2957,7 +2937,7 @@
         </w:tc>
         <w:tc>
           <w:tcPr>
-            <w:tcW w:type="dxa" w:w="4093"/>
+            <w:tcW w:type="dxa" w:w="4105"/>
           </w:tcPr>
           <w:p>
             <w:pPr>
@@ -3013,7 +2993,7 @@
         </w:tc>
         <w:tc>
           <w:tcPr>
-            <w:tcW w:type="dxa" w:w="1512"/>
+            <w:tcW w:type="dxa" w:w="1511"/>
           </w:tcPr>
           <w:p>
             <w:pPr>
@@ -3031,7 +3011,7 @@
         </w:tc>
         <w:tc>
           <w:tcPr>
-            <w:tcW w:type="dxa" w:w="1287"/>
+            <w:tcW w:type="dxa" w:w="1286"/>
           </w:tcPr>
           <w:p>
             <w:pPr>
@@ -3049,7 +3029,7 @@
         </w:tc>
         <w:tc>
           <w:tcPr>
-            <w:tcW w:type="dxa" w:w="3630"/>
+            <w:tcW w:type="dxa" w:w="3623"/>
           </w:tcPr>
           <w:p>
             <w:pPr>
@@ -3067,7 +3047,7 @@
         </w:tc>
         <w:tc>
           <w:tcPr>
-            <w:tcW w:type="dxa" w:w="929"/>
+            <w:tcW w:type="dxa" w:w="928"/>
           </w:tcPr>
           <w:p>
             <w:pPr>
@@ -3085,7 +3065,7 @@
         </w:tc>
         <w:tc>
           <w:tcPr>
-            <w:tcW w:type="dxa" w:w="4093"/>
+            <w:tcW w:type="dxa" w:w="4105"/>
           </w:tcPr>
           <w:p>
             <w:pPr>
@@ -3141,7 +3121,7 @@
         </w:tc>
         <w:tc>
           <w:tcPr>
-            <w:tcW w:type="dxa" w:w="1512"/>
+            <w:tcW w:type="dxa" w:w="1511"/>
           </w:tcPr>
           <w:p>
             <w:pPr>
@@ -3159,7 +3139,7 @@
         </w:tc>
         <w:tc>
           <w:tcPr>
-            <w:tcW w:type="dxa" w:w="1287"/>
+            <w:tcW w:type="dxa" w:w="1286"/>
           </w:tcPr>
           <w:p>
             <w:pPr>
@@ -3177,7 +3157,7 @@
         </w:tc>
         <w:tc>
           <w:tcPr>
-            <w:tcW w:type="dxa" w:w="3630"/>
+            <w:tcW w:type="dxa" w:w="3623"/>
           </w:tcPr>
           <w:p>
             <w:pPr>
@@ -3195,7 +3175,7 @@
         </w:tc>
         <w:tc>
           <w:tcPr>
-            <w:tcW w:type="dxa" w:w="929"/>
+            <w:tcW w:type="dxa" w:w="928"/>
           </w:tcPr>
           <w:p>
             <w:pPr>
@@ -3213,7 +3193,7 @@
         </w:tc>
         <w:tc>
           <w:tcPr>
-            <w:tcW w:type="dxa" w:w="4093"/>
+            <w:tcW w:type="dxa" w:w="4105"/>
           </w:tcPr>
           <w:p>
             <w:pPr>
@@ -3269,7 +3249,7 @@
         </w:tc>
         <w:tc>
           <w:tcPr>
-            <w:tcW w:type="dxa" w:w="1512"/>
+            <w:tcW w:type="dxa" w:w="1511"/>
           </w:tcPr>
           <w:p>
             <w:pPr>
@@ -3287,7 +3267,7 @@
         </w:tc>
         <w:tc>
           <w:tcPr>
-            <w:tcW w:type="dxa" w:w="1287"/>
+            <w:tcW w:type="dxa" w:w="1286"/>
           </w:tcPr>
           <w:p>
             <w:pPr>
@@ -3305,7 +3285,7 @@
         </w:tc>
         <w:tc>
           <w:tcPr>
-            <w:tcW w:type="dxa" w:w="3630"/>
+            <w:tcW w:type="dxa" w:w="3623"/>
           </w:tcPr>
           <w:p>
             <w:pPr>
@@ -3323,7 +3303,7 @@
         </w:tc>
         <w:tc>
           <w:tcPr>
-            <w:tcW w:type="dxa" w:w="929"/>
+            <w:tcW w:type="dxa" w:w="928"/>
           </w:tcPr>
           <w:p>
             <w:pPr>
@@ -3341,7 +3321,7 @@
         </w:tc>
         <w:tc>
           <w:tcPr>
-            <w:tcW w:type="dxa" w:w="4093"/>
+            <w:tcW w:type="dxa" w:w="4105"/>
           </w:tcPr>
           <w:p>
             <w:pPr>
@@ -3397,7 +3377,7 @@
         </w:tc>
         <w:tc>
           <w:tcPr>
-            <w:tcW w:type="dxa" w:w="1512"/>
+            <w:tcW w:type="dxa" w:w="1511"/>
           </w:tcPr>
           <w:p>
             <w:pPr>
@@ -3415,7 +3395,7 @@
         </w:tc>
         <w:tc>
           <w:tcPr>
-            <w:tcW w:type="dxa" w:w="1287"/>
+            <w:tcW w:type="dxa" w:w="1286"/>
           </w:tcPr>
           <w:p>
             <w:pPr>
@@ -3433,7 +3413,7 @@
         </w:tc>
         <w:tc>
           <w:tcPr>
-            <w:tcW w:type="dxa" w:w="3630"/>
+            <w:tcW w:type="dxa" w:w="3623"/>
           </w:tcPr>
           <w:p>
             <w:pPr>
@@ -3451,7 +3431,7 @@
         </w:tc>
         <w:tc>
           <w:tcPr>
-            <w:tcW w:type="dxa" w:w="929"/>
+            <w:tcW w:type="dxa" w:w="928"/>
           </w:tcPr>
           <w:p>
             <w:pPr>
@@ -3469,7 +3449,7 @@
         </w:tc>
         <w:tc>
           <w:tcPr>
-            <w:tcW w:type="dxa" w:w="4093"/>
+            <w:tcW w:type="dxa" w:w="4105"/>
           </w:tcPr>
           <w:p>
             <w:pPr>
@@ -3525,7 +3505,7 @@
         </w:tc>
         <w:tc>
           <w:tcPr>
-            <w:tcW w:type="dxa" w:w="1512"/>
+            <w:tcW w:type="dxa" w:w="1511"/>
           </w:tcPr>
           <w:p>
             <w:pPr>
@@ -3543,7 +3523,7 @@
         </w:tc>
         <w:tc>
           <w:tcPr>
-            <w:tcW w:type="dxa" w:w="1287"/>
+            <w:tcW w:type="dxa" w:w="1286"/>
           </w:tcPr>
           <w:p>
             <w:pPr>
@@ -3561,7 +3541,7 @@
         </w:tc>
         <w:tc>
           <w:tcPr>
-            <w:tcW w:type="dxa" w:w="3630"/>
+            <w:tcW w:type="dxa" w:w="3623"/>
           </w:tcPr>
           <w:p>
             <w:pPr>
@@ -3579,7 +3559,7 @@
         </w:tc>
         <w:tc>
           <w:tcPr>
-            <w:tcW w:type="dxa" w:w="929"/>
+            <w:tcW w:type="dxa" w:w="928"/>
           </w:tcPr>
           <w:p>
             <w:pPr>
@@ -3597,7 +3577,7 @@
         </w:tc>
         <w:tc>
           <w:tcPr>
-            <w:tcW w:type="dxa" w:w="4093"/>
+            <w:tcW w:type="dxa" w:w="4105"/>
           </w:tcPr>
           <w:p>
             <w:pPr>
@@ -3653,7 +3633,7 @@
         </w:tc>
         <w:tc>
           <w:tcPr>
-            <w:tcW w:type="dxa" w:w="1512"/>
+            <w:tcW w:type="dxa" w:w="1511"/>
           </w:tcPr>
           <w:p>
             <w:pPr>
@@ -3671,7 +3651,7 @@
         </w:tc>
         <w:tc>
           <w:tcPr>
-            <w:tcW w:type="dxa" w:w="1287"/>
+            <w:tcW w:type="dxa" w:w="1286"/>
           </w:tcPr>
           <w:p>
             <w:pPr>
@@ -3689,7 +3669,7 @@
         </w:tc>
         <w:tc>
           <w:tcPr>
-            <w:tcW w:type="dxa" w:w="3630"/>
+            <w:tcW w:type="dxa" w:w="3623"/>
           </w:tcPr>
           <w:p>
             <w:pPr>
@@ -3707,7 +3687,7 @@
         </w:tc>
         <w:tc>
           <w:tcPr>
-            <w:tcW w:type="dxa" w:w="929"/>
+            <w:tcW w:type="dxa" w:w="928"/>
           </w:tcPr>
           <w:p>
             <w:pPr>
@@ -3725,7 +3705,7 @@
         </w:tc>
         <w:tc>
           <w:tcPr>
-            <w:tcW w:type="dxa" w:w="4093"/>
+            <w:tcW w:type="dxa" w:w="4105"/>
           </w:tcPr>
           <w:p>
             <w:pPr>
@@ -3781,7 +3761,7 @@
         </w:tc>
         <w:tc>
           <w:tcPr>
-            <w:tcW w:type="dxa" w:w="1512"/>
+            <w:tcW w:type="dxa" w:w="1511"/>
           </w:tcPr>
           <w:p>
             <w:pPr>
@@ -3799,7 +3779,7 @@
         </w:tc>
         <w:tc>
           <w:tcPr>
-            <w:tcW w:type="dxa" w:w="1287"/>
+            <w:tcW w:type="dxa" w:w="1286"/>
           </w:tcPr>
           <w:p>
             <w:pPr>
@@ -3817,7 +3797,7 @@
         </w:tc>
         <w:tc>
           <w:tcPr>
-            <w:tcW w:type="dxa" w:w="3630"/>
+            <w:tcW w:type="dxa" w:w="3623"/>
           </w:tcPr>
           <w:p>
             <w:pPr>
@@ -3835,7 +3815,7 @@
         </w:tc>
         <w:tc>
           <w:tcPr>
-            <w:tcW w:type="dxa" w:w="929"/>
+            <w:tcW w:type="dxa" w:w="928"/>
           </w:tcPr>
           <w:p>
             <w:pPr>
@@ -3853,7 +3833,7 @@
         </w:tc>
         <w:tc>
           <w:tcPr>
-            <w:tcW w:type="dxa" w:w="4093"/>
+            <w:tcW w:type="dxa" w:w="4105"/>
           </w:tcPr>
           <w:p>
             <w:pPr>
@@ -3909,7 +3889,7 @@
         </w:tc>
         <w:tc>
           <w:tcPr>
-            <w:tcW w:type="dxa" w:w="1512"/>
+            <w:tcW w:type="dxa" w:w="1511"/>
           </w:tcPr>
           <w:p>
             <w:pPr>
@@ -3927,7 +3907,7 @@
         </w:tc>
         <w:tc>
           <w:tcPr>
-            <w:tcW w:type="dxa" w:w="1287"/>
+            <w:tcW w:type="dxa" w:w="1286"/>
           </w:tcPr>
           <w:p>
             <w:pPr>
@@ -3945,7 +3925,7 @@
         </w:tc>
         <w:tc>
           <w:tcPr>
-            <w:tcW w:type="dxa" w:w="3630"/>
+            <w:tcW w:type="dxa" w:w="3623"/>
           </w:tcPr>
           <w:p>
             <w:pPr>
@@ -3963,7 +3943,7 @@
         </w:tc>
         <w:tc>
           <w:tcPr>
-            <w:tcW w:type="dxa" w:w="929"/>
+            <w:tcW w:type="dxa" w:w="928"/>
           </w:tcPr>
           <w:p>
             <w:pPr>
@@ -3981,7 +3961,7 @@
         </w:tc>
         <w:tc>
           <w:tcPr>
-            <w:tcW w:type="dxa" w:w="4093"/>
+            <w:tcW w:type="dxa" w:w="4105"/>
           </w:tcPr>
           <w:p>
             <w:pPr>
@@ -4037,7 +4017,7 @@
         </w:tc>
         <w:tc>
           <w:tcPr>
-            <w:tcW w:type="dxa" w:w="1512"/>
+            <w:tcW w:type="dxa" w:w="1511"/>
           </w:tcPr>
           <w:p>
             <w:pPr>
@@ -4055,7 +4035,7 @@
         </w:tc>
         <w:tc>
           <w:tcPr>
-            <w:tcW w:type="dxa" w:w="1287"/>
+            <w:tcW w:type="dxa" w:w="1286"/>
           </w:tcPr>
           <w:p>
             <w:pPr>
@@ -4073,7 +4053,7 @@
         </w:tc>
         <w:tc>
           <w:tcPr>
-            <w:tcW w:type="dxa" w:w="3630"/>
+            <w:tcW w:type="dxa" w:w="3623"/>
           </w:tcPr>
           <w:p>
             <w:pPr>
@@ -4091,7 +4071,7 @@
         </w:tc>
         <w:tc>
           <w:tcPr>
-            <w:tcW w:type="dxa" w:w="929"/>
+            <w:tcW w:type="dxa" w:w="928"/>
           </w:tcPr>
           <w:p>
             <w:pPr>
@@ -4109,19 +4089,19 @@
         </w:tc>
         <w:tc>
           <w:tcPr>
-            <w:tcW w:type="dxa" w:w="4093"/>
-          </w:tcPr>
-          <w:p>
-            <w:pPr>
-              <w:spacing w:after="0" w:line="240" w:lineRule="auto"/>
-            </w:pPr>
-            <w:r>
-              <w:rPr>
-                <w:rFonts w:ascii="Aptos" w:hAnsi="Aptos"/>
-                <w:b w:val="0"/>
-                <w:sz w:val="18"/>
-              </w:rPr>
-              <w:t>Restrict file access, Docker secrets, short validity; CRL if needed</w:t>
+            <w:tcW w:type="dxa" w:w="4105"/>
+          </w:tcPr>
+          <w:p>
+            <w:pPr>
+              <w:spacing w:after="0" w:line="240" w:lineRule="auto"/>
+            </w:pPr>
+            <w:r>
+              <w:rPr>
+                <w:rFonts w:ascii="Aptos" w:hAnsi="Aptos"/>
+                <w:b w:val="0"/>
+                <w:sz w:val="18"/>
+              </w:rPr>
+              <w:t>Mounted read-only into the gateway container only; password, Docker secrets, short validity, CRL if needed</w:t>
             </w:r>
           </w:p>
         </w:tc>

</xml_diff>